<commit_message>
ise à jour du design
</commit_message>
<xml_diff>
--- a/APEL-2025-2026_ticket_theatre_orchestre.docx
+++ b/APEL-2025-2026_ticket_theatre_orchestre.docx
@@ -64,6 +64,7 @@
         </w:drawing>
       </w:r>
     </w:p>
+    <w:p/>
     <w:p>
       <w:r>
         <w:rPr>
@@ -72,25 +73,25 @@
         <mc:AlternateContent>
           <mc:Choice Requires="wps">
             <w:drawing>
-              <wp:anchor distT="0" distB="0" distL="114300" distR="114300" simplePos="0" relativeHeight="251679744" behindDoc="0" locked="0" layoutInCell="1" allowOverlap="1" wp14:anchorId="601F528C" wp14:editId="5C1285BA">
+              <wp:anchor distT="0" distB="0" distL="114300" distR="114300" simplePos="0" relativeHeight="251694080" behindDoc="0" locked="0" layoutInCell="1" allowOverlap="1" wp14:anchorId="0378127C" wp14:editId="6C31C5E2">
                 <wp:simplePos x="0" y="0"/>
                 <wp:positionH relativeFrom="column">
-                  <wp:posOffset>1876425</wp:posOffset>
+                  <wp:posOffset>4542155</wp:posOffset>
                 </wp:positionH>
                 <wp:positionV relativeFrom="paragraph">
-                  <wp:posOffset>276225</wp:posOffset>
+                  <wp:posOffset>8035925</wp:posOffset>
                 </wp:positionV>
                 <wp:extent cx="1828800" cy="1828800"/>
-                <wp:effectExtent l="0" t="0" r="0" b="0"/>
+                <wp:effectExtent l="0" t="533400" r="0" b="538480"/>
                 <wp:wrapNone/>
-                <wp:docPr id="22" name="Zone de texte 22"/>
+                <wp:docPr id="29" name="Zone de texte 29"/>
                 <wp:cNvGraphicFramePr/>
                 <a:graphic xmlns:a="http://schemas.openxmlformats.org/drawingml/2006/main">
                   <a:graphicData uri="http://schemas.microsoft.com/office/word/2010/wordprocessingShape">
                     <wps:wsp>
                       <wps:cNvSpPr txBox="1"/>
                       <wps:spPr>
-                        <a:xfrm>
+                        <a:xfrm rot="1977655">
                           <a:off x="0" y="0"/>
                           <a:ext cx="1828800" cy="1828800"/>
                         </a:xfrm>
@@ -108,13 +109,12 @@
                             <w:pPr>
                               <w:jc w:val="center"/>
                               <w:rPr>
-                                <w:rFonts w:ascii="Bodoni MT" w:hAnsi="Bodoni MT"/>
                                 <w:b/>
                                 <w:noProof/>
-                                <w:color w:val="C00000"/>
-                                <w:sz w:val="56"/>
-                                <w:szCs w:val="56"/>
-                                <w14:textOutline w14:w="9525" w14:cap="flat" w14:cmpd="sng" w14:algn="ctr">
+                                <w:color w:val="ED7D31" w:themeColor="accent2"/>
+                                <w:sz w:val="72"/>
+                                <w:szCs w:val="72"/>
+                                <w14:textOutline w14:w="3175" w14:cap="flat" w14:cmpd="sng" w14:algn="ctr">
                                   <w14:solidFill>
                                     <w14:schemeClr w14:val="tx1"/>
                                   </w14:solidFill>
@@ -128,13 +128,12 @@
                             </w:pPr>
                             <w:r>
                               <w:rPr>
-                                <w:rFonts w:ascii="Bodoni MT" w:hAnsi="Bodoni MT"/>
                                 <w:b/>
                                 <w:noProof/>
-                                <w:color w:val="C00000"/>
-                                <w:sz w:val="56"/>
-                                <w:szCs w:val="56"/>
-                                <w14:textOutline w14:w="9525" w14:cap="flat" w14:cmpd="sng" w14:algn="ctr">
+                                <w:color w:val="ED7D31" w:themeColor="accent2"/>
+                                <w:sz w:val="72"/>
+                                <w:szCs w:val="72"/>
+                                <w14:textOutline w14:w="3175" w14:cap="flat" w14:cmpd="sng" w14:algn="ctr">
                                   <w14:solidFill>
                                     <w14:schemeClr w14:val="tx1"/>
                                   </w14:solidFill>
@@ -145,20 +144,17 @@
                                   <w14:bevelT w14:w="25400" w14:h="38100" w14:prst="circle"/>
                                 </w14:props3d>
                               </w:rPr>
-                              <w:t>Théâtre</w:t>
+                              <w:t>3</w:t>
                             </w:r>
-                          </w:p>
-                          <w:p>
-                            <w:pPr>
-                              <w:jc w:val="center"/>
-                              <w:rPr>
-                                <w:rFonts w:ascii="Bodoni MT" w:hAnsi="Bodoni MT"/>
+                            <w:r>
+                              <w:rPr>
                                 <w:b/>
                                 <w:noProof/>
-                                <w:color w:val="C00000"/>
-                                <w:sz w:val="56"/>
-                                <w:szCs w:val="56"/>
-                                <w14:textOutline w14:w="9525" w14:cap="flat" w14:cmpd="sng" w14:algn="ctr">
+                                <w:color w:val="ED7D31" w:themeColor="accent2"/>
+                                <w:sz w:val="72"/>
+                                <w:szCs w:val="72"/>
+                                <w:vertAlign w:val="superscript"/>
+                                <w14:textOutline w14:w="3175" w14:cap="flat" w14:cmpd="sng" w14:algn="ctr">
                                   <w14:solidFill>
                                     <w14:schemeClr w14:val="tx1"/>
                                   </w14:solidFill>
@@ -169,16 +165,16 @@
                                   <w14:bevelT w14:w="25400" w14:h="38100" w14:prst="circle"/>
                                 </w14:props3d>
                               </w:rPr>
-                            </w:pPr>
+                              <w:t>ème</w:t>
+                            </w:r>
                             <w:r>
                               <w:rPr>
-                                <w:rFonts w:ascii="Bodoni MT" w:hAnsi="Bodoni MT"/>
                                 <w:b/>
                                 <w:noProof/>
-                                <w:color w:val="C00000"/>
-                                <w:sz w:val="56"/>
-                                <w:szCs w:val="56"/>
-                                <w14:textOutline w14:w="9525" w14:cap="flat" w14:cmpd="sng" w14:algn="ctr">
+                                <w:color w:val="ED7D31" w:themeColor="accent2"/>
+                                <w:sz w:val="72"/>
+                                <w:szCs w:val="72"/>
+                                <w14:textOutline w14:w="3175" w14:cap="flat" w14:cmpd="sng" w14:algn="ctr">
                                   <w14:solidFill>
                                     <w14:schemeClr w14:val="tx1"/>
                                   </w14:solidFill>
@@ -189,7 +185,7 @@
                                   <w14:bevelT w14:w="25400" w14:h="38100" w14:prst="circle"/>
                                 </w14:props3d>
                               </w:rPr>
-                              <w:t>Le 24 juin 2026</w:t>
+                              <w:t xml:space="preserve"> galerie</w:t>
                             </w:r>
                           </w:p>
                         </w:txbxContent>
@@ -217,25 +213,23 @@
           </mc:Choice>
           <mc:Fallback>
             <w:pict>
-              <v:shapetype w14:anchorId="601F528C" id="_x0000_t202" coordsize="21600,21600" o:spt="202" path="m,l,21600r21600,l21600,xe">
+              <v:shapetype w14:anchorId="0378127C" id="_x0000_t202" coordsize="21600,21600" o:spt="202" path="m,l,21600r21600,l21600,xe">
                 <v:stroke joinstyle="miter"/>
                 <v:path gradientshapeok="t" o:connecttype="rect"/>
               </v:shapetype>
-              <v:shape id="Zone de texte 22" o:spid="_x0000_s1026" type="#_x0000_t202" style="position:absolute;margin-left:147.75pt;margin-top:21.75pt;width:2in;height:2in;z-index:251679744;visibility:visible;mso-wrap-style:none;mso-wrap-distance-left:9pt;mso-wrap-distance-top:0;mso-wrap-distance-right:9pt;mso-wrap-distance-bottom:0;mso-position-horizontal:absolute;mso-position-horizontal-relative:text;mso-position-vertical:absolute;mso-position-vertical-relative:text;v-text-anchor:top" o:gfxdata="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" filled="f" stroked="f">
-                <v:fill o:detectmouseclick="t"/>
+              <v:shape id="Zone de texte 29" o:spid="_x0000_s1026" type="#_x0000_t202" style="position:absolute;margin-left:357.65pt;margin-top:632.75pt;width:2in;height:2in;rotation:2160127fd;z-index:251694080;visibility:visible;mso-wrap-style:none;mso-wrap-distance-left:9pt;mso-wrap-distance-top:0;mso-wrap-distance-right:9pt;mso-wrap-distance-bottom:0;mso-position-horizontal:absolute;mso-position-horizontal-relative:text;mso-position-vertical:absolute;mso-position-vertical-relative:text;v-text-anchor:top" o:gfxdata="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" filled="f" stroked="f">
                 <v:textbox style="mso-fit-shape-to-text:t">
                   <w:txbxContent>
                     <w:p>
                       <w:pPr>
                         <w:jc w:val="center"/>
                         <w:rPr>
-                          <w:rFonts w:ascii="Bodoni MT" w:hAnsi="Bodoni MT"/>
                           <w:b/>
                           <w:noProof/>
-                          <w:color w:val="C00000"/>
-                          <w:sz w:val="56"/>
-                          <w:szCs w:val="56"/>
-                          <w14:textOutline w14:w="9525" w14:cap="flat" w14:cmpd="sng" w14:algn="ctr">
+                          <w:color w:val="ED7D31" w:themeColor="accent2"/>
+                          <w:sz w:val="72"/>
+                          <w:szCs w:val="72"/>
+                          <w14:textOutline w14:w="3175" w14:cap="flat" w14:cmpd="sng" w14:algn="ctr">
                             <w14:solidFill>
                               <w14:schemeClr w14:val="tx1"/>
                             </w14:solidFill>
@@ -249,13 +243,12 @@
                       </w:pPr>
                       <w:r>
                         <w:rPr>
-                          <w:rFonts w:ascii="Bodoni MT" w:hAnsi="Bodoni MT"/>
                           <w:b/>
                           <w:noProof/>
-                          <w:color w:val="C00000"/>
-                          <w:sz w:val="56"/>
-                          <w:szCs w:val="56"/>
-                          <w14:textOutline w14:w="9525" w14:cap="flat" w14:cmpd="sng" w14:algn="ctr">
+                          <w:color w:val="ED7D31" w:themeColor="accent2"/>
+                          <w:sz w:val="72"/>
+                          <w:szCs w:val="72"/>
+                          <w14:textOutline w14:w="3175" w14:cap="flat" w14:cmpd="sng" w14:algn="ctr">
                             <w14:solidFill>
                               <w14:schemeClr w14:val="tx1"/>
                             </w14:solidFill>
@@ -266,20 +259,17 @@
                             <w14:bevelT w14:w="25400" w14:h="38100" w14:prst="circle"/>
                           </w14:props3d>
                         </w:rPr>
-                        <w:t>Théâtre</w:t>
+                        <w:t>3</w:t>
                       </w:r>
-                    </w:p>
-                    <w:p>
-                      <w:pPr>
-                        <w:jc w:val="center"/>
-                        <w:rPr>
-                          <w:rFonts w:ascii="Bodoni MT" w:hAnsi="Bodoni MT"/>
+                      <w:r>
+                        <w:rPr>
                           <w:b/>
                           <w:noProof/>
-                          <w:color w:val="C00000"/>
-                          <w:sz w:val="56"/>
-                          <w:szCs w:val="56"/>
-                          <w14:textOutline w14:w="9525" w14:cap="flat" w14:cmpd="sng" w14:algn="ctr">
+                          <w:color w:val="ED7D31" w:themeColor="accent2"/>
+                          <w:sz w:val="72"/>
+                          <w:szCs w:val="72"/>
+                          <w:vertAlign w:val="superscript"/>
+                          <w14:textOutline w14:w="3175" w14:cap="flat" w14:cmpd="sng" w14:algn="ctr">
                             <w14:solidFill>
                               <w14:schemeClr w14:val="tx1"/>
                             </w14:solidFill>
@@ -290,16 +280,16 @@
                             <w14:bevelT w14:w="25400" w14:h="38100" w14:prst="circle"/>
                           </w14:props3d>
                         </w:rPr>
-                      </w:pPr>
+                        <w:t>ème</w:t>
+                      </w:r>
                       <w:r>
                         <w:rPr>
-                          <w:rFonts w:ascii="Bodoni MT" w:hAnsi="Bodoni MT"/>
                           <w:b/>
                           <w:noProof/>
-                          <w:color w:val="C00000"/>
-                          <w:sz w:val="56"/>
-                          <w:szCs w:val="56"/>
-                          <w14:textOutline w14:w="9525" w14:cap="flat" w14:cmpd="sng" w14:algn="ctr">
+                          <w:color w:val="ED7D31" w:themeColor="accent2"/>
+                          <w:sz w:val="72"/>
+                          <w:szCs w:val="72"/>
+                          <w14:textOutline w14:w="3175" w14:cap="flat" w14:cmpd="sng" w14:algn="ctr">
                             <w14:solidFill>
                               <w14:schemeClr w14:val="tx1"/>
                             </w14:solidFill>
@@ -310,7 +300,7 @@
                             <w14:bevelT w14:w="25400" w14:h="38100" w14:prst="circle"/>
                           </w14:props3d>
                         </w:rPr>
-                        <w:t>Le 24 juin 2026</w:t>
+                        <w:t xml:space="preserve"> galerie</w:t>
                       </w:r>
                     </w:p>
                   </w:txbxContent>
@@ -320,8 +310,6 @@
           </mc:Fallback>
         </mc:AlternateContent>
       </w:r>
-    </w:p>
-    <w:p>
       <w:r>
         <w:rPr>
           <w:noProof/>
@@ -329,18 +317,18 @@
         <mc:AlternateContent>
           <mc:Choice Requires="wps">
             <w:drawing>
-              <wp:anchor distT="0" distB="0" distL="114300" distR="114300" simplePos="0" relativeHeight="251694080" behindDoc="0" locked="0" layoutInCell="1" allowOverlap="1" wp14:anchorId="0378127C" wp14:editId="6B6E186E">
+              <wp:anchor distT="0" distB="0" distL="114300" distR="114300" simplePos="0" relativeHeight="251692032" behindDoc="0" locked="0" layoutInCell="1" allowOverlap="1" wp14:anchorId="7FA73619" wp14:editId="7AF5B230">
                 <wp:simplePos x="0" y="0"/>
                 <wp:positionH relativeFrom="column">
-                  <wp:posOffset>4669155</wp:posOffset>
+                  <wp:posOffset>4567555</wp:posOffset>
                 </wp:positionH>
                 <wp:positionV relativeFrom="paragraph">
-                  <wp:posOffset>8023225</wp:posOffset>
+                  <wp:posOffset>5422900</wp:posOffset>
                 </wp:positionV>
                 <wp:extent cx="1828800" cy="1828800"/>
-                <wp:effectExtent l="0" t="457200" r="0" b="462280"/>
+                <wp:effectExtent l="0" t="533400" r="0" b="538480"/>
                 <wp:wrapNone/>
-                <wp:docPr id="29" name="Zone de texte 29"/>
+                <wp:docPr id="28" name="Zone de texte 28"/>
                 <wp:cNvGraphicFramePr/>
                 <a:graphic xmlns:a="http://schemas.openxmlformats.org/drawingml/2006/main">
                   <a:graphicData uri="http://schemas.microsoft.com/office/word/2010/wordprocessingShape">
@@ -367,7 +355,7 @@
                               <w:rPr>
                                 <w:b/>
                                 <w:noProof/>
-                                <w:color w:val="C00000"/>
+                                <w:color w:val="ED7D31" w:themeColor="accent2"/>
                                 <w:sz w:val="72"/>
                                 <w:szCs w:val="72"/>
                                 <w14:textOutline w14:w="3175" w14:cap="flat" w14:cmpd="sng" w14:algn="ctr">
@@ -386,7 +374,7 @@
                               <w:rPr>
                                 <w:b/>
                                 <w:noProof/>
-                                <w:color w:val="C00000"/>
+                                <w:color w:val="ED7D31" w:themeColor="accent2"/>
                                 <w:sz w:val="72"/>
                                 <w:szCs w:val="72"/>
                                 <w14:textOutline w14:w="3175" w14:cap="flat" w14:cmpd="sng" w14:algn="ctr">
@@ -400,7 +388,48 @@
                                   <w14:bevelT w14:w="25400" w14:h="38100" w14:prst="circle"/>
                                 </w14:props3d>
                               </w:rPr>
-                              <w:t>Orchestre</w:t>
+                              <w:t>2</w:t>
+                            </w:r>
+                            <w:r>
+                              <w:rPr>
+                                <w:b/>
+                                <w:noProof/>
+                                <w:color w:val="ED7D31" w:themeColor="accent2"/>
+                                <w:sz w:val="72"/>
+                                <w:szCs w:val="72"/>
+                                <w:vertAlign w:val="superscript"/>
+                                <w14:textOutline w14:w="3175" w14:cap="flat" w14:cmpd="sng" w14:algn="ctr">
+                                  <w14:solidFill>
+                                    <w14:schemeClr w14:val="tx1"/>
+                                  </w14:solidFill>
+                                  <w14:prstDash w14:val="solid"/>
+                                  <w14:round/>
+                                </w14:textOutline>
+                                <w14:props3d w14:extrusionH="57150" w14:contourW="0" w14:prstMaterial="softEdge">
+                                  <w14:bevelT w14:w="25400" w14:h="38100" w14:prst="circle"/>
+                                </w14:props3d>
+                              </w:rPr>
+                              <w:t>ème</w:t>
+                            </w:r>
+                            <w:r>
+                              <w:rPr>
+                                <w:b/>
+                                <w:noProof/>
+                                <w:color w:val="ED7D31" w:themeColor="accent2"/>
+                                <w:sz w:val="72"/>
+                                <w:szCs w:val="72"/>
+                                <w14:textOutline w14:w="3175" w14:cap="flat" w14:cmpd="sng" w14:algn="ctr">
+                                  <w14:solidFill>
+                                    <w14:schemeClr w14:val="tx1"/>
+                                  </w14:solidFill>
+                                  <w14:prstDash w14:val="solid"/>
+                                  <w14:round/>
+                                </w14:textOutline>
+                                <w14:props3d w14:extrusionH="57150" w14:contourW="0" w14:prstMaterial="softEdge">
+                                  <w14:bevelT w14:w="25400" w14:h="38100" w14:prst="circle"/>
+                                </w14:props3d>
+                              </w:rPr>
+                              <w:t xml:space="preserve"> galerie</w:t>
                             </w:r>
                           </w:p>
                         </w:txbxContent>
@@ -428,8 +457,7 @@
           </mc:Choice>
           <mc:Fallback>
             <w:pict>
-              <v:shape w14:anchorId="0378127C" id="Zone de texte 29" o:spid="_x0000_s1027" type="#_x0000_t202" style="position:absolute;margin-left:367.65pt;margin-top:631.75pt;width:2in;height:2in;rotation:2160127fd;z-index:251694080;visibility:visible;mso-wrap-style:none;mso-wrap-distance-left:9pt;mso-wrap-distance-top:0;mso-wrap-distance-right:9pt;mso-wrap-distance-bottom:0;mso-position-horizontal:absolute;mso-position-horizontal-relative:text;mso-position-vertical:absolute;mso-position-vertical-relative:text;v-text-anchor:top" o:gfxdata="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" filled="f" stroked="f">
-                <v:fill o:detectmouseclick="t"/>
+              <v:shape w14:anchorId="7FA73619" id="Zone de texte 28" o:spid="_x0000_s1027" type="#_x0000_t202" style="position:absolute;margin-left:359.65pt;margin-top:427pt;width:2in;height:2in;rotation:2160127fd;z-index:251692032;visibility:visible;mso-wrap-style:none;mso-wrap-distance-left:9pt;mso-wrap-distance-top:0;mso-wrap-distance-right:9pt;mso-wrap-distance-bottom:0;mso-position-horizontal:absolute;mso-position-horizontal-relative:text;mso-position-vertical:absolute;mso-position-vertical-relative:text;v-text-anchor:top" o:gfxdata="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" filled="f" stroked="f">
                 <v:textbox style="mso-fit-shape-to-text:t">
                   <w:txbxContent>
                     <w:p>
@@ -438,7 +466,7 @@
                         <w:rPr>
                           <w:b/>
                           <w:noProof/>
-                          <w:color w:val="C00000"/>
+                          <w:color w:val="ED7D31" w:themeColor="accent2"/>
                           <w:sz w:val="72"/>
                           <w:szCs w:val="72"/>
                           <w14:textOutline w14:w="3175" w14:cap="flat" w14:cmpd="sng" w14:algn="ctr">
@@ -457,7 +485,7 @@
                         <w:rPr>
                           <w:b/>
                           <w:noProof/>
-                          <w:color w:val="C00000"/>
+                          <w:color w:val="ED7D31" w:themeColor="accent2"/>
                           <w:sz w:val="72"/>
                           <w:szCs w:val="72"/>
                           <w14:textOutline w14:w="3175" w14:cap="flat" w14:cmpd="sng" w14:algn="ctr">
@@ -471,7 +499,48 @@
                             <w14:bevelT w14:w="25400" w14:h="38100" w14:prst="circle"/>
                           </w14:props3d>
                         </w:rPr>
-                        <w:t>Orchestre</w:t>
+                        <w:t>2</w:t>
+                      </w:r>
+                      <w:r>
+                        <w:rPr>
+                          <w:b/>
+                          <w:noProof/>
+                          <w:color w:val="ED7D31" w:themeColor="accent2"/>
+                          <w:sz w:val="72"/>
+                          <w:szCs w:val="72"/>
+                          <w:vertAlign w:val="superscript"/>
+                          <w14:textOutline w14:w="3175" w14:cap="flat" w14:cmpd="sng" w14:algn="ctr">
+                            <w14:solidFill>
+                              <w14:schemeClr w14:val="tx1"/>
+                            </w14:solidFill>
+                            <w14:prstDash w14:val="solid"/>
+                            <w14:round/>
+                          </w14:textOutline>
+                          <w14:props3d w14:extrusionH="57150" w14:contourW="0" w14:prstMaterial="softEdge">
+                            <w14:bevelT w14:w="25400" w14:h="38100" w14:prst="circle"/>
+                          </w14:props3d>
+                        </w:rPr>
+                        <w:t>ème</w:t>
+                      </w:r>
+                      <w:r>
+                        <w:rPr>
+                          <w:b/>
+                          <w:noProof/>
+                          <w:color w:val="ED7D31" w:themeColor="accent2"/>
+                          <w:sz w:val="72"/>
+                          <w:szCs w:val="72"/>
+                          <w14:textOutline w14:w="3175" w14:cap="flat" w14:cmpd="sng" w14:algn="ctr">
+                            <w14:solidFill>
+                              <w14:schemeClr w14:val="tx1"/>
+                            </w14:solidFill>
+                            <w14:prstDash w14:val="solid"/>
+                            <w14:round/>
+                          </w14:textOutline>
+                          <w14:props3d w14:extrusionH="57150" w14:contourW="0" w14:prstMaterial="softEdge">
+                            <w14:bevelT w14:w="25400" w14:h="38100" w14:prst="circle"/>
+                          </w14:props3d>
+                        </w:rPr>
+                        <w:t xml:space="preserve"> galerie</w:t>
                       </w:r>
                     </w:p>
                   </w:txbxContent>
@@ -488,25 +557,25 @@
         <mc:AlternateContent>
           <mc:Choice Requires="wps">
             <w:drawing>
-              <wp:anchor distT="0" distB="0" distL="114300" distR="114300" simplePos="0" relativeHeight="251692032" behindDoc="0" locked="0" layoutInCell="1" allowOverlap="1" wp14:anchorId="7FA73619" wp14:editId="0891073C">
+              <wp:anchor distT="0" distB="0" distL="114300" distR="114300" simplePos="0" relativeHeight="251685888" behindDoc="0" locked="0" layoutInCell="1" allowOverlap="1" wp14:anchorId="769C8E11" wp14:editId="41541E0F">
                 <wp:simplePos x="0" y="0"/>
                 <wp:positionH relativeFrom="column">
-                  <wp:posOffset>4669155</wp:posOffset>
+                  <wp:posOffset>430530</wp:posOffset>
                 </wp:positionH>
                 <wp:positionV relativeFrom="paragraph">
-                  <wp:posOffset>5422900</wp:posOffset>
+                  <wp:posOffset>7972425</wp:posOffset>
                 </wp:positionV>
                 <wp:extent cx="1828800" cy="1828800"/>
-                <wp:effectExtent l="0" t="457200" r="0" b="462280"/>
+                <wp:effectExtent l="0" t="0" r="0" b="5080"/>
                 <wp:wrapNone/>
-                <wp:docPr id="28" name="Zone de texte 28"/>
+                <wp:docPr id="25" name="Zone de texte 25"/>
                 <wp:cNvGraphicFramePr/>
                 <a:graphic xmlns:a="http://schemas.openxmlformats.org/drawingml/2006/main">
                   <a:graphicData uri="http://schemas.microsoft.com/office/word/2010/wordprocessingShape">
                     <wps:wsp>
                       <wps:cNvSpPr txBox="1"/>
                       <wps:spPr>
-                        <a:xfrm rot="1977655">
+                        <a:xfrm>
                           <a:off x="0" y="0"/>
                           <a:ext cx="1828800" cy="1828800"/>
                         </a:xfrm>
@@ -524,12 +593,13 @@
                             <w:pPr>
                               <w:jc w:val="center"/>
                               <w:rPr>
+                                <w:rFonts w:ascii="Bodoni MT" w:hAnsi="Bodoni MT"/>
                                 <w:b/>
                                 <w:noProof/>
-                                <w:color w:val="C00000"/>
-                                <w:sz w:val="72"/>
-                                <w:szCs w:val="72"/>
-                                <w14:textOutline w14:w="3175" w14:cap="flat" w14:cmpd="sng" w14:algn="ctr">
+                                <w:color w:val="ED7D31" w:themeColor="accent2"/>
+                                <w:sz w:val="64"/>
+                                <w:szCs w:val="64"/>
+                                <w14:textOutline w14:w="9525" w14:cap="flat" w14:cmpd="sng" w14:algn="ctr">
                                   <w14:solidFill>
                                     <w14:schemeClr w14:val="tx1"/>
                                   </w14:solidFill>
@@ -543,12 +613,13 @@
                             </w:pPr>
                             <w:r>
                               <w:rPr>
+                                <w:rFonts w:ascii="Bodoni MT" w:hAnsi="Bodoni MT"/>
                                 <w:b/>
                                 <w:noProof/>
-                                <w:color w:val="C00000"/>
-                                <w:sz w:val="72"/>
-                                <w:szCs w:val="72"/>
-                                <w14:textOutline w14:w="3175" w14:cap="flat" w14:cmpd="sng" w14:algn="ctr">
+                                <w:color w:val="ED7D31" w:themeColor="accent2"/>
+                                <w:sz w:val="64"/>
+                                <w:szCs w:val="64"/>
+                                <w14:textOutline w14:w="9525" w14:cap="flat" w14:cmpd="sng" w14:algn="ctr">
                                   <w14:solidFill>
                                     <w14:schemeClr w14:val="tx1"/>
                                   </w14:solidFill>
@@ -559,7 +630,49 @@
                                   <w14:bevelT w14:w="25400" w14:h="38100" w14:prst="circle"/>
                                 </w14:props3d>
                               </w:rPr>
-                              <w:t>Orchestre</w:t>
+                              <w:t>Théâtre</w:t>
+                            </w:r>
+                            <w:r>
+                              <w:rPr>
+                                <w:rFonts w:ascii="Bodoni MT" w:hAnsi="Bodoni MT"/>
+                                <w:b/>
+                                <w:noProof/>
+                                <w:color w:val="ED7D31" w:themeColor="accent2"/>
+                                <w:sz w:val="64"/>
+                                <w:szCs w:val="64"/>
+                                <w14:textOutline w14:w="9525" w14:cap="flat" w14:cmpd="sng" w14:algn="ctr">
+                                  <w14:solidFill>
+                                    <w14:schemeClr w14:val="tx1"/>
+                                  </w14:solidFill>
+                                  <w14:prstDash w14:val="solid"/>
+                                  <w14:round/>
+                                </w14:textOutline>
+                                <w14:props3d w14:extrusionH="57150" w14:contourW="0" w14:prstMaterial="softEdge">
+                                  <w14:bevelT w14:w="25400" w14:h="38100" w14:prst="circle"/>
+                                </w14:props3d>
+                              </w:rPr>
+                              <w:t xml:space="preserve"> l</w:t>
+                            </w:r>
+                            <w:r>
+                              <w:rPr>
+                                <w:rFonts w:ascii="Bodoni MT" w:hAnsi="Bodoni MT"/>
+                                <w:b/>
+                                <w:noProof/>
+                                <w:color w:val="ED7D31" w:themeColor="accent2"/>
+                                <w:sz w:val="64"/>
+                                <w:szCs w:val="64"/>
+                                <w14:textOutline w14:w="9525" w14:cap="flat" w14:cmpd="sng" w14:algn="ctr">
+                                  <w14:solidFill>
+                                    <w14:schemeClr w14:val="tx1"/>
+                                  </w14:solidFill>
+                                  <w14:prstDash w14:val="solid"/>
+                                  <w14:round/>
+                                </w14:textOutline>
+                                <w14:props3d w14:extrusionH="57150" w14:contourW="0" w14:prstMaterial="softEdge">
+                                  <w14:bevelT w14:w="25400" w14:h="38100" w14:prst="circle"/>
+                                </w14:props3d>
+                              </w:rPr>
+                              <w:t>e 24 juin 2026</w:t>
                             </w:r>
                           </w:p>
                         </w:txbxContent>
@@ -587,20 +700,20 @@
           </mc:Choice>
           <mc:Fallback>
             <w:pict>
-              <v:shape w14:anchorId="7FA73619" id="Zone de texte 28" o:spid="_x0000_s1028" type="#_x0000_t202" style="position:absolute;margin-left:367.65pt;margin-top:427pt;width:2in;height:2in;rotation:2160127fd;z-index:251692032;visibility:visible;mso-wrap-style:none;mso-wrap-distance-left:9pt;mso-wrap-distance-top:0;mso-wrap-distance-right:9pt;mso-wrap-distance-bottom:0;mso-position-horizontal:absolute;mso-position-horizontal-relative:text;mso-position-vertical:absolute;mso-position-vertical-relative:text;v-text-anchor:top" o:gfxdata="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" filled="f" stroked="f">
-                <v:fill o:detectmouseclick="t"/>
+              <v:shape w14:anchorId="769C8E11" id="Zone de texte 25" o:spid="_x0000_s1028" type="#_x0000_t202" style="position:absolute;margin-left:33.9pt;margin-top:627.75pt;width:2in;height:2in;z-index:251685888;visibility:visible;mso-wrap-style:none;mso-wrap-distance-left:9pt;mso-wrap-distance-top:0;mso-wrap-distance-right:9pt;mso-wrap-distance-bottom:0;mso-position-horizontal:absolute;mso-position-horizontal-relative:text;mso-position-vertical:absolute;mso-position-vertical-relative:text;v-text-anchor:top" o:gfxdata="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" filled="f" stroked="f">
                 <v:textbox style="mso-fit-shape-to-text:t">
                   <w:txbxContent>
                     <w:p>
                       <w:pPr>
                         <w:jc w:val="center"/>
                         <w:rPr>
+                          <w:rFonts w:ascii="Bodoni MT" w:hAnsi="Bodoni MT"/>
                           <w:b/>
                           <w:noProof/>
-                          <w:color w:val="C00000"/>
-                          <w:sz w:val="72"/>
-                          <w:szCs w:val="72"/>
-                          <w14:textOutline w14:w="3175" w14:cap="flat" w14:cmpd="sng" w14:algn="ctr">
+                          <w:color w:val="ED7D31" w:themeColor="accent2"/>
+                          <w:sz w:val="64"/>
+                          <w:szCs w:val="64"/>
+                          <w14:textOutline w14:w="9525" w14:cap="flat" w14:cmpd="sng" w14:algn="ctr">
                             <w14:solidFill>
                               <w14:schemeClr w14:val="tx1"/>
                             </w14:solidFill>
@@ -614,12 +727,13 @@
                       </w:pPr>
                       <w:r>
                         <w:rPr>
+                          <w:rFonts w:ascii="Bodoni MT" w:hAnsi="Bodoni MT"/>
                           <w:b/>
                           <w:noProof/>
-                          <w:color w:val="C00000"/>
-                          <w:sz w:val="72"/>
-                          <w:szCs w:val="72"/>
-                          <w14:textOutline w14:w="3175" w14:cap="flat" w14:cmpd="sng" w14:algn="ctr">
+                          <w:color w:val="ED7D31" w:themeColor="accent2"/>
+                          <w:sz w:val="64"/>
+                          <w:szCs w:val="64"/>
+                          <w14:textOutline w14:w="9525" w14:cap="flat" w14:cmpd="sng" w14:algn="ctr">
                             <w14:solidFill>
                               <w14:schemeClr w14:val="tx1"/>
                             </w14:solidFill>
@@ -630,7 +744,787 @@
                             <w14:bevelT w14:w="25400" w14:h="38100" w14:prst="circle"/>
                           </w14:props3d>
                         </w:rPr>
-                        <w:t>Orchestre</w:t>
+                        <w:t>Théâtre</w:t>
+                      </w:r>
+                      <w:r>
+                        <w:rPr>
+                          <w:rFonts w:ascii="Bodoni MT" w:hAnsi="Bodoni MT"/>
+                          <w:b/>
+                          <w:noProof/>
+                          <w:color w:val="ED7D31" w:themeColor="accent2"/>
+                          <w:sz w:val="64"/>
+                          <w:szCs w:val="64"/>
+                          <w14:textOutline w14:w="9525" w14:cap="flat" w14:cmpd="sng" w14:algn="ctr">
+                            <w14:solidFill>
+                              <w14:schemeClr w14:val="tx1"/>
+                            </w14:solidFill>
+                            <w14:prstDash w14:val="solid"/>
+                            <w14:round/>
+                          </w14:textOutline>
+                          <w14:props3d w14:extrusionH="57150" w14:contourW="0" w14:prstMaterial="softEdge">
+                            <w14:bevelT w14:w="25400" w14:h="38100" w14:prst="circle"/>
+                          </w14:props3d>
+                        </w:rPr>
+                        <w:t xml:space="preserve"> l</w:t>
+                      </w:r>
+                      <w:r>
+                        <w:rPr>
+                          <w:rFonts w:ascii="Bodoni MT" w:hAnsi="Bodoni MT"/>
+                          <w:b/>
+                          <w:noProof/>
+                          <w:color w:val="ED7D31" w:themeColor="accent2"/>
+                          <w:sz w:val="64"/>
+                          <w:szCs w:val="64"/>
+                          <w14:textOutline w14:w="9525" w14:cap="flat" w14:cmpd="sng" w14:algn="ctr">
+                            <w14:solidFill>
+                              <w14:schemeClr w14:val="tx1"/>
+                            </w14:solidFill>
+                            <w14:prstDash w14:val="solid"/>
+                            <w14:round/>
+                          </w14:textOutline>
+                          <w14:props3d w14:extrusionH="57150" w14:contourW="0" w14:prstMaterial="softEdge">
+                            <w14:bevelT w14:w="25400" w14:h="38100" w14:prst="circle"/>
+                          </w14:props3d>
+                        </w:rPr>
+                        <w:t>e 24 juin 2026</w:t>
+                      </w:r>
+                    </w:p>
+                  </w:txbxContent>
+                </v:textbox>
+              </v:shape>
+            </w:pict>
+          </mc:Fallback>
+        </mc:AlternateContent>
+      </w:r>
+      <w:r>
+        <w:rPr>
+          <w:noProof/>
+        </w:rPr>
+        <mc:AlternateContent>
+          <mc:Choice Requires="wps">
+            <w:drawing>
+              <wp:anchor distT="0" distB="0" distL="114300" distR="114300" simplePos="0" relativeHeight="251683840" behindDoc="0" locked="0" layoutInCell="1" allowOverlap="1" wp14:anchorId="4E3EB99E" wp14:editId="34174D3A">
+                <wp:simplePos x="0" y="0"/>
+                <wp:positionH relativeFrom="column">
+                  <wp:posOffset>430530</wp:posOffset>
+                </wp:positionH>
+                <wp:positionV relativeFrom="paragraph">
+                  <wp:posOffset>5378450</wp:posOffset>
+                </wp:positionV>
+                <wp:extent cx="1828800" cy="1828800"/>
+                <wp:effectExtent l="0" t="0" r="0" b="5080"/>
+                <wp:wrapNone/>
+                <wp:docPr id="24" name="Zone de texte 24"/>
+                <wp:cNvGraphicFramePr/>
+                <a:graphic xmlns:a="http://schemas.openxmlformats.org/drawingml/2006/main">
+                  <a:graphicData uri="http://schemas.microsoft.com/office/word/2010/wordprocessingShape">
+                    <wps:wsp>
+                      <wps:cNvSpPr txBox="1"/>
+                      <wps:spPr>
+                        <a:xfrm>
+                          <a:off x="0" y="0"/>
+                          <a:ext cx="1828800" cy="1828800"/>
+                        </a:xfrm>
+                        <a:prstGeom prst="rect">
+                          <a:avLst/>
+                        </a:prstGeom>
+                        <a:noFill/>
+                        <a:ln>
+                          <a:noFill/>
+                        </a:ln>
+                      </wps:spPr>
+                      <wps:txbx>
+                        <w:txbxContent>
+                          <w:p>
+                            <w:pPr>
+                              <w:jc w:val="center"/>
+                              <w:rPr>
+                                <w:rFonts w:ascii="Bodoni MT" w:hAnsi="Bodoni MT"/>
+                                <w:b/>
+                                <w:noProof/>
+                                <w:color w:val="ED7D31" w:themeColor="accent2"/>
+                                <w:sz w:val="64"/>
+                                <w:szCs w:val="64"/>
+                                <w14:textOutline w14:w="9525" w14:cap="flat" w14:cmpd="sng" w14:algn="ctr">
+                                  <w14:solidFill>
+                                    <w14:schemeClr w14:val="tx1"/>
+                                  </w14:solidFill>
+                                  <w14:prstDash w14:val="solid"/>
+                                  <w14:round/>
+                                </w14:textOutline>
+                                <w14:props3d w14:extrusionH="57150" w14:contourW="0" w14:prstMaterial="softEdge">
+                                  <w14:bevelT w14:w="25400" w14:h="38100" w14:prst="circle"/>
+                                </w14:props3d>
+                              </w:rPr>
+                            </w:pPr>
+                            <w:r>
+                              <w:rPr>
+                                <w:rFonts w:ascii="Bodoni MT" w:hAnsi="Bodoni MT"/>
+                                <w:b/>
+                                <w:noProof/>
+                                <w:color w:val="ED7D31" w:themeColor="accent2"/>
+                                <w:sz w:val="64"/>
+                                <w:szCs w:val="64"/>
+                                <w14:textOutline w14:w="9525" w14:cap="flat" w14:cmpd="sng" w14:algn="ctr">
+                                  <w14:solidFill>
+                                    <w14:schemeClr w14:val="tx1"/>
+                                  </w14:solidFill>
+                                  <w14:prstDash w14:val="solid"/>
+                                  <w14:round/>
+                                </w14:textOutline>
+                                <w14:props3d w14:extrusionH="57150" w14:contourW="0" w14:prstMaterial="softEdge">
+                                  <w14:bevelT w14:w="25400" w14:h="38100" w14:prst="circle"/>
+                                </w14:props3d>
+                              </w:rPr>
+                              <w:t>Théâtre</w:t>
+                            </w:r>
+                            <w:r>
+                              <w:rPr>
+                                <w:rFonts w:ascii="Bodoni MT" w:hAnsi="Bodoni MT"/>
+                                <w:b/>
+                                <w:noProof/>
+                                <w:color w:val="ED7D31" w:themeColor="accent2"/>
+                                <w:sz w:val="64"/>
+                                <w:szCs w:val="64"/>
+                                <w14:textOutline w14:w="9525" w14:cap="flat" w14:cmpd="sng" w14:algn="ctr">
+                                  <w14:solidFill>
+                                    <w14:schemeClr w14:val="tx1"/>
+                                  </w14:solidFill>
+                                  <w14:prstDash w14:val="solid"/>
+                                  <w14:round/>
+                                </w14:textOutline>
+                                <w14:props3d w14:extrusionH="57150" w14:contourW="0" w14:prstMaterial="softEdge">
+                                  <w14:bevelT w14:w="25400" w14:h="38100" w14:prst="circle"/>
+                                </w14:props3d>
+                              </w:rPr>
+                              <w:t xml:space="preserve"> l</w:t>
+                            </w:r>
+                            <w:r>
+                              <w:rPr>
+                                <w:rFonts w:ascii="Bodoni MT" w:hAnsi="Bodoni MT"/>
+                                <w:b/>
+                                <w:noProof/>
+                                <w:color w:val="ED7D31" w:themeColor="accent2"/>
+                                <w:sz w:val="64"/>
+                                <w:szCs w:val="64"/>
+                                <w14:textOutline w14:w="9525" w14:cap="flat" w14:cmpd="sng" w14:algn="ctr">
+                                  <w14:solidFill>
+                                    <w14:schemeClr w14:val="tx1"/>
+                                  </w14:solidFill>
+                                  <w14:prstDash w14:val="solid"/>
+                                  <w14:round/>
+                                </w14:textOutline>
+                                <w14:props3d w14:extrusionH="57150" w14:contourW="0" w14:prstMaterial="softEdge">
+                                  <w14:bevelT w14:w="25400" w14:h="38100" w14:prst="circle"/>
+                                </w14:props3d>
+                              </w:rPr>
+                              <w:t>e 24 juin 2026</w:t>
+                            </w:r>
+                          </w:p>
+                        </w:txbxContent>
+                      </wps:txbx>
+                      <wps:bodyPr rot="0" spcFirstLastPara="0" vertOverflow="overflow" horzOverflow="overflow" vert="horz" wrap="none" lIns="91440" tIns="45720" rIns="91440" bIns="45720" numCol="1" spcCol="0" rtlCol="0" fromWordArt="0" anchor="t" anchorCtr="0" forceAA="0" compatLnSpc="1">
+                        <a:prstTxWarp prst="textNoShape">
+                          <a:avLst/>
+                        </a:prstTxWarp>
+                        <a:spAutoFit/>
+                        <a:scene3d>
+                          <a:camera prst="orthographicFront"/>
+                          <a:lightRig rig="soft" dir="t">
+                            <a:rot lat="0" lon="0" rev="15600000"/>
+                          </a:lightRig>
+                        </a:scene3d>
+                        <a:sp3d extrusionH="57150" prstMaterial="softEdge">
+                          <a:bevelT w="25400" h="38100"/>
+                        </a:sp3d>
+                      </wps:bodyPr>
+                    </wps:wsp>
+                  </a:graphicData>
+                </a:graphic>
+              </wp:anchor>
+            </w:drawing>
+          </mc:Choice>
+          <mc:Fallback>
+            <w:pict>
+              <v:shape w14:anchorId="4E3EB99E" id="Zone de texte 24" o:spid="_x0000_s1029" type="#_x0000_t202" style="position:absolute;margin-left:33.9pt;margin-top:423.5pt;width:2in;height:2in;z-index:251683840;visibility:visible;mso-wrap-style:none;mso-wrap-distance-left:9pt;mso-wrap-distance-top:0;mso-wrap-distance-right:9pt;mso-wrap-distance-bottom:0;mso-position-horizontal:absolute;mso-position-horizontal-relative:text;mso-position-vertical:absolute;mso-position-vertical-relative:text;v-text-anchor:top" o:gfxdata="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" filled="f" stroked="f">
+                <v:textbox style="mso-fit-shape-to-text:t">
+                  <w:txbxContent>
+                    <w:p>
+                      <w:pPr>
+                        <w:jc w:val="center"/>
+                        <w:rPr>
+                          <w:rFonts w:ascii="Bodoni MT" w:hAnsi="Bodoni MT"/>
+                          <w:b/>
+                          <w:noProof/>
+                          <w:color w:val="ED7D31" w:themeColor="accent2"/>
+                          <w:sz w:val="64"/>
+                          <w:szCs w:val="64"/>
+                          <w14:textOutline w14:w="9525" w14:cap="flat" w14:cmpd="sng" w14:algn="ctr">
+                            <w14:solidFill>
+                              <w14:schemeClr w14:val="tx1"/>
+                            </w14:solidFill>
+                            <w14:prstDash w14:val="solid"/>
+                            <w14:round/>
+                          </w14:textOutline>
+                          <w14:props3d w14:extrusionH="57150" w14:contourW="0" w14:prstMaterial="softEdge">
+                            <w14:bevelT w14:w="25400" w14:h="38100" w14:prst="circle"/>
+                          </w14:props3d>
+                        </w:rPr>
+                      </w:pPr>
+                      <w:r>
+                        <w:rPr>
+                          <w:rFonts w:ascii="Bodoni MT" w:hAnsi="Bodoni MT"/>
+                          <w:b/>
+                          <w:noProof/>
+                          <w:color w:val="ED7D31" w:themeColor="accent2"/>
+                          <w:sz w:val="64"/>
+                          <w:szCs w:val="64"/>
+                          <w14:textOutline w14:w="9525" w14:cap="flat" w14:cmpd="sng" w14:algn="ctr">
+                            <w14:solidFill>
+                              <w14:schemeClr w14:val="tx1"/>
+                            </w14:solidFill>
+                            <w14:prstDash w14:val="solid"/>
+                            <w14:round/>
+                          </w14:textOutline>
+                          <w14:props3d w14:extrusionH="57150" w14:contourW="0" w14:prstMaterial="softEdge">
+                            <w14:bevelT w14:w="25400" w14:h="38100" w14:prst="circle"/>
+                          </w14:props3d>
+                        </w:rPr>
+                        <w:t>Théâtre</w:t>
+                      </w:r>
+                      <w:r>
+                        <w:rPr>
+                          <w:rFonts w:ascii="Bodoni MT" w:hAnsi="Bodoni MT"/>
+                          <w:b/>
+                          <w:noProof/>
+                          <w:color w:val="ED7D31" w:themeColor="accent2"/>
+                          <w:sz w:val="64"/>
+                          <w:szCs w:val="64"/>
+                          <w14:textOutline w14:w="9525" w14:cap="flat" w14:cmpd="sng" w14:algn="ctr">
+                            <w14:solidFill>
+                              <w14:schemeClr w14:val="tx1"/>
+                            </w14:solidFill>
+                            <w14:prstDash w14:val="solid"/>
+                            <w14:round/>
+                          </w14:textOutline>
+                          <w14:props3d w14:extrusionH="57150" w14:contourW="0" w14:prstMaterial="softEdge">
+                            <w14:bevelT w14:w="25400" w14:h="38100" w14:prst="circle"/>
+                          </w14:props3d>
+                        </w:rPr>
+                        <w:t xml:space="preserve"> l</w:t>
+                      </w:r>
+                      <w:r>
+                        <w:rPr>
+                          <w:rFonts w:ascii="Bodoni MT" w:hAnsi="Bodoni MT"/>
+                          <w:b/>
+                          <w:noProof/>
+                          <w:color w:val="ED7D31" w:themeColor="accent2"/>
+                          <w:sz w:val="64"/>
+                          <w:szCs w:val="64"/>
+                          <w14:textOutline w14:w="9525" w14:cap="flat" w14:cmpd="sng" w14:algn="ctr">
+                            <w14:solidFill>
+                              <w14:schemeClr w14:val="tx1"/>
+                            </w14:solidFill>
+                            <w14:prstDash w14:val="solid"/>
+                            <w14:round/>
+                          </w14:textOutline>
+                          <w14:props3d w14:extrusionH="57150" w14:contourW="0" w14:prstMaterial="softEdge">
+                            <w14:bevelT w14:w="25400" w14:h="38100" w14:prst="circle"/>
+                          </w14:props3d>
+                        </w:rPr>
+                        <w:t>e 24 juin 2026</w:t>
+                      </w:r>
+                    </w:p>
+                  </w:txbxContent>
+                </v:textbox>
+              </v:shape>
+            </w:pict>
+          </mc:Fallback>
+        </mc:AlternateContent>
+      </w:r>
+      <w:r>
+        <w:rPr>
+          <w:noProof/>
+        </w:rPr>
+        <mc:AlternateContent>
+          <mc:Choice Requires="wps">
+            <w:drawing>
+              <wp:anchor distT="0" distB="0" distL="114300" distR="114300" simplePos="0" relativeHeight="251681792" behindDoc="0" locked="0" layoutInCell="1" allowOverlap="1" wp14:anchorId="755782D2" wp14:editId="55B009BD">
+                <wp:simplePos x="0" y="0"/>
+                <wp:positionH relativeFrom="column">
+                  <wp:posOffset>424180</wp:posOffset>
+                </wp:positionH>
+                <wp:positionV relativeFrom="paragraph">
+                  <wp:posOffset>2774950</wp:posOffset>
+                </wp:positionV>
+                <wp:extent cx="1828800" cy="1828800"/>
+                <wp:effectExtent l="0" t="0" r="0" b="5080"/>
+                <wp:wrapNone/>
+                <wp:docPr id="23" name="Zone de texte 23"/>
+                <wp:cNvGraphicFramePr/>
+                <a:graphic xmlns:a="http://schemas.openxmlformats.org/drawingml/2006/main">
+                  <a:graphicData uri="http://schemas.microsoft.com/office/word/2010/wordprocessingShape">
+                    <wps:wsp>
+                      <wps:cNvSpPr txBox="1"/>
+                      <wps:spPr>
+                        <a:xfrm>
+                          <a:off x="0" y="0"/>
+                          <a:ext cx="1828800" cy="1828800"/>
+                        </a:xfrm>
+                        <a:prstGeom prst="rect">
+                          <a:avLst/>
+                        </a:prstGeom>
+                        <a:noFill/>
+                        <a:ln>
+                          <a:noFill/>
+                        </a:ln>
+                      </wps:spPr>
+                      <wps:txbx>
+                        <w:txbxContent>
+                          <w:p>
+                            <w:pPr>
+                              <w:jc w:val="center"/>
+                              <w:rPr>
+                                <w:rFonts w:ascii="Bodoni MT" w:hAnsi="Bodoni MT"/>
+                                <w:b/>
+                                <w:noProof/>
+                                <w:color w:val="ED7D31" w:themeColor="accent2"/>
+                                <w:sz w:val="64"/>
+                                <w:szCs w:val="64"/>
+                                <w14:textOutline w14:w="9525" w14:cap="flat" w14:cmpd="sng" w14:algn="ctr">
+                                  <w14:solidFill>
+                                    <w14:schemeClr w14:val="tx1"/>
+                                  </w14:solidFill>
+                                  <w14:prstDash w14:val="solid"/>
+                                  <w14:round/>
+                                </w14:textOutline>
+                                <w14:props3d w14:extrusionH="57150" w14:contourW="0" w14:prstMaterial="softEdge">
+                                  <w14:bevelT w14:w="25400" w14:h="38100" w14:prst="circle"/>
+                                </w14:props3d>
+                              </w:rPr>
+                            </w:pPr>
+                            <w:r>
+                              <w:rPr>
+                                <w:rFonts w:ascii="Bodoni MT" w:hAnsi="Bodoni MT"/>
+                                <w:b/>
+                                <w:noProof/>
+                                <w:color w:val="ED7D31" w:themeColor="accent2"/>
+                                <w:sz w:val="64"/>
+                                <w:szCs w:val="64"/>
+                                <w14:textOutline w14:w="9525" w14:cap="flat" w14:cmpd="sng" w14:algn="ctr">
+                                  <w14:solidFill>
+                                    <w14:schemeClr w14:val="tx1"/>
+                                  </w14:solidFill>
+                                  <w14:prstDash w14:val="solid"/>
+                                  <w14:round/>
+                                </w14:textOutline>
+                                <w14:props3d w14:extrusionH="57150" w14:contourW="0" w14:prstMaterial="softEdge">
+                                  <w14:bevelT w14:w="25400" w14:h="38100" w14:prst="circle"/>
+                                </w14:props3d>
+                              </w:rPr>
+                              <w:t>Théâtre</w:t>
+                            </w:r>
+                            <w:r>
+                              <w:rPr>
+                                <w:rFonts w:ascii="Bodoni MT" w:hAnsi="Bodoni MT"/>
+                                <w:b/>
+                                <w:noProof/>
+                                <w:color w:val="ED7D31" w:themeColor="accent2"/>
+                                <w:sz w:val="64"/>
+                                <w:szCs w:val="64"/>
+                                <w14:textOutline w14:w="9525" w14:cap="flat" w14:cmpd="sng" w14:algn="ctr">
+                                  <w14:solidFill>
+                                    <w14:schemeClr w14:val="tx1"/>
+                                  </w14:solidFill>
+                                  <w14:prstDash w14:val="solid"/>
+                                  <w14:round/>
+                                </w14:textOutline>
+                                <w14:props3d w14:extrusionH="57150" w14:contourW="0" w14:prstMaterial="softEdge">
+                                  <w14:bevelT w14:w="25400" w14:h="38100" w14:prst="circle"/>
+                                </w14:props3d>
+                              </w:rPr>
+                              <w:t xml:space="preserve"> l</w:t>
+                            </w:r>
+                            <w:r>
+                              <w:rPr>
+                                <w:rFonts w:ascii="Bodoni MT" w:hAnsi="Bodoni MT"/>
+                                <w:b/>
+                                <w:noProof/>
+                                <w:color w:val="ED7D31" w:themeColor="accent2"/>
+                                <w:sz w:val="64"/>
+                                <w:szCs w:val="64"/>
+                                <w14:textOutline w14:w="9525" w14:cap="flat" w14:cmpd="sng" w14:algn="ctr">
+                                  <w14:solidFill>
+                                    <w14:schemeClr w14:val="tx1"/>
+                                  </w14:solidFill>
+                                  <w14:prstDash w14:val="solid"/>
+                                  <w14:round/>
+                                </w14:textOutline>
+                                <w14:props3d w14:extrusionH="57150" w14:contourW="0" w14:prstMaterial="softEdge">
+                                  <w14:bevelT w14:w="25400" w14:h="38100" w14:prst="circle"/>
+                                </w14:props3d>
+                              </w:rPr>
+                              <w:t>e 24 juin 2026</w:t>
+                            </w:r>
+                          </w:p>
+                        </w:txbxContent>
+                      </wps:txbx>
+                      <wps:bodyPr rot="0" spcFirstLastPara="0" vertOverflow="overflow" horzOverflow="overflow" vert="horz" wrap="none" lIns="91440" tIns="45720" rIns="91440" bIns="45720" numCol="1" spcCol="0" rtlCol="0" fromWordArt="0" anchor="t" anchorCtr="0" forceAA="0" compatLnSpc="1">
+                        <a:prstTxWarp prst="textNoShape">
+                          <a:avLst/>
+                        </a:prstTxWarp>
+                        <a:spAutoFit/>
+                        <a:scene3d>
+                          <a:camera prst="orthographicFront"/>
+                          <a:lightRig rig="soft" dir="t">
+                            <a:rot lat="0" lon="0" rev="15600000"/>
+                          </a:lightRig>
+                        </a:scene3d>
+                        <a:sp3d extrusionH="57150" prstMaterial="softEdge">
+                          <a:bevelT w="25400" h="38100"/>
+                        </a:sp3d>
+                      </wps:bodyPr>
+                    </wps:wsp>
+                  </a:graphicData>
+                </a:graphic>
+              </wp:anchor>
+            </w:drawing>
+          </mc:Choice>
+          <mc:Fallback>
+            <w:pict>
+              <v:shape w14:anchorId="755782D2" id="Zone de texte 23" o:spid="_x0000_s1030" type="#_x0000_t202" style="position:absolute;margin-left:33.4pt;margin-top:218.5pt;width:2in;height:2in;z-index:251681792;visibility:visible;mso-wrap-style:none;mso-wrap-distance-left:9pt;mso-wrap-distance-top:0;mso-wrap-distance-right:9pt;mso-wrap-distance-bottom:0;mso-position-horizontal:absolute;mso-position-horizontal-relative:text;mso-position-vertical:absolute;mso-position-vertical-relative:text;v-text-anchor:top" o:gfxdata="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" filled="f" stroked="f">
+                <v:textbox style="mso-fit-shape-to-text:t">
+                  <w:txbxContent>
+                    <w:p>
+                      <w:pPr>
+                        <w:jc w:val="center"/>
+                        <w:rPr>
+                          <w:rFonts w:ascii="Bodoni MT" w:hAnsi="Bodoni MT"/>
+                          <w:b/>
+                          <w:noProof/>
+                          <w:color w:val="ED7D31" w:themeColor="accent2"/>
+                          <w:sz w:val="64"/>
+                          <w:szCs w:val="64"/>
+                          <w14:textOutline w14:w="9525" w14:cap="flat" w14:cmpd="sng" w14:algn="ctr">
+                            <w14:solidFill>
+                              <w14:schemeClr w14:val="tx1"/>
+                            </w14:solidFill>
+                            <w14:prstDash w14:val="solid"/>
+                            <w14:round/>
+                          </w14:textOutline>
+                          <w14:props3d w14:extrusionH="57150" w14:contourW="0" w14:prstMaterial="softEdge">
+                            <w14:bevelT w14:w="25400" w14:h="38100" w14:prst="circle"/>
+                          </w14:props3d>
+                        </w:rPr>
+                      </w:pPr>
+                      <w:r>
+                        <w:rPr>
+                          <w:rFonts w:ascii="Bodoni MT" w:hAnsi="Bodoni MT"/>
+                          <w:b/>
+                          <w:noProof/>
+                          <w:color w:val="ED7D31" w:themeColor="accent2"/>
+                          <w:sz w:val="64"/>
+                          <w:szCs w:val="64"/>
+                          <w14:textOutline w14:w="9525" w14:cap="flat" w14:cmpd="sng" w14:algn="ctr">
+                            <w14:solidFill>
+                              <w14:schemeClr w14:val="tx1"/>
+                            </w14:solidFill>
+                            <w14:prstDash w14:val="solid"/>
+                            <w14:round/>
+                          </w14:textOutline>
+                          <w14:props3d w14:extrusionH="57150" w14:contourW="0" w14:prstMaterial="softEdge">
+                            <w14:bevelT w14:w="25400" w14:h="38100" w14:prst="circle"/>
+                          </w14:props3d>
+                        </w:rPr>
+                        <w:t>Théâtre</w:t>
+                      </w:r>
+                      <w:r>
+                        <w:rPr>
+                          <w:rFonts w:ascii="Bodoni MT" w:hAnsi="Bodoni MT"/>
+                          <w:b/>
+                          <w:noProof/>
+                          <w:color w:val="ED7D31" w:themeColor="accent2"/>
+                          <w:sz w:val="64"/>
+                          <w:szCs w:val="64"/>
+                          <w14:textOutline w14:w="9525" w14:cap="flat" w14:cmpd="sng" w14:algn="ctr">
+                            <w14:solidFill>
+                              <w14:schemeClr w14:val="tx1"/>
+                            </w14:solidFill>
+                            <w14:prstDash w14:val="solid"/>
+                            <w14:round/>
+                          </w14:textOutline>
+                          <w14:props3d w14:extrusionH="57150" w14:contourW="0" w14:prstMaterial="softEdge">
+                            <w14:bevelT w14:w="25400" w14:h="38100" w14:prst="circle"/>
+                          </w14:props3d>
+                        </w:rPr>
+                        <w:t xml:space="preserve"> l</w:t>
+                      </w:r>
+                      <w:r>
+                        <w:rPr>
+                          <w:rFonts w:ascii="Bodoni MT" w:hAnsi="Bodoni MT"/>
+                          <w:b/>
+                          <w:noProof/>
+                          <w:color w:val="ED7D31" w:themeColor="accent2"/>
+                          <w:sz w:val="64"/>
+                          <w:szCs w:val="64"/>
+                          <w14:textOutline w14:w="9525" w14:cap="flat" w14:cmpd="sng" w14:algn="ctr">
+                            <w14:solidFill>
+                              <w14:schemeClr w14:val="tx1"/>
+                            </w14:solidFill>
+                            <w14:prstDash w14:val="solid"/>
+                            <w14:round/>
+                          </w14:textOutline>
+                          <w14:props3d w14:extrusionH="57150" w14:contourW="0" w14:prstMaterial="softEdge">
+                            <w14:bevelT w14:w="25400" w14:h="38100" w14:prst="circle"/>
+                          </w14:props3d>
+                        </w:rPr>
+                        <w:t>e 24 juin 2026</w:t>
+                      </w:r>
+                    </w:p>
+                  </w:txbxContent>
+                </v:textbox>
+              </v:shape>
+            </w:pict>
+          </mc:Fallback>
+        </mc:AlternateContent>
+      </w:r>
+      <w:r>
+        <w:rPr>
+          <w:noProof/>
+        </w:rPr>
+        <mc:AlternateContent>
+          <mc:Choice Requires="wps">
+            <w:drawing>
+              <wp:anchor distT="0" distB="0" distL="114300" distR="114300" simplePos="0" relativeHeight="251679744" behindDoc="0" locked="0" layoutInCell="1" allowOverlap="1" wp14:anchorId="601F528C" wp14:editId="7135EB80">
+                <wp:simplePos x="0" y="0"/>
+                <wp:positionH relativeFrom="column">
+                  <wp:posOffset>438150</wp:posOffset>
+                </wp:positionH>
+                <wp:positionV relativeFrom="paragraph">
+                  <wp:posOffset>187325</wp:posOffset>
+                </wp:positionV>
+                <wp:extent cx="1828800" cy="1828800"/>
+                <wp:effectExtent l="0" t="0" r="0" b="5080"/>
+                <wp:wrapNone/>
+                <wp:docPr id="22" name="Zone de texte 22"/>
+                <wp:cNvGraphicFramePr/>
+                <a:graphic xmlns:a="http://schemas.openxmlformats.org/drawingml/2006/main">
+                  <a:graphicData uri="http://schemas.microsoft.com/office/word/2010/wordprocessingShape">
+                    <wps:wsp>
+                      <wps:cNvSpPr txBox="1"/>
+                      <wps:spPr>
+                        <a:xfrm>
+                          <a:off x="0" y="0"/>
+                          <a:ext cx="1828800" cy="1828800"/>
+                        </a:xfrm>
+                        <a:prstGeom prst="rect">
+                          <a:avLst/>
+                        </a:prstGeom>
+                        <a:noFill/>
+                        <a:ln>
+                          <a:noFill/>
+                        </a:ln>
+                      </wps:spPr>
+                      <wps:txbx>
+                        <w:txbxContent>
+                          <w:p>
+                            <w:pPr>
+                              <w:jc w:val="center"/>
+                              <w:rPr>
+                                <w:rFonts w:ascii="Bodoni MT" w:hAnsi="Bodoni MT"/>
+                                <w:b/>
+                                <w:noProof/>
+                                <w:color w:val="ED7D31" w:themeColor="accent2"/>
+                                <w:sz w:val="64"/>
+                                <w:szCs w:val="64"/>
+                                <w14:textOutline w14:w="9525" w14:cap="flat" w14:cmpd="sng" w14:algn="ctr">
+                                  <w14:solidFill>
+                                    <w14:schemeClr w14:val="tx1"/>
+                                  </w14:solidFill>
+                                  <w14:prstDash w14:val="solid"/>
+                                  <w14:round/>
+                                </w14:textOutline>
+                                <w14:props3d w14:extrusionH="57150" w14:contourW="0" w14:prstMaterial="softEdge">
+                                  <w14:bevelT w14:w="25400" w14:h="38100" w14:prst="circle"/>
+                                </w14:props3d>
+                              </w:rPr>
+                            </w:pPr>
+                            <w:r>
+                              <w:rPr>
+                                <w:rFonts w:ascii="Bodoni MT" w:hAnsi="Bodoni MT"/>
+                                <w:b/>
+                                <w:noProof/>
+                                <w:color w:val="ED7D31" w:themeColor="accent2"/>
+                                <w:sz w:val="64"/>
+                                <w:szCs w:val="64"/>
+                                <w14:textOutline w14:w="9525" w14:cap="flat" w14:cmpd="sng" w14:algn="ctr">
+                                  <w14:solidFill>
+                                    <w14:schemeClr w14:val="tx1"/>
+                                  </w14:solidFill>
+                                  <w14:prstDash w14:val="solid"/>
+                                  <w14:round/>
+                                </w14:textOutline>
+                                <w14:props3d w14:extrusionH="57150" w14:contourW="0" w14:prstMaterial="softEdge">
+                                  <w14:bevelT w14:w="25400" w14:h="38100" w14:prst="circle"/>
+                                </w14:props3d>
+                              </w:rPr>
+                              <w:t>Théâtre</w:t>
+                            </w:r>
+                            <w:r>
+                              <w:rPr>
+                                <w:rFonts w:ascii="Bodoni MT" w:hAnsi="Bodoni MT"/>
+                                <w:b/>
+                                <w:noProof/>
+                                <w:color w:val="ED7D31" w:themeColor="accent2"/>
+                                <w:sz w:val="64"/>
+                                <w:szCs w:val="64"/>
+                                <w14:textOutline w14:w="9525" w14:cap="flat" w14:cmpd="sng" w14:algn="ctr">
+                                  <w14:solidFill>
+                                    <w14:schemeClr w14:val="tx1"/>
+                                  </w14:solidFill>
+                                  <w14:prstDash w14:val="solid"/>
+                                  <w14:round/>
+                                </w14:textOutline>
+                                <w14:props3d w14:extrusionH="57150" w14:contourW="0" w14:prstMaterial="softEdge">
+                                  <w14:bevelT w14:w="25400" w14:h="38100" w14:prst="circle"/>
+                                </w14:props3d>
+                              </w:rPr>
+                              <w:t xml:space="preserve"> l</w:t>
+                            </w:r>
+                            <w:r>
+                              <w:rPr>
+                                <w:rFonts w:ascii="Bodoni MT" w:hAnsi="Bodoni MT"/>
+                                <w:b/>
+                                <w:noProof/>
+                                <w:color w:val="ED7D31" w:themeColor="accent2"/>
+                                <w:sz w:val="64"/>
+                                <w:szCs w:val="64"/>
+                                <w14:textOutline w14:w="9525" w14:cap="flat" w14:cmpd="sng" w14:algn="ctr">
+                                  <w14:solidFill>
+                                    <w14:schemeClr w14:val="tx1"/>
+                                  </w14:solidFill>
+                                  <w14:prstDash w14:val="solid"/>
+                                  <w14:round/>
+                                </w14:textOutline>
+                                <w14:props3d w14:extrusionH="57150" w14:contourW="0" w14:prstMaterial="softEdge">
+                                  <w14:bevelT w14:w="25400" w14:h="38100" w14:prst="circle"/>
+                                </w14:props3d>
+                              </w:rPr>
+                              <w:t>e 24 juin 2026</w:t>
+                            </w:r>
+                          </w:p>
+                        </w:txbxContent>
+                      </wps:txbx>
+                      <wps:bodyPr rot="0" spcFirstLastPara="0" vertOverflow="overflow" horzOverflow="overflow" vert="horz" wrap="none" lIns="91440" tIns="45720" rIns="91440" bIns="45720" numCol="1" spcCol="0" rtlCol="0" fromWordArt="0" anchor="t" anchorCtr="0" forceAA="0" compatLnSpc="1">
+                        <a:prstTxWarp prst="textNoShape">
+                          <a:avLst/>
+                        </a:prstTxWarp>
+                        <a:spAutoFit/>
+                        <a:scene3d>
+                          <a:camera prst="orthographicFront"/>
+                          <a:lightRig rig="soft" dir="t">
+                            <a:rot lat="0" lon="0" rev="15600000"/>
+                          </a:lightRig>
+                        </a:scene3d>
+                        <a:sp3d extrusionH="57150" prstMaterial="softEdge">
+                          <a:bevelT w="25400" h="38100"/>
+                        </a:sp3d>
+                      </wps:bodyPr>
+                    </wps:wsp>
+                  </a:graphicData>
+                </a:graphic>
+              </wp:anchor>
+            </w:drawing>
+          </mc:Choice>
+          <mc:Fallback>
+            <w:pict>
+              <v:shape w14:anchorId="601F528C" id="Zone de texte 22" o:spid="_x0000_s1031" type="#_x0000_t202" style="position:absolute;margin-left:34.5pt;margin-top:14.75pt;width:2in;height:2in;z-index:251679744;visibility:visible;mso-wrap-style:none;mso-wrap-distance-left:9pt;mso-wrap-distance-top:0;mso-wrap-distance-right:9pt;mso-wrap-distance-bottom:0;mso-position-horizontal:absolute;mso-position-horizontal-relative:text;mso-position-vertical:absolute;mso-position-vertical-relative:text;v-text-anchor:top" o:gfxdata="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" filled="f" stroked="f">
+                <v:textbox style="mso-fit-shape-to-text:t">
+                  <w:txbxContent>
+                    <w:p>
+                      <w:pPr>
+                        <w:jc w:val="center"/>
+                        <w:rPr>
+                          <w:rFonts w:ascii="Bodoni MT" w:hAnsi="Bodoni MT"/>
+                          <w:b/>
+                          <w:noProof/>
+                          <w:color w:val="ED7D31" w:themeColor="accent2"/>
+                          <w:sz w:val="64"/>
+                          <w:szCs w:val="64"/>
+                          <w14:textOutline w14:w="9525" w14:cap="flat" w14:cmpd="sng" w14:algn="ctr">
+                            <w14:solidFill>
+                              <w14:schemeClr w14:val="tx1"/>
+                            </w14:solidFill>
+                            <w14:prstDash w14:val="solid"/>
+                            <w14:round/>
+                          </w14:textOutline>
+                          <w14:props3d w14:extrusionH="57150" w14:contourW="0" w14:prstMaterial="softEdge">
+                            <w14:bevelT w14:w="25400" w14:h="38100" w14:prst="circle"/>
+                          </w14:props3d>
+                        </w:rPr>
+                      </w:pPr>
+                      <w:r>
+                        <w:rPr>
+                          <w:rFonts w:ascii="Bodoni MT" w:hAnsi="Bodoni MT"/>
+                          <w:b/>
+                          <w:noProof/>
+                          <w:color w:val="ED7D31" w:themeColor="accent2"/>
+                          <w:sz w:val="64"/>
+                          <w:szCs w:val="64"/>
+                          <w14:textOutline w14:w="9525" w14:cap="flat" w14:cmpd="sng" w14:algn="ctr">
+                            <w14:solidFill>
+                              <w14:schemeClr w14:val="tx1"/>
+                            </w14:solidFill>
+                            <w14:prstDash w14:val="solid"/>
+                            <w14:round/>
+                          </w14:textOutline>
+                          <w14:props3d w14:extrusionH="57150" w14:contourW="0" w14:prstMaterial="softEdge">
+                            <w14:bevelT w14:w="25400" w14:h="38100" w14:prst="circle"/>
+                          </w14:props3d>
+                        </w:rPr>
+                        <w:t>Théâtre</w:t>
+                      </w:r>
+                      <w:r>
+                        <w:rPr>
+                          <w:rFonts w:ascii="Bodoni MT" w:hAnsi="Bodoni MT"/>
+                          <w:b/>
+                          <w:noProof/>
+                          <w:color w:val="ED7D31" w:themeColor="accent2"/>
+                          <w:sz w:val="64"/>
+                          <w:szCs w:val="64"/>
+                          <w14:textOutline w14:w="9525" w14:cap="flat" w14:cmpd="sng" w14:algn="ctr">
+                            <w14:solidFill>
+                              <w14:schemeClr w14:val="tx1"/>
+                            </w14:solidFill>
+                            <w14:prstDash w14:val="solid"/>
+                            <w14:round/>
+                          </w14:textOutline>
+                          <w14:props3d w14:extrusionH="57150" w14:contourW="0" w14:prstMaterial="softEdge">
+                            <w14:bevelT w14:w="25400" w14:h="38100" w14:prst="circle"/>
+                          </w14:props3d>
+                        </w:rPr>
+                        <w:t xml:space="preserve"> l</w:t>
+                      </w:r>
+                      <w:r>
+                        <w:rPr>
+                          <w:rFonts w:ascii="Bodoni MT" w:hAnsi="Bodoni MT"/>
+                          <w:b/>
+                          <w:noProof/>
+                          <w:color w:val="ED7D31" w:themeColor="accent2"/>
+                          <w:sz w:val="64"/>
+                          <w:szCs w:val="64"/>
+                          <w14:textOutline w14:w="9525" w14:cap="flat" w14:cmpd="sng" w14:algn="ctr">
+                            <w14:solidFill>
+                              <w14:schemeClr w14:val="tx1"/>
+                            </w14:solidFill>
+                            <w14:prstDash w14:val="solid"/>
+                            <w14:round/>
+                          </w14:textOutline>
+                          <w14:props3d w14:extrusionH="57150" w14:contourW="0" w14:prstMaterial="softEdge">
+                            <w14:bevelT w14:w="25400" w14:h="38100" w14:prst="circle"/>
+                          </w14:props3d>
+                        </w:rPr>
+                        <w:t>e 24 juin 2026</w:t>
                       </w:r>
                     </w:p>
                   </w:txbxContent>
@@ -685,7 +1579,7 @@
                               <w:rPr>
                                 <w:b/>
                                 <w:noProof/>
-                                <w:color w:val="C00000"/>
+                                <w:color w:val="ED7D31" w:themeColor="accent2"/>
                                 <w:sz w:val="72"/>
                                 <w:szCs w:val="72"/>
                                 <w14:textOutline w14:w="3175" w14:cap="flat" w14:cmpd="sng" w14:algn="ctr">
@@ -704,7 +1598,7 @@
                               <w:rPr>
                                 <w:b/>
                                 <w:noProof/>
-                                <w:color w:val="C00000"/>
+                                <w:color w:val="ED7D31" w:themeColor="accent2"/>
                                 <w:sz w:val="72"/>
                                 <w:szCs w:val="72"/>
                                 <w14:textOutline w14:w="3175" w14:cap="flat" w14:cmpd="sng" w14:algn="ctr">
@@ -718,7 +1612,48 @@
                                   <w14:bevelT w14:w="25400" w14:h="38100" w14:prst="circle"/>
                                 </w14:props3d>
                               </w:rPr>
-                              <w:t>Orchestre</w:t>
+                              <w:t>1</w:t>
+                            </w:r>
+                            <w:r>
+                              <w:rPr>
+                                <w:b/>
+                                <w:noProof/>
+                                <w:color w:val="ED7D31" w:themeColor="accent2"/>
+                                <w:sz w:val="72"/>
+                                <w:szCs w:val="72"/>
+                                <w:vertAlign w:val="superscript"/>
+                                <w14:textOutline w14:w="3175" w14:cap="flat" w14:cmpd="sng" w14:algn="ctr">
+                                  <w14:solidFill>
+                                    <w14:schemeClr w14:val="tx1"/>
+                                  </w14:solidFill>
+                                  <w14:prstDash w14:val="solid"/>
+                                  <w14:round/>
+                                </w14:textOutline>
+                                <w14:props3d w14:extrusionH="57150" w14:contourW="0" w14:prstMaterial="softEdge">
+                                  <w14:bevelT w14:w="25400" w14:h="38100" w14:prst="circle"/>
+                                </w14:props3d>
+                              </w:rPr>
+                              <w:t>ère</w:t>
+                            </w:r>
+                            <w:r>
+                              <w:rPr>
+                                <w:b/>
+                                <w:noProof/>
+                                <w:color w:val="ED7D31" w:themeColor="accent2"/>
+                                <w:sz w:val="72"/>
+                                <w:szCs w:val="72"/>
+                                <w14:textOutline w14:w="3175" w14:cap="flat" w14:cmpd="sng" w14:algn="ctr">
+                                  <w14:solidFill>
+                                    <w14:schemeClr w14:val="tx1"/>
+                                  </w14:solidFill>
+                                  <w14:prstDash w14:val="solid"/>
+                                  <w14:round/>
+                                </w14:textOutline>
+                                <w14:props3d w14:extrusionH="57150" w14:contourW="0" w14:prstMaterial="softEdge">
+                                  <w14:bevelT w14:w="25400" w14:h="38100" w14:prst="circle"/>
+                                </w14:props3d>
+                              </w:rPr>
+                              <w:t xml:space="preserve"> galerie</w:t>
                             </w:r>
                           </w:p>
                         </w:txbxContent>
@@ -746,8 +1681,7 @@
           </mc:Choice>
           <mc:Fallback>
             <w:pict>
-              <v:shape w14:anchorId="5D3CD477" id="Zone de texte 27" o:spid="_x0000_s1029" type="#_x0000_t202" style="position:absolute;margin-left:367.65pt;margin-top:221.5pt;width:2in;height:2in;rotation:2160127fd;z-index:251689984;visibility:visible;mso-wrap-style:none;mso-wrap-distance-left:9pt;mso-wrap-distance-top:0;mso-wrap-distance-right:9pt;mso-wrap-distance-bottom:0;mso-position-horizontal:absolute;mso-position-horizontal-relative:text;mso-position-vertical:absolute;mso-position-vertical-relative:text;v-text-anchor:top" o:gfxdata="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" filled="f" stroked="f">
-                <v:fill o:detectmouseclick="t"/>
+              <v:shape w14:anchorId="5D3CD477" id="Zone de texte 27" o:spid="_x0000_s1032" type="#_x0000_t202" style="position:absolute;margin-left:367.65pt;margin-top:221.5pt;width:2in;height:2in;rotation:2160127fd;z-index:251689984;visibility:visible;mso-wrap-style:none;mso-wrap-distance-left:9pt;mso-wrap-distance-top:0;mso-wrap-distance-right:9pt;mso-wrap-distance-bottom:0;mso-position-horizontal:absolute;mso-position-horizontal-relative:text;mso-position-vertical:absolute;mso-position-vertical-relative:text;v-text-anchor:top" o:gfxdata="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" filled="f" stroked="f">
                 <v:textbox style="mso-fit-shape-to-text:t">
                   <w:txbxContent>
                     <w:p>
@@ -756,7 +1690,7 @@
                         <w:rPr>
                           <w:b/>
                           <w:noProof/>
-                          <w:color w:val="C00000"/>
+                          <w:color w:val="ED7D31" w:themeColor="accent2"/>
                           <w:sz w:val="72"/>
                           <w:szCs w:val="72"/>
                           <w14:textOutline w14:w="3175" w14:cap="flat" w14:cmpd="sng" w14:algn="ctr">
@@ -775,7 +1709,7 @@
                         <w:rPr>
                           <w:b/>
                           <w:noProof/>
-                          <w:color w:val="C00000"/>
+                          <w:color w:val="ED7D31" w:themeColor="accent2"/>
                           <w:sz w:val="72"/>
                           <w:szCs w:val="72"/>
                           <w14:textOutline w14:w="3175" w14:cap="flat" w14:cmpd="sng" w14:algn="ctr">
@@ -789,7 +1723,48 @@
                             <w14:bevelT w14:w="25400" w14:h="38100" w14:prst="circle"/>
                           </w14:props3d>
                         </w:rPr>
-                        <w:t>Orchestre</w:t>
+                        <w:t>1</w:t>
+                      </w:r>
+                      <w:r>
+                        <w:rPr>
+                          <w:b/>
+                          <w:noProof/>
+                          <w:color w:val="ED7D31" w:themeColor="accent2"/>
+                          <w:sz w:val="72"/>
+                          <w:szCs w:val="72"/>
+                          <w:vertAlign w:val="superscript"/>
+                          <w14:textOutline w14:w="3175" w14:cap="flat" w14:cmpd="sng" w14:algn="ctr">
+                            <w14:solidFill>
+                              <w14:schemeClr w14:val="tx1"/>
+                            </w14:solidFill>
+                            <w14:prstDash w14:val="solid"/>
+                            <w14:round/>
+                          </w14:textOutline>
+                          <w14:props3d w14:extrusionH="57150" w14:contourW="0" w14:prstMaterial="softEdge">
+                            <w14:bevelT w14:w="25400" w14:h="38100" w14:prst="circle"/>
+                          </w14:props3d>
+                        </w:rPr>
+                        <w:t>ère</w:t>
+                      </w:r>
+                      <w:r>
+                        <w:rPr>
+                          <w:b/>
+                          <w:noProof/>
+                          <w:color w:val="ED7D31" w:themeColor="accent2"/>
+                          <w:sz w:val="72"/>
+                          <w:szCs w:val="72"/>
+                          <w14:textOutline w14:w="3175" w14:cap="flat" w14:cmpd="sng" w14:algn="ctr">
+                            <w14:solidFill>
+                              <w14:schemeClr w14:val="tx1"/>
+                            </w14:solidFill>
+                            <w14:prstDash w14:val="solid"/>
+                            <w14:round/>
+                          </w14:textOutline>
+                          <w14:props3d w14:extrusionH="57150" w14:contourW="0" w14:prstMaterial="softEdge">
+                            <w14:bevelT w14:w="25400" w14:h="38100" w14:prst="circle"/>
+                          </w14:props3d>
+                        </w:rPr>
+                        <w:t xml:space="preserve"> galerie</w:t>
                       </w:r>
                     </w:p>
                   </w:txbxContent>
@@ -806,7 +1781,7 @@
         <mc:AlternateContent>
           <mc:Choice Requires="wps">
             <w:drawing>
-              <wp:anchor distT="0" distB="0" distL="114300" distR="114300" simplePos="0" relativeHeight="251687936" behindDoc="0" locked="0" layoutInCell="1" allowOverlap="1" wp14:anchorId="60E46CD4" wp14:editId="684AC27C">
+              <wp:anchor distT="0" distB="0" distL="114300" distR="114300" simplePos="0" relativeHeight="251687936" behindDoc="0" locked="0" layoutInCell="1" allowOverlap="1" wp14:anchorId="60E46CD4" wp14:editId="67B02D07">
                 <wp:simplePos x="0" y="0"/>
                 <wp:positionH relativeFrom="column">
                   <wp:posOffset>4667249</wp:posOffset>
@@ -844,7 +1819,7 @@
                               <w:rPr>
                                 <w:b/>
                                 <w:noProof/>
-                                <w:color w:val="C00000"/>
+                                <w:color w:val="ED7D31" w:themeColor="accent2"/>
                                 <w:sz w:val="72"/>
                                 <w:szCs w:val="72"/>
                                 <w14:textOutline w14:w="3175" w14:cap="flat" w14:cmpd="sng" w14:algn="ctr">
@@ -863,7 +1838,7 @@
                               <w:rPr>
                                 <w:b/>
                                 <w:noProof/>
-                                <w:color w:val="C00000"/>
+                                <w:color w:val="ED7D31" w:themeColor="accent2"/>
                                 <w:sz w:val="72"/>
                                 <w:szCs w:val="72"/>
                                 <w14:textOutline w14:w="3175" w14:cap="flat" w14:cmpd="sng" w14:algn="ctr">
@@ -905,8 +1880,7 @@
           </mc:Choice>
           <mc:Fallback>
             <w:pict>
-              <v:shape w14:anchorId="60E46CD4" id="Zone de texte 26" o:spid="_x0000_s1030" type="#_x0000_t202" style="position:absolute;margin-left:367.5pt;margin-top:14.25pt;width:2in;height:2in;rotation:2160127fd;z-index:251687936;visibility:visible;mso-wrap-style:none;mso-wrap-distance-left:9pt;mso-wrap-distance-top:0;mso-wrap-distance-right:9pt;mso-wrap-distance-bottom:0;mso-position-horizontal:absolute;mso-position-horizontal-relative:text;mso-position-vertical:absolute;mso-position-vertical-relative:text;v-text-anchor:top" o:gfxdata="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" filled="f" stroked="f">
-                <v:fill o:detectmouseclick="t"/>
+              <v:shape w14:anchorId="60E46CD4" id="Zone de texte 26" o:spid="_x0000_s1033" type="#_x0000_t202" style="position:absolute;margin-left:367.5pt;margin-top:14.25pt;width:2in;height:2in;rotation:2160127fd;z-index:251687936;visibility:visible;mso-wrap-style:none;mso-wrap-distance-left:9pt;mso-wrap-distance-top:0;mso-wrap-distance-right:9pt;mso-wrap-distance-bottom:0;mso-position-horizontal:absolute;mso-position-horizontal-relative:text;mso-position-vertical:absolute;mso-position-vertical-relative:text;v-text-anchor:top" o:gfxdata="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" filled="f" stroked="f">
                 <v:textbox style="mso-fit-shape-to-text:t">
                   <w:txbxContent>
                     <w:p>
@@ -915,7 +1889,7 @@
                         <w:rPr>
                           <w:b/>
                           <w:noProof/>
-                          <w:color w:val="C00000"/>
+                          <w:color w:val="ED7D31" w:themeColor="accent2"/>
                           <w:sz w:val="72"/>
                           <w:szCs w:val="72"/>
                           <w14:textOutline w14:w="3175" w14:cap="flat" w14:cmpd="sng" w14:algn="ctr">
@@ -934,7 +1908,7 @@
                         <w:rPr>
                           <w:b/>
                           <w:noProof/>
-                          <w:color w:val="C00000"/>
+                          <w:color w:val="ED7D31" w:themeColor="accent2"/>
                           <w:sz w:val="72"/>
                           <w:szCs w:val="72"/>
                           <w14:textOutline w14:w="3175" w14:cap="flat" w14:cmpd="sng" w14:algn="ctr">
@@ -949,759 +1923,6 @@
                           </w14:props3d>
                         </w:rPr>
                         <w:t>Orchestre</w:t>
-                      </w:r>
-                    </w:p>
-                  </w:txbxContent>
-                </v:textbox>
-              </v:shape>
-            </w:pict>
-          </mc:Fallback>
-        </mc:AlternateContent>
-      </w:r>
-      <w:r>
-        <w:rPr>
-          <w:noProof/>
-        </w:rPr>
-        <mc:AlternateContent>
-          <mc:Choice Requires="wps">
-            <w:drawing>
-              <wp:anchor distT="0" distB="0" distL="114300" distR="114300" simplePos="0" relativeHeight="251685888" behindDoc="0" locked="0" layoutInCell="1" allowOverlap="1" wp14:anchorId="769C8E11" wp14:editId="54274A21">
-                <wp:simplePos x="0" y="0"/>
-                <wp:positionH relativeFrom="column">
-                  <wp:posOffset>1878330</wp:posOffset>
-                </wp:positionH>
-                <wp:positionV relativeFrom="paragraph">
-                  <wp:posOffset>7794625</wp:posOffset>
-                </wp:positionV>
-                <wp:extent cx="1828800" cy="1828800"/>
-                <wp:effectExtent l="0" t="0" r="0" b="4445"/>
-                <wp:wrapNone/>
-                <wp:docPr id="25" name="Zone de texte 25"/>
-                <wp:cNvGraphicFramePr/>
-                <a:graphic xmlns:a="http://schemas.openxmlformats.org/drawingml/2006/main">
-                  <a:graphicData uri="http://schemas.microsoft.com/office/word/2010/wordprocessingShape">
-                    <wps:wsp>
-                      <wps:cNvSpPr txBox="1"/>
-                      <wps:spPr>
-                        <a:xfrm>
-                          <a:off x="0" y="0"/>
-                          <a:ext cx="1828800" cy="1828800"/>
-                        </a:xfrm>
-                        <a:prstGeom prst="rect">
-                          <a:avLst/>
-                        </a:prstGeom>
-                        <a:noFill/>
-                        <a:ln>
-                          <a:noFill/>
-                        </a:ln>
-                      </wps:spPr>
-                      <wps:txbx>
-                        <w:txbxContent>
-                          <w:p>
-                            <w:pPr>
-                              <w:jc w:val="center"/>
-                              <w:rPr>
-                                <w:rFonts w:ascii="Bodoni MT" w:hAnsi="Bodoni MT"/>
-                                <w:b/>
-                                <w:noProof/>
-                                <w:color w:val="C00000"/>
-                                <w:sz w:val="56"/>
-                                <w:szCs w:val="56"/>
-                                <w14:textOutline w14:w="9525" w14:cap="flat" w14:cmpd="sng" w14:algn="ctr">
-                                  <w14:solidFill>
-                                    <w14:schemeClr w14:val="tx1"/>
-                                  </w14:solidFill>
-                                  <w14:prstDash w14:val="solid"/>
-                                  <w14:round/>
-                                </w14:textOutline>
-                                <w14:props3d w14:extrusionH="57150" w14:contourW="0" w14:prstMaterial="softEdge">
-                                  <w14:bevelT w14:w="25400" w14:h="38100" w14:prst="circle"/>
-                                </w14:props3d>
-                              </w:rPr>
-                            </w:pPr>
-                            <w:r>
-                              <w:rPr>
-                                <w:rFonts w:ascii="Bodoni MT" w:hAnsi="Bodoni MT"/>
-                                <w:b/>
-                                <w:noProof/>
-                                <w:color w:val="C00000"/>
-                                <w:sz w:val="56"/>
-                                <w:szCs w:val="56"/>
-                                <w14:textOutline w14:w="9525" w14:cap="flat" w14:cmpd="sng" w14:algn="ctr">
-                                  <w14:solidFill>
-                                    <w14:schemeClr w14:val="tx1"/>
-                                  </w14:solidFill>
-                                  <w14:prstDash w14:val="solid"/>
-                                  <w14:round/>
-                                </w14:textOutline>
-                                <w14:props3d w14:extrusionH="57150" w14:contourW="0" w14:prstMaterial="softEdge">
-                                  <w14:bevelT w14:w="25400" w14:h="38100" w14:prst="circle"/>
-                                </w14:props3d>
-                              </w:rPr>
-                              <w:t>Théâtre</w:t>
-                            </w:r>
-                          </w:p>
-                          <w:p>
-                            <w:pPr>
-                              <w:jc w:val="center"/>
-                              <w:rPr>
-                                <w:rFonts w:ascii="Bodoni MT" w:hAnsi="Bodoni MT"/>
-                                <w:b/>
-                                <w:noProof/>
-                                <w:color w:val="C00000"/>
-                                <w:sz w:val="56"/>
-                                <w:szCs w:val="56"/>
-                                <w14:textOutline w14:w="9525" w14:cap="flat" w14:cmpd="sng" w14:algn="ctr">
-                                  <w14:solidFill>
-                                    <w14:schemeClr w14:val="tx1"/>
-                                  </w14:solidFill>
-                                  <w14:prstDash w14:val="solid"/>
-                                  <w14:round/>
-                                </w14:textOutline>
-                                <w14:props3d w14:extrusionH="57150" w14:contourW="0" w14:prstMaterial="softEdge">
-                                  <w14:bevelT w14:w="25400" w14:h="38100" w14:prst="circle"/>
-                                </w14:props3d>
-                              </w:rPr>
-                            </w:pPr>
-                            <w:r>
-                              <w:rPr>
-                                <w:rFonts w:ascii="Bodoni MT" w:hAnsi="Bodoni MT"/>
-                                <w:b/>
-                                <w:noProof/>
-                                <w:color w:val="C00000"/>
-                                <w:sz w:val="56"/>
-                                <w:szCs w:val="56"/>
-                                <w14:textOutline w14:w="9525" w14:cap="flat" w14:cmpd="sng" w14:algn="ctr">
-                                  <w14:solidFill>
-                                    <w14:schemeClr w14:val="tx1"/>
-                                  </w14:solidFill>
-                                  <w14:prstDash w14:val="solid"/>
-                                  <w14:round/>
-                                </w14:textOutline>
-                                <w14:props3d w14:extrusionH="57150" w14:contourW="0" w14:prstMaterial="softEdge">
-                                  <w14:bevelT w14:w="25400" w14:h="38100" w14:prst="circle"/>
-                                </w14:props3d>
-                              </w:rPr>
-                              <w:t>Le 24 juin 2026</w:t>
-                            </w:r>
-                          </w:p>
-                        </w:txbxContent>
-                      </wps:txbx>
-                      <wps:bodyPr rot="0" spcFirstLastPara="0" vertOverflow="overflow" horzOverflow="overflow" vert="horz" wrap="none" lIns="91440" tIns="45720" rIns="91440" bIns="45720" numCol="1" spcCol="0" rtlCol="0" fromWordArt="0" anchor="t" anchorCtr="0" forceAA="0" compatLnSpc="1">
-                        <a:prstTxWarp prst="textNoShape">
-                          <a:avLst/>
-                        </a:prstTxWarp>
-                        <a:spAutoFit/>
-                        <a:scene3d>
-                          <a:camera prst="orthographicFront"/>
-                          <a:lightRig rig="soft" dir="t">
-                            <a:rot lat="0" lon="0" rev="15600000"/>
-                          </a:lightRig>
-                        </a:scene3d>
-                        <a:sp3d extrusionH="57150" prstMaterial="softEdge">
-                          <a:bevelT w="25400" h="38100"/>
-                        </a:sp3d>
-                      </wps:bodyPr>
-                    </wps:wsp>
-                  </a:graphicData>
-                </a:graphic>
-              </wp:anchor>
-            </w:drawing>
-          </mc:Choice>
-          <mc:Fallback>
-            <w:pict>
-              <v:shape w14:anchorId="769C8E11" id="Zone de texte 25" o:spid="_x0000_s1031" type="#_x0000_t202" style="position:absolute;margin-left:147.9pt;margin-top:613.75pt;width:2in;height:2in;z-index:251685888;visibility:visible;mso-wrap-style:none;mso-wrap-distance-left:9pt;mso-wrap-distance-top:0;mso-wrap-distance-right:9pt;mso-wrap-distance-bottom:0;mso-position-horizontal:absolute;mso-position-horizontal-relative:text;mso-position-vertical:absolute;mso-position-vertical-relative:text;v-text-anchor:top" o:gfxdata="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" filled="f" stroked="f">
-                <v:fill o:detectmouseclick="t"/>
-                <v:textbox style="mso-fit-shape-to-text:t">
-                  <w:txbxContent>
-                    <w:p>
-                      <w:pPr>
-                        <w:jc w:val="center"/>
-                        <w:rPr>
-                          <w:rFonts w:ascii="Bodoni MT" w:hAnsi="Bodoni MT"/>
-                          <w:b/>
-                          <w:noProof/>
-                          <w:color w:val="C00000"/>
-                          <w:sz w:val="56"/>
-                          <w:szCs w:val="56"/>
-                          <w14:textOutline w14:w="9525" w14:cap="flat" w14:cmpd="sng" w14:algn="ctr">
-                            <w14:solidFill>
-                              <w14:schemeClr w14:val="tx1"/>
-                            </w14:solidFill>
-                            <w14:prstDash w14:val="solid"/>
-                            <w14:round/>
-                          </w14:textOutline>
-                          <w14:props3d w14:extrusionH="57150" w14:contourW="0" w14:prstMaterial="softEdge">
-                            <w14:bevelT w14:w="25400" w14:h="38100" w14:prst="circle"/>
-                          </w14:props3d>
-                        </w:rPr>
-                      </w:pPr>
-                      <w:r>
-                        <w:rPr>
-                          <w:rFonts w:ascii="Bodoni MT" w:hAnsi="Bodoni MT"/>
-                          <w:b/>
-                          <w:noProof/>
-                          <w:color w:val="C00000"/>
-                          <w:sz w:val="56"/>
-                          <w:szCs w:val="56"/>
-                          <w14:textOutline w14:w="9525" w14:cap="flat" w14:cmpd="sng" w14:algn="ctr">
-                            <w14:solidFill>
-                              <w14:schemeClr w14:val="tx1"/>
-                            </w14:solidFill>
-                            <w14:prstDash w14:val="solid"/>
-                            <w14:round/>
-                          </w14:textOutline>
-                          <w14:props3d w14:extrusionH="57150" w14:contourW="0" w14:prstMaterial="softEdge">
-                            <w14:bevelT w14:w="25400" w14:h="38100" w14:prst="circle"/>
-                          </w14:props3d>
-                        </w:rPr>
-                        <w:t>Théâtre</w:t>
-                      </w:r>
-                    </w:p>
-                    <w:p>
-                      <w:pPr>
-                        <w:jc w:val="center"/>
-                        <w:rPr>
-                          <w:rFonts w:ascii="Bodoni MT" w:hAnsi="Bodoni MT"/>
-                          <w:b/>
-                          <w:noProof/>
-                          <w:color w:val="C00000"/>
-                          <w:sz w:val="56"/>
-                          <w:szCs w:val="56"/>
-                          <w14:textOutline w14:w="9525" w14:cap="flat" w14:cmpd="sng" w14:algn="ctr">
-                            <w14:solidFill>
-                              <w14:schemeClr w14:val="tx1"/>
-                            </w14:solidFill>
-                            <w14:prstDash w14:val="solid"/>
-                            <w14:round/>
-                          </w14:textOutline>
-                          <w14:props3d w14:extrusionH="57150" w14:contourW="0" w14:prstMaterial="softEdge">
-                            <w14:bevelT w14:w="25400" w14:h="38100" w14:prst="circle"/>
-                          </w14:props3d>
-                        </w:rPr>
-                      </w:pPr>
-                      <w:r>
-                        <w:rPr>
-                          <w:rFonts w:ascii="Bodoni MT" w:hAnsi="Bodoni MT"/>
-                          <w:b/>
-                          <w:noProof/>
-                          <w:color w:val="C00000"/>
-                          <w:sz w:val="56"/>
-                          <w:szCs w:val="56"/>
-                          <w14:textOutline w14:w="9525" w14:cap="flat" w14:cmpd="sng" w14:algn="ctr">
-                            <w14:solidFill>
-                              <w14:schemeClr w14:val="tx1"/>
-                            </w14:solidFill>
-                            <w14:prstDash w14:val="solid"/>
-                            <w14:round/>
-                          </w14:textOutline>
-                          <w14:props3d w14:extrusionH="57150" w14:contourW="0" w14:prstMaterial="softEdge">
-                            <w14:bevelT w14:w="25400" w14:h="38100" w14:prst="circle"/>
-                          </w14:props3d>
-                        </w:rPr>
-                        <w:t>Le 24 juin 2026</w:t>
-                      </w:r>
-                    </w:p>
-                  </w:txbxContent>
-                </v:textbox>
-              </v:shape>
-            </w:pict>
-          </mc:Fallback>
-        </mc:AlternateContent>
-      </w:r>
-      <w:r>
-        <w:rPr>
-          <w:noProof/>
-        </w:rPr>
-        <mc:AlternateContent>
-          <mc:Choice Requires="wps">
-            <w:drawing>
-              <wp:anchor distT="0" distB="0" distL="114300" distR="114300" simplePos="0" relativeHeight="251683840" behindDoc="0" locked="0" layoutInCell="1" allowOverlap="1" wp14:anchorId="4E3EB99E" wp14:editId="454CA806">
-                <wp:simplePos x="0" y="0"/>
-                <wp:positionH relativeFrom="column">
-                  <wp:posOffset>1878330</wp:posOffset>
-                </wp:positionH>
-                <wp:positionV relativeFrom="paragraph">
-                  <wp:posOffset>5194300</wp:posOffset>
-                </wp:positionV>
-                <wp:extent cx="1828800" cy="1828800"/>
-                <wp:effectExtent l="0" t="0" r="0" b="4445"/>
-                <wp:wrapNone/>
-                <wp:docPr id="24" name="Zone de texte 24"/>
-                <wp:cNvGraphicFramePr/>
-                <a:graphic xmlns:a="http://schemas.openxmlformats.org/drawingml/2006/main">
-                  <a:graphicData uri="http://schemas.microsoft.com/office/word/2010/wordprocessingShape">
-                    <wps:wsp>
-                      <wps:cNvSpPr txBox="1"/>
-                      <wps:spPr>
-                        <a:xfrm>
-                          <a:off x="0" y="0"/>
-                          <a:ext cx="1828800" cy="1828800"/>
-                        </a:xfrm>
-                        <a:prstGeom prst="rect">
-                          <a:avLst/>
-                        </a:prstGeom>
-                        <a:noFill/>
-                        <a:ln>
-                          <a:noFill/>
-                        </a:ln>
-                      </wps:spPr>
-                      <wps:txbx>
-                        <w:txbxContent>
-                          <w:p>
-                            <w:pPr>
-                              <w:jc w:val="center"/>
-                              <w:rPr>
-                                <w:rFonts w:ascii="Bodoni MT" w:hAnsi="Bodoni MT"/>
-                                <w:b/>
-                                <w:noProof/>
-                                <w:color w:val="C00000"/>
-                                <w:sz w:val="56"/>
-                                <w:szCs w:val="56"/>
-                                <w14:textOutline w14:w="9525" w14:cap="flat" w14:cmpd="sng" w14:algn="ctr">
-                                  <w14:solidFill>
-                                    <w14:schemeClr w14:val="tx1"/>
-                                  </w14:solidFill>
-                                  <w14:prstDash w14:val="solid"/>
-                                  <w14:round/>
-                                </w14:textOutline>
-                                <w14:props3d w14:extrusionH="57150" w14:contourW="0" w14:prstMaterial="softEdge">
-                                  <w14:bevelT w14:w="25400" w14:h="38100" w14:prst="circle"/>
-                                </w14:props3d>
-                              </w:rPr>
-                            </w:pPr>
-                            <w:r>
-                              <w:rPr>
-                                <w:rFonts w:ascii="Bodoni MT" w:hAnsi="Bodoni MT"/>
-                                <w:b/>
-                                <w:noProof/>
-                                <w:color w:val="C00000"/>
-                                <w:sz w:val="56"/>
-                                <w:szCs w:val="56"/>
-                                <w14:textOutline w14:w="9525" w14:cap="flat" w14:cmpd="sng" w14:algn="ctr">
-                                  <w14:solidFill>
-                                    <w14:schemeClr w14:val="tx1"/>
-                                  </w14:solidFill>
-                                  <w14:prstDash w14:val="solid"/>
-                                  <w14:round/>
-                                </w14:textOutline>
-                                <w14:props3d w14:extrusionH="57150" w14:contourW="0" w14:prstMaterial="softEdge">
-                                  <w14:bevelT w14:w="25400" w14:h="38100" w14:prst="circle"/>
-                                </w14:props3d>
-                              </w:rPr>
-                              <w:t>Théâtre</w:t>
-                            </w:r>
-                          </w:p>
-                          <w:p>
-                            <w:pPr>
-                              <w:jc w:val="center"/>
-                              <w:rPr>
-                                <w:rFonts w:ascii="Bodoni MT" w:hAnsi="Bodoni MT"/>
-                                <w:b/>
-                                <w:noProof/>
-                                <w:color w:val="C00000"/>
-                                <w:sz w:val="56"/>
-                                <w:szCs w:val="56"/>
-                                <w14:textOutline w14:w="9525" w14:cap="flat" w14:cmpd="sng" w14:algn="ctr">
-                                  <w14:solidFill>
-                                    <w14:schemeClr w14:val="tx1"/>
-                                  </w14:solidFill>
-                                  <w14:prstDash w14:val="solid"/>
-                                  <w14:round/>
-                                </w14:textOutline>
-                                <w14:props3d w14:extrusionH="57150" w14:contourW="0" w14:prstMaterial="softEdge">
-                                  <w14:bevelT w14:w="25400" w14:h="38100" w14:prst="circle"/>
-                                </w14:props3d>
-                              </w:rPr>
-                            </w:pPr>
-                            <w:r>
-                              <w:rPr>
-                                <w:rFonts w:ascii="Bodoni MT" w:hAnsi="Bodoni MT"/>
-                                <w:b/>
-                                <w:noProof/>
-                                <w:color w:val="C00000"/>
-                                <w:sz w:val="56"/>
-                                <w:szCs w:val="56"/>
-                                <w14:textOutline w14:w="9525" w14:cap="flat" w14:cmpd="sng" w14:algn="ctr">
-                                  <w14:solidFill>
-                                    <w14:schemeClr w14:val="tx1"/>
-                                  </w14:solidFill>
-                                  <w14:prstDash w14:val="solid"/>
-                                  <w14:round/>
-                                </w14:textOutline>
-                                <w14:props3d w14:extrusionH="57150" w14:contourW="0" w14:prstMaterial="softEdge">
-                                  <w14:bevelT w14:w="25400" w14:h="38100" w14:prst="circle"/>
-                                </w14:props3d>
-                              </w:rPr>
-                              <w:t>Le 24 juin 2026</w:t>
-                            </w:r>
-                          </w:p>
-                        </w:txbxContent>
-                      </wps:txbx>
-                      <wps:bodyPr rot="0" spcFirstLastPara="0" vertOverflow="overflow" horzOverflow="overflow" vert="horz" wrap="none" lIns="91440" tIns="45720" rIns="91440" bIns="45720" numCol="1" spcCol="0" rtlCol="0" fromWordArt="0" anchor="t" anchorCtr="0" forceAA="0" compatLnSpc="1">
-                        <a:prstTxWarp prst="textNoShape">
-                          <a:avLst/>
-                        </a:prstTxWarp>
-                        <a:spAutoFit/>
-                        <a:scene3d>
-                          <a:camera prst="orthographicFront"/>
-                          <a:lightRig rig="soft" dir="t">
-                            <a:rot lat="0" lon="0" rev="15600000"/>
-                          </a:lightRig>
-                        </a:scene3d>
-                        <a:sp3d extrusionH="57150" prstMaterial="softEdge">
-                          <a:bevelT w="25400" h="38100"/>
-                        </a:sp3d>
-                      </wps:bodyPr>
-                    </wps:wsp>
-                  </a:graphicData>
-                </a:graphic>
-              </wp:anchor>
-            </w:drawing>
-          </mc:Choice>
-          <mc:Fallback>
-            <w:pict>
-              <v:shape w14:anchorId="4E3EB99E" id="Zone de texte 24" o:spid="_x0000_s1032" type="#_x0000_t202" style="position:absolute;margin-left:147.9pt;margin-top:409pt;width:2in;height:2in;z-index:251683840;visibility:visible;mso-wrap-style:none;mso-wrap-distance-left:9pt;mso-wrap-distance-top:0;mso-wrap-distance-right:9pt;mso-wrap-distance-bottom:0;mso-position-horizontal:absolute;mso-position-horizontal-relative:text;mso-position-vertical:absolute;mso-position-vertical-relative:text;v-text-anchor:top" o:gfxdata="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" filled="f" stroked="f">
-                <v:fill o:detectmouseclick="t"/>
-                <v:textbox style="mso-fit-shape-to-text:t">
-                  <w:txbxContent>
-                    <w:p>
-                      <w:pPr>
-                        <w:jc w:val="center"/>
-                        <w:rPr>
-                          <w:rFonts w:ascii="Bodoni MT" w:hAnsi="Bodoni MT"/>
-                          <w:b/>
-                          <w:noProof/>
-                          <w:color w:val="C00000"/>
-                          <w:sz w:val="56"/>
-                          <w:szCs w:val="56"/>
-                          <w14:textOutline w14:w="9525" w14:cap="flat" w14:cmpd="sng" w14:algn="ctr">
-                            <w14:solidFill>
-                              <w14:schemeClr w14:val="tx1"/>
-                            </w14:solidFill>
-                            <w14:prstDash w14:val="solid"/>
-                            <w14:round/>
-                          </w14:textOutline>
-                          <w14:props3d w14:extrusionH="57150" w14:contourW="0" w14:prstMaterial="softEdge">
-                            <w14:bevelT w14:w="25400" w14:h="38100" w14:prst="circle"/>
-                          </w14:props3d>
-                        </w:rPr>
-                      </w:pPr>
-                      <w:r>
-                        <w:rPr>
-                          <w:rFonts w:ascii="Bodoni MT" w:hAnsi="Bodoni MT"/>
-                          <w:b/>
-                          <w:noProof/>
-                          <w:color w:val="C00000"/>
-                          <w:sz w:val="56"/>
-                          <w:szCs w:val="56"/>
-                          <w14:textOutline w14:w="9525" w14:cap="flat" w14:cmpd="sng" w14:algn="ctr">
-                            <w14:solidFill>
-                              <w14:schemeClr w14:val="tx1"/>
-                            </w14:solidFill>
-                            <w14:prstDash w14:val="solid"/>
-                            <w14:round/>
-                          </w14:textOutline>
-                          <w14:props3d w14:extrusionH="57150" w14:contourW="0" w14:prstMaterial="softEdge">
-                            <w14:bevelT w14:w="25400" w14:h="38100" w14:prst="circle"/>
-                          </w14:props3d>
-                        </w:rPr>
-                        <w:t>Théâtre</w:t>
-                      </w:r>
-                    </w:p>
-                    <w:p>
-                      <w:pPr>
-                        <w:jc w:val="center"/>
-                        <w:rPr>
-                          <w:rFonts w:ascii="Bodoni MT" w:hAnsi="Bodoni MT"/>
-                          <w:b/>
-                          <w:noProof/>
-                          <w:color w:val="C00000"/>
-                          <w:sz w:val="56"/>
-                          <w:szCs w:val="56"/>
-                          <w14:textOutline w14:w="9525" w14:cap="flat" w14:cmpd="sng" w14:algn="ctr">
-                            <w14:solidFill>
-                              <w14:schemeClr w14:val="tx1"/>
-                            </w14:solidFill>
-                            <w14:prstDash w14:val="solid"/>
-                            <w14:round/>
-                          </w14:textOutline>
-                          <w14:props3d w14:extrusionH="57150" w14:contourW="0" w14:prstMaterial="softEdge">
-                            <w14:bevelT w14:w="25400" w14:h="38100" w14:prst="circle"/>
-                          </w14:props3d>
-                        </w:rPr>
-                      </w:pPr>
-                      <w:r>
-                        <w:rPr>
-                          <w:rFonts w:ascii="Bodoni MT" w:hAnsi="Bodoni MT"/>
-                          <w:b/>
-                          <w:noProof/>
-                          <w:color w:val="C00000"/>
-                          <w:sz w:val="56"/>
-                          <w:szCs w:val="56"/>
-                          <w14:textOutline w14:w="9525" w14:cap="flat" w14:cmpd="sng" w14:algn="ctr">
-                            <w14:solidFill>
-                              <w14:schemeClr w14:val="tx1"/>
-                            </w14:solidFill>
-                            <w14:prstDash w14:val="solid"/>
-                            <w14:round/>
-                          </w14:textOutline>
-                          <w14:props3d w14:extrusionH="57150" w14:contourW="0" w14:prstMaterial="softEdge">
-                            <w14:bevelT w14:w="25400" w14:h="38100" w14:prst="circle"/>
-                          </w14:props3d>
-                        </w:rPr>
-                        <w:t>Le 24 juin 2026</w:t>
-                      </w:r>
-                    </w:p>
-                  </w:txbxContent>
-                </v:textbox>
-              </v:shape>
-            </w:pict>
-          </mc:Fallback>
-        </mc:AlternateContent>
-      </w:r>
-      <w:r>
-        <w:rPr>
-          <w:noProof/>
-        </w:rPr>
-        <mc:AlternateContent>
-          <mc:Choice Requires="wps">
-            <w:drawing>
-              <wp:anchor distT="0" distB="0" distL="114300" distR="114300" simplePos="0" relativeHeight="251681792" behindDoc="0" locked="0" layoutInCell="1" allowOverlap="1" wp14:anchorId="755782D2" wp14:editId="464C430B">
-                <wp:simplePos x="0" y="0"/>
-                <wp:positionH relativeFrom="column">
-                  <wp:posOffset>1878330</wp:posOffset>
-                </wp:positionH>
-                <wp:positionV relativeFrom="paragraph">
-                  <wp:posOffset>2584450</wp:posOffset>
-                </wp:positionV>
-                <wp:extent cx="1828800" cy="1828800"/>
-                <wp:effectExtent l="0" t="0" r="0" b="4445"/>
-                <wp:wrapNone/>
-                <wp:docPr id="23" name="Zone de texte 23"/>
-                <wp:cNvGraphicFramePr/>
-                <a:graphic xmlns:a="http://schemas.openxmlformats.org/drawingml/2006/main">
-                  <a:graphicData uri="http://schemas.microsoft.com/office/word/2010/wordprocessingShape">
-                    <wps:wsp>
-                      <wps:cNvSpPr txBox="1"/>
-                      <wps:spPr>
-                        <a:xfrm>
-                          <a:off x="0" y="0"/>
-                          <a:ext cx="1828800" cy="1828800"/>
-                        </a:xfrm>
-                        <a:prstGeom prst="rect">
-                          <a:avLst/>
-                        </a:prstGeom>
-                        <a:noFill/>
-                        <a:ln>
-                          <a:noFill/>
-                        </a:ln>
-                      </wps:spPr>
-                      <wps:txbx>
-                        <w:txbxContent>
-                          <w:p>
-                            <w:pPr>
-                              <w:jc w:val="center"/>
-                              <w:rPr>
-                                <w:rFonts w:ascii="Bodoni MT" w:hAnsi="Bodoni MT"/>
-                                <w:b/>
-                                <w:noProof/>
-                                <w:color w:val="C00000"/>
-                                <w:sz w:val="56"/>
-                                <w:szCs w:val="56"/>
-                                <w14:textOutline w14:w="9525" w14:cap="flat" w14:cmpd="sng" w14:algn="ctr">
-                                  <w14:solidFill>
-                                    <w14:schemeClr w14:val="tx1"/>
-                                  </w14:solidFill>
-                                  <w14:prstDash w14:val="solid"/>
-                                  <w14:round/>
-                                </w14:textOutline>
-                                <w14:props3d w14:extrusionH="57150" w14:contourW="0" w14:prstMaterial="softEdge">
-                                  <w14:bevelT w14:w="25400" w14:h="38100" w14:prst="circle"/>
-                                </w14:props3d>
-                              </w:rPr>
-                            </w:pPr>
-                            <w:r>
-                              <w:rPr>
-                                <w:rFonts w:ascii="Bodoni MT" w:hAnsi="Bodoni MT"/>
-                                <w:b/>
-                                <w:noProof/>
-                                <w:color w:val="C00000"/>
-                                <w:sz w:val="56"/>
-                                <w:szCs w:val="56"/>
-                                <w14:textOutline w14:w="9525" w14:cap="flat" w14:cmpd="sng" w14:algn="ctr">
-                                  <w14:solidFill>
-                                    <w14:schemeClr w14:val="tx1"/>
-                                  </w14:solidFill>
-                                  <w14:prstDash w14:val="solid"/>
-                                  <w14:round/>
-                                </w14:textOutline>
-                                <w14:props3d w14:extrusionH="57150" w14:contourW="0" w14:prstMaterial="softEdge">
-                                  <w14:bevelT w14:w="25400" w14:h="38100" w14:prst="circle"/>
-                                </w14:props3d>
-                              </w:rPr>
-                              <w:t>Théâtre</w:t>
-                            </w:r>
-                          </w:p>
-                          <w:p>
-                            <w:pPr>
-                              <w:jc w:val="center"/>
-                              <w:rPr>
-                                <w:rFonts w:ascii="Bodoni MT" w:hAnsi="Bodoni MT"/>
-                                <w:b/>
-                                <w:noProof/>
-                                <w:color w:val="C00000"/>
-                                <w:sz w:val="56"/>
-                                <w:szCs w:val="56"/>
-                                <w14:textOutline w14:w="9525" w14:cap="flat" w14:cmpd="sng" w14:algn="ctr">
-                                  <w14:solidFill>
-                                    <w14:schemeClr w14:val="tx1"/>
-                                  </w14:solidFill>
-                                  <w14:prstDash w14:val="solid"/>
-                                  <w14:round/>
-                                </w14:textOutline>
-                                <w14:props3d w14:extrusionH="57150" w14:contourW="0" w14:prstMaterial="softEdge">
-                                  <w14:bevelT w14:w="25400" w14:h="38100" w14:prst="circle"/>
-                                </w14:props3d>
-                              </w:rPr>
-                            </w:pPr>
-                            <w:r>
-                              <w:rPr>
-                                <w:rFonts w:ascii="Bodoni MT" w:hAnsi="Bodoni MT"/>
-                                <w:b/>
-                                <w:noProof/>
-                                <w:color w:val="C00000"/>
-                                <w:sz w:val="56"/>
-                                <w:szCs w:val="56"/>
-                                <w14:textOutline w14:w="9525" w14:cap="flat" w14:cmpd="sng" w14:algn="ctr">
-                                  <w14:solidFill>
-                                    <w14:schemeClr w14:val="tx1"/>
-                                  </w14:solidFill>
-                                  <w14:prstDash w14:val="solid"/>
-                                  <w14:round/>
-                                </w14:textOutline>
-                                <w14:props3d w14:extrusionH="57150" w14:contourW="0" w14:prstMaterial="softEdge">
-                                  <w14:bevelT w14:w="25400" w14:h="38100" w14:prst="circle"/>
-                                </w14:props3d>
-                              </w:rPr>
-                              <w:t>Le 24 juin 2026</w:t>
-                            </w:r>
-                          </w:p>
-                        </w:txbxContent>
-                      </wps:txbx>
-                      <wps:bodyPr rot="0" spcFirstLastPara="0" vertOverflow="overflow" horzOverflow="overflow" vert="horz" wrap="none" lIns="91440" tIns="45720" rIns="91440" bIns="45720" numCol="1" spcCol="0" rtlCol="0" fromWordArt="0" anchor="t" anchorCtr="0" forceAA="0" compatLnSpc="1">
-                        <a:prstTxWarp prst="textNoShape">
-                          <a:avLst/>
-                        </a:prstTxWarp>
-                        <a:spAutoFit/>
-                        <a:scene3d>
-                          <a:camera prst="orthographicFront"/>
-                          <a:lightRig rig="soft" dir="t">
-                            <a:rot lat="0" lon="0" rev="15600000"/>
-                          </a:lightRig>
-                        </a:scene3d>
-                        <a:sp3d extrusionH="57150" prstMaterial="softEdge">
-                          <a:bevelT w="25400" h="38100"/>
-                        </a:sp3d>
-                      </wps:bodyPr>
-                    </wps:wsp>
-                  </a:graphicData>
-                </a:graphic>
-              </wp:anchor>
-            </w:drawing>
-          </mc:Choice>
-          <mc:Fallback>
-            <w:pict>
-              <v:shape w14:anchorId="755782D2" id="Zone de texte 23" o:spid="_x0000_s1033" type="#_x0000_t202" style="position:absolute;margin-left:147.9pt;margin-top:203.5pt;width:2in;height:2in;z-index:251681792;visibility:visible;mso-wrap-style:none;mso-wrap-distance-left:9pt;mso-wrap-distance-top:0;mso-wrap-distance-right:9pt;mso-wrap-distance-bottom:0;mso-position-horizontal:absolute;mso-position-horizontal-relative:text;mso-position-vertical:absolute;mso-position-vertical-relative:text;v-text-anchor:top" o:gfxdata="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" filled="f" stroked="f">
-                <v:fill o:detectmouseclick="t"/>
-                <v:textbox style="mso-fit-shape-to-text:t">
-                  <w:txbxContent>
-                    <w:p>
-                      <w:pPr>
-                        <w:jc w:val="center"/>
-                        <w:rPr>
-                          <w:rFonts w:ascii="Bodoni MT" w:hAnsi="Bodoni MT"/>
-                          <w:b/>
-                          <w:noProof/>
-                          <w:color w:val="C00000"/>
-                          <w:sz w:val="56"/>
-                          <w:szCs w:val="56"/>
-                          <w14:textOutline w14:w="9525" w14:cap="flat" w14:cmpd="sng" w14:algn="ctr">
-                            <w14:solidFill>
-                              <w14:schemeClr w14:val="tx1"/>
-                            </w14:solidFill>
-                            <w14:prstDash w14:val="solid"/>
-                            <w14:round/>
-                          </w14:textOutline>
-                          <w14:props3d w14:extrusionH="57150" w14:contourW="0" w14:prstMaterial="softEdge">
-                            <w14:bevelT w14:w="25400" w14:h="38100" w14:prst="circle"/>
-                          </w14:props3d>
-                        </w:rPr>
-                      </w:pPr>
-                      <w:r>
-                        <w:rPr>
-                          <w:rFonts w:ascii="Bodoni MT" w:hAnsi="Bodoni MT"/>
-                          <w:b/>
-                          <w:noProof/>
-                          <w:color w:val="C00000"/>
-                          <w:sz w:val="56"/>
-                          <w:szCs w:val="56"/>
-                          <w14:textOutline w14:w="9525" w14:cap="flat" w14:cmpd="sng" w14:algn="ctr">
-                            <w14:solidFill>
-                              <w14:schemeClr w14:val="tx1"/>
-                            </w14:solidFill>
-                            <w14:prstDash w14:val="solid"/>
-                            <w14:round/>
-                          </w14:textOutline>
-                          <w14:props3d w14:extrusionH="57150" w14:contourW="0" w14:prstMaterial="softEdge">
-                            <w14:bevelT w14:w="25400" w14:h="38100" w14:prst="circle"/>
-                          </w14:props3d>
-                        </w:rPr>
-                        <w:t>Théâtre</w:t>
-                      </w:r>
-                    </w:p>
-                    <w:p>
-                      <w:pPr>
-                        <w:jc w:val="center"/>
-                        <w:rPr>
-                          <w:rFonts w:ascii="Bodoni MT" w:hAnsi="Bodoni MT"/>
-                          <w:b/>
-                          <w:noProof/>
-                          <w:color w:val="C00000"/>
-                          <w:sz w:val="56"/>
-                          <w:szCs w:val="56"/>
-                          <w14:textOutline w14:w="9525" w14:cap="flat" w14:cmpd="sng" w14:algn="ctr">
-                            <w14:solidFill>
-                              <w14:schemeClr w14:val="tx1"/>
-                            </w14:solidFill>
-                            <w14:prstDash w14:val="solid"/>
-                            <w14:round/>
-                          </w14:textOutline>
-                          <w14:props3d w14:extrusionH="57150" w14:contourW="0" w14:prstMaterial="softEdge">
-                            <w14:bevelT w14:w="25400" w14:h="38100" w14:prst="circle"/>
-                          </w14:props3d>
-                        </w:rPr>
-                      </w:pPr>
-                      <w:r>
-                        <w:rPr>
-                          <w:rFonts w:ascii="Bodoni MT" w:hAnsi="Bodoni MT"/>
-                          <w:b/>
-                          <w:noProof/>
-                          <w:color w:val="C00000"/>
-                          <w:sz w:val="56"/>
-                          <w:szCs w:val="56"/>
-                          <w14:textOutline w14:w="9525" w14:cap="flat" w14:cmpd="sng" w14:algn="ctr">
-                            <w14:solidFill>
-                              <w14:schemeClr w14:val="tx1"/>
-                            </w14:solidFill>
-                            <w14:prstDash w14:val="solid"/>
-                            <w14:round/>
-                          </w14:textOutline>
-                          <w14:props3d w14:extrusionH="57150" w14:contourW="0" w14:prstMaterial="softEdge">
-                            <w14:bevelT w14:w="25400" w14:h="38100" w14:prst="circle"/>
-                          </w14:props3d>
-                        </w:rPr>
-                        <w:t>Le 24 juin 2026</w:t>
                       </w:r>
                     </w:p>
                   </w:txbxContent>
@@ -1849,7 +2070,6 @@
           <mc:Fallback>
             <w:pict>
               <v:shape w14:anchorId="132F0284" id="Zone de texte 18" o:spid="_x0000_s1034" type="#_x0000_t202" style="position:absolute;margin-left:381.15pt;margin-top:690.25pt;width:2in;height:2in;z-index:251671552;visibility:visible;mso-wrap-style:none;mso-wrap-distance-left:9pt;mso-wrap-distance-top:0;mso-wrap-distance-right:9pt;mso-wrap-distance-bottom:0;mso-position-horizontal:absolute;mso-position-horizontal-relative:text;mso-position-vertical:absolute;mso-position-vertical-relative:text;v-text-anchor:top" o:gfxdata="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" filled="f" stroked="f">
-                <v:fill o:detectmouseclick="t"/>
                 <v:textbox style="mso-fit-shape-to-text:t">
                   <w:txbxContent>
                     <w:p>
@@ -2079,7 +2299,6 @@
           <mc:Fallback>
             <w:pict>
               <v:shape w14:anchorId="14BA3151" id="Zone de texte 21" o:spid="_x0000_s1035" type="#_x0000_t202" style="position:absolute;margin-left:381.15pt;margin-top:76pt;width:2in;height:2in;z-index:251677696;visibility:visible;mso-wrap-style:none;mso-wrap-distance-left:9pt;mso-wrap-distance-top:0;mso-wrap-distance-right:9pt;mso-wrap-distance-bottom:0;mso-position-horizontal:absolute;mso-position-horizontal-relative:text;mso-position-vertical:absolute;mso-position-vertical-relative:text;v-text-anchor:top" o:gfxdata="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" filled="f" stroked="f">
-                <v:fill o:detectmouseclick="t"/>
                 <v:textbox style="mso-fit-shape-to-text:t">
                   <w:txbxContent>
                     <w:p>
@@ -2309,7 +2528,6 @@
           <mc:Fallback>
             <w:pict>
               <v:shape w14:anchorId="2A975454" id="Zone de texte 20" o:spid="_x0000_s1036" type="#_x0000_t202" style="position:absolute;margin-left:381.15pt;margin-top:280pt;width:2in;height:2in;z-index:251675648;visibility:visible;mso-wrap-style:none;mso-wrap-distance-left:9pt;mso-wrap-distance-top:0;mso-wrap-distance-right:9pt;mso-wrap-distance-bottom:0;mso-position-horizontal:absolute;mso-position-horizontal-relative:text;mso-position-vertical:absolute;mso-position-vertical-relative:text;v-text-anchor:top" o:gfxdata="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" filled="f" stroked="f">
-                <v:fill o:detectmouseclick="t"/>
                 <v:textbox style="mso-fit-shape-to-text:t">
                   <w:txbxContent>
                     <w:p>
@@ -2539,7 +2757,6 @@
           <mc:Fallback>
             <w:pict>
               <v:shape w14:anchorId="19894401" id="Zone de texte 19" o:spid="_x0000_s1037" type="#_x0000_t202" style="position:absolute;margin-left:381.15pt;margin-top:484.75pt;width:2in;height:2in;z-index:251673600;visibility:visible;mso-wrap-style:none;mso-wrap-distance-left:9pt;mso-wrap-distance-top:0;mso-wrap-distance-right:9pt;mso-wrap-distance-bottom:0;mso-position-horizontal:absolute;mso-position-horizontal-relative:text;mso-position-vertical:absolute;mso-position-vertical-relative:text;v-text-anchor:top" o:gfxdata="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" filled="f" stroked="f">
-                <v:fill o:detectmouseclick="t"/>
                 <v:textbox style="mso-fit-shape-to-text:t">
                   <w:txbxContent>
                     <w:p>
@@ -2729,7 +2946,6 @@
           <mc:Fallback>
             <w:pict>
               <v:shape w14:anchorId="08201304" id="Zone de texte 17" o:spid="_x0000_s1038" type="#_x0000_t202" style="position:absolute;margin-left:24.15pt;margin-top:688.75pt;width:2in;height:2in;z-index:251669504;visibility:visible;mso-wrap-style:none;mso-wrap-distance-left:9pt;mso-wrap-distance-top:0;mso-wrap-distance-right:9pt;mso-wrap-distance-bottom:0;mso-position-horizontal:absolute;mso-position-horizontal-relative:text;mso-position-vertical:absolute;mso-position-vertical-relative:text;v-text-anchor:top" o:gfxdata="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" filled="f" stroked="f">
-                <v:fill o:detectmouseclick="t"/>
                 <v:textbox style="mso-fit-shape-to-text:t">
                   <w:txbxContent>
                     <w:p>
@@ -2879,7 +3095,6 @@
           <mc:Fallback>
             <w:pict>
               <v:shape w14:anchorId="3EC5C09C" id="Zone de texte 16" o:spid="_x0000_s1039" type="#_x0000_t202" style="position:absolute;margin-left:24.15pt;margin-top:484.75pt;width:2in;height:2in;z-index:251667456;visibility:visible;mso-wrap-style:none;mso-wrap-distance-left:9pt;mso-wrap-distance-top:0;mso-wrap-distance-right:9pt;mso-wrap-distance-bottom:0;mso-position-horizontal:absolute;mso-position-horizontal-relative:text;mso-position-vertical:absolute;mso-position-vertical-relative:text;v-text-anchor:top" o:gfxdata="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" filled="f" stroked="f">
-                <v:fill o:detectmouseclick="t"/>
                 <v:textbox style="mso-fit-shape-to-text:t">
                   <w:txbxContent>
                     <w:p>
@@ -3032,7 +3247,6 @@
           <mc:Fallback>
             <w:pict>
               <v:shape w14:anchorId="2D8A6E18" id="Zone de texte 15" o:spid="_x0000_s1040" type="#_x0000_t202" style="position:absolute;margin-left:24.15pt;margin-top:280.7pt;width:2in;height:2in;z-index:251665408;visibility:visible;mso-wrap-style:none;mso-height-percent:0;mso-wrap-distance-left:9pt;mso-wrap-distance-top:0;mso-wrap-distance-right:9pt;mso-wrap-distance-bottom:0;mso-position-horizontal:absolute;mso-position-horizontal-relative:text;mso-position-vertical:absolute;mso-position-vertical-relative:text;mso-height-percent:0;mso-height-relative:margin;v-text-anchor:top" o:gfxdata="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" filled="f" stroked="f">
-                <v:fill o:detectmouseclick="t"/>
                 <v:textbox>
                   <w:txbxContent>
                     <w:p>
@@ -3182,7 +3396,6 @@
           <mc:Fallback>
             <w:pict>
               <v:shape w14:anchorId="143A1E48" id="Zone de texte 1" o:spid="_x0000_s1041" type="#_x0000_t202" style="position:absolute;margin-left:24pt;margin-top:75pt;width:2in;height:2in;z-index:251663360;visibility:visible;mso-wrap-style:none;mso-wrap-distance-left:9pt;mso-wrap-distance-top:0;mso-wrap-distance-right:9pt;mso-wrap-distance-bottom:0;mso-position-horizontal:absolute;mso-position-horizontal-relative:text;mso-position-vertical:absolute;mso-position-vertical-relative:text;v-text-anchor:top" o:gfxdata="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" filled="f" stroked="f">
-                <v:fill o:detectmouseclick="t"/>
                 <v:textbox style="mso-fit-shape-to-text:t">
                   <w:txbxContent>
                     <w:p>

</xml_diff>

<commit_message>
AJout des tickets par catégorie
</commit_message>
<xml_diff>
--- a/APEL-2025-2026_ticket_theatre_orchestre.docx
+++ b/APEL-2025-2026_ticket_theatre_orchestre.docx
@@ -8,7 +8,7 @@
           <w:noProof/>
         </w:rPr>
         <w:drawing>
-          <wp:anchor distT="0" distB="0" distL="114300" distR="114300" simplePos="0" relativeHeight="251658240" behindDoc="1" locked="0" layoutInCell="1" allowOverlap="1" wp14:anchorId="6DC32A80" wp14:editId="037C26ED">
+          <wp:anchor distT="0" distB="0" distL="114300" distR="114300" simplePos="0" relativeHeight="251658240" behindDoc="1" locked="0" layoutInCell="1" allowOverlap="1" wp14:anchorId="6DC32A80" wp14:editId="58CAD6F3">
             <wp:simplePos x="0" y="0"/>
             <wp:positionH relativeFrom="column">
               <wp:posOffset>3810</wp:posOffset>
@@ -64,7 +64,68 @@
         </w:drawing>
       </w:r>
     </w:p>
-    <w:p/>
+    <w:p>
+      <w:r>
+        <w:rPr>
+          <w:noProof/>
+        </w:rPr>
+        <w:drawing>
+          <wp:anchor distT="0" distB="0" distL="114300" distR="114300" simplePos="0" relativeHeight="251695104" behindDoc="1" locked="0" layoutInCell="1" allowOverlap="1" wp14:anchorId="0D5DFB6C" wp14:editId="1F6DC01A">
+            <wp:simplePos x="0" y="0"/>
+            <wp:positionH relativeFrom="margin">
+              <wp:posOffset>426338</wp:posOffset>
+            </wp:positionH>
+            <wp:positionV relativeFrom="page">
+              <wp:posOffset>660400</wp:posOffset>
+            </wp:positionV>
+            <wp:extent cx="1784985" cy="1197610"/>
+            <wp:effectExtent l="0" t="0" r="5715" b="2540"/>
+            <wp:wrapNone/>
+            <wp:docPr id="5" name="Image 5"/>
+            <wp:cNvGraphicFramePr>
+              <a:graphicFrameLocks xmlns:a="http://schemas.openxmlformats.org/drawingml/2006/main" noChangeAspect="1"/>
+            </wp:cNvGraphicFramePr>
+            <a:graphic xmlns:a="http://schemas.openxmlformats.org/drawingml/2006/main">
+              <a:graphicData uri="http://schemas.openxmlformats.org/drawingml/2006/picture">
+                <pic:pic xmlns:pic="http://schemas.openxmlformats.org/drawingml/2006/picture">
+                  <pic:nvPicPr>
+                    <pic:cNvPr id="5" name="Image 5"/>
+                    <pic:cNvPicPr/>
+                  </pic:nvPicPr>
+                  <pic:blipFill>
+                    <a:blip r:embed="rId6" cstate="print">
+                      <a:extLst>
+                        <a:ext uri="{28A0092B-C50C-407E-A947-70E740481C1C}">
+                          <a14:useLocalDpi xmlns:a14="http://schemas.microsoft.com/office/drawing/2010/main" val="0"/>
+                        </a:ext>
+                      </a:extLst>
+                    </a:blip>
+                    <a:stretch>
+                      <a:fillRect/>
+                    </a:stretch>
+                  </pic:blipFill>
+                  <pic:spPr>
+                    <a:xfrm>
+                      <a:off x="0" y="0"/>
+                      <a:ext cx="1784985" cy="1197610"/>
+                    </a:xfrm>
+                    <a:prstGeom prst="rect">
+                      <a:avLst/>
+                    </a:prstGeom>
+                  </pic:spPr>
+                </pic:pic>
+              </a:graphicData>
+            </a:graphic>
+            <wp14:sizeRelH relativeFrom="page">
+              <wp14:pctWidth>0</wp14:pctWidth>
+            </wp14:sizeRelH>
+            <wp14:sizeRelV relativeFrom="page">
+              <wp14:pctHeight>0</wp14:pctHeight>
+            </wp14:sizeRelV>
+          </wp:anchor>
+        </w:drawing>
+      </w:r>
+    </w:p>
     <w:p>
       <w:r>
         <w:rPr>
@@ -73,18 +134,18 @@
         <mc:AlternateContent>
           <mc:Choice Requires="wps">
             <w:drawing>
-              <wp:anchor distT="0" distB="0" distL="114300" distR="114300" simplePos="0" relativeHeight="251694080" behindDoc="0" locked="0" layoutInCell="1" allowOverlap="1" wp14:anchorId="0378127C" wp14:editId="6C31C5E2">
+              <wp:anchor distT="0" distB="0" distL="114300" distR="114300" simplePos="0" relativeHeight="251692032" behindDoc="0" locked="0" layoutInCell="1" allowOverlap="1" wp14:anchorId="7FA73619" wp14:editId="5D5D1798">
                 <wp:simplePos x="0" y="0"/>
                 <wp:positionH relativeFrom="column">
-                  <wp:posOffset>4542155</wp:posOffset>
+                  <wp:posOffset>4648200</wp:posOffset>
                 </wp:positionH>
                 <wp:positionV relativeFrom="paragraph">
-                  <wp:posOffset>8035925</wp:posOffset>
+                  <wp:posOffset>5387552</wp:posOffset>
                 </wp:positionV>
                 <wp:extent cx="1828800" cy="1828800"/>
-                <wp:effectExtent l="0" t="533400" r="0" b="538480"/>
+                <wp:effectExtent l="0" t="457200" r="0" b="462280"/>
                 <wp:wrapNone/>
-                <wp:docPr id="29" name="Zone de texte 29"/>
+                <wp:docPr id="28" name="Zone de texte 28"/>
                 <wp:cNvGraphicFramePr/>
                 <a:graphic xmlns:a="http://schemas.openxmlformats.org/drawingml/2006/main">
                   <a:graphicData uri="http://schemas.microsoft.com/office/word/2010/wordprocessingShape">
@@ -144,48 +205,7 @@
                                   <w14:bevelT w14:w="25400" w14:h="38100" w14:prst="circle"/>
                                 </w14:props3d>
                               </w:rPr>
-                              <w:t>3</w:t>
-                            </w:r>
-                            <w:r>
-                              <w:rPr>
-                                <w:b/>
-                                <w:noProof/>
-                                <w:color w:val="ED7D31" w:themeColor="accent2"/>
-                                <w:sz w:val="72"/>
-                                <w:szCs w:val="72"/>
-                                <w:vertAlign w:val="superscript"/>
-                                <w14:textOutline w14:w="3175" w14:cap="flat" w14:cmpd="sng" w14:algn="ctr">
-                                  <w14:solidFill>
-                                    <w14:schemeClr w14:val="tx1"/>
-                                  </w14:solidFill>
-                                  <w14:prstDash w14:val="solid"/>
-                                  <w14:round/>
-                                </w14:textOutline>
-                                <w14:props3d w14:extrusionH="57150" w14:contourW="0" w14:prstMaterial="softEdge">
-                                  <w14:bevelT w14:w="25400" w14:h="38100" w14:prst="circle"/>
-                                </w14:props3d>
-                              </w:rPr>
-                              <w:t>ème</w:t>
-                            </w:r>
-                            <w:r>
-                              <w:rPr>
-                                <w:b/>
-                                <w:noProof/>
-                                <w:color w:val="ED7D31" w:themeColor="accent2"/>
-                                <w:sz w:val="72"/>
-                                <w:szCs w:val="72"/>
-                                <w14:textOutline w14:w="3175" w14:cap="flat" w14:cmpd="sng" w14:algn="ctr">
-                                  <w14:solidFill>
-                                    <w14:schemeClr w14:val="tx1"/>
-                                  </w14:solidFill>
-                                  <w14:prstDash w14:val="solid"/>
-                                  <w14:round/>
-                                </w14:textOutline>
-                                <w14:props3d w14:extrusionH="57150" w14:contourW="0" w14:prstMaterial="softEdge">
-                                  <w14:bevelT w14:w="25400" w14:h="38100" w14:prst="circle"/>
-                                </w14:props3d>
-                              </w:rPr>
-                              <w:t xml:space="preserve"> galerie</w:t>
+                              <w:t>Orchestre</w:t>
                             </w:r>
                           </w:p>
                         </w:txbxContent>
@@ -213,11 +233,11 @@
           </mc:Choice>
           <mc:Fallback>
             <w:pict>
-              <v:shapetype w14:anchorId="0378127C" id="_x0000_t202" coordsize="21600,21600" o:spt="202" path="m,l,21600r21600,l21600,xe">
+              <v:shapetype w14:anchorId="7FA73619" id="_x0000_t202" coordsize="21600,21600" o:spt="202" path="m,l,21600r21600,l21600,xe">
                 <v:stroke joinstyle="miter"/>
                 <v:path gradientshapeok="t" o:connecttype="rect"/>
               </v:shapetype>
-              <v:shape id="Zone de texte 29" o:spid="_x0000_s1026" type="#_x0000_t202" style="position:absolute;margin-left:357.65pt;margin-top:632.75pt;width:2in;height:2in;rotation:2160127fd;z-index:251694080;visibility:visible;mso-wrap-style:none;mso-wrap-distance-left:9pt;mso-wrap-distance-top:0;mso-wrap-distance-right:9pt;mso-wrap-distance-bottom:0;mso-position-horizontal:absolute;mso-position-horizontal-relative:text;mso-position-vertical:absolute;mso-position-vertical-relative:text;v-text-anchor:top" o:gfxdata="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" filled="f" stroked="f">
+              <v:shape id="Zone de texte 28" o:spid="_x0000_s1026" type="#_x0000_t202" style="position:absolute;margin-left:366pt;margin-top:424.2pt;width:2in;height:2in;rotation:2160127fd;z-index:251692032;visibility:visible;mso-wrap-style:none;mso-wrap-distance-left:9pt;mso-wrap-distance-top:0;mso-wrap-distance-right:9pt;mso-wrap-distance-bottom:0;mso-position-horizontal:absolute;mso-position-horizontal-relative:text;mso-position-vertical:absolute;mso-position-vertical-relative:text;v-text-anchor:top" o:gfxdata="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" filled="f" stroked="f">
                 <v:textbox style="mso-fit-shape-to-text:t">
                   <w:txbxContent>
                     <w:p>
@@ -259,48 +279,7 @@
                             <w14:bevelT w14:w="25400" w14:h="38100" w14:prst="circle"/>
                           </w14:props3d>
                         </w:rPr>
-                        <w:t>3</w:t>
-                      </w:r>
-                      <w:r>
-                        <w:rPr>
-                          <w:b/>
-                          <w:noProof/>
-                          <w:color w:val="ED7D31" w:themeColor="accent2"/>
-                          <w:sz w:val="72"/>
-                          <w:szCs w:val="72"/>
-                          <w:vertAlign w:val="superscript"/>
-                          <w14:textOutline w14:w="3175" w14:cap="flat" w14:cmpd="sng" w14:algn="ctr">
-                            <w14:solidFill>
-                              <w14:schemeClr w14:val="tx1"/>
-                            </w14:solidFill>
-                            <w14:prstDash w14:val="solid"/>
-                            <w14:round/>
-                          </w14:textOutline>
-                          <w14:props3d w14:extrusionH="57150" w14:contourW="0" w14:prstMaterial="softEdge">
-                            <w14:bevelT w14:w="25400" w14:h="38100" w14:prst="circle"/>
-                          </w14:props3d>
-                        </w:rPr>
-                        <w:t>ème</w:t>
-                      </w:r>
-                      <w:r>
-                        <w:rPr>
-                          <w:b/>
-                          <w:noProof/>
-                          <w:color w:val="ED7D31" w:themeColor="accent2"/>
-                          <w:sz w:val="72"/>
-                          <w:szCs w:val="72"/>
-                          <w14:textOutline w14:w="3175" w14:cap="flat" w14:cmpd="sng" w14:algn="ctr">
-                            <w14:solidFill>
-                              <w14:schemeClr w14:val="tx1"/>
-                            </w14:solidFill>
-                            <w14:prstDash w14:val="solid"/>
-                            <w14:round/>
-                          </w14:textOutline>
-                          <w14:props3d w14:extrusionH="57150" w14:contourW="0" w14:prstMaterial="softEdge">
-                            <w14:bevelT w14:w="25400" w14:h="38100" w14:prst="circle"/>
-                          </w14:props3d>
-                        </w:rPr>
-                        <w:t xml:space="preserve"> galerie</w:t>
+                        <w:t>Orchestre</w:t>
                       </w:r>
                     </w:p>
                   </w:txbxContent>
@@ -317,18 +296,18 @@
         <mc:AlternateContent>
           <mc:Choice Requires="wps">
             <w:drawing>
-              <wp:anchor distT="0" distB="0" distL="114300" distR="114300" simplePos="0" relativeHeight="251692032" behindDoc="0" locked="0" layoutInCell="1" allowOverlap="1" wp14:anchorId="7FA73619" wp14:editId="7AF5B230">
+              <wp:anchor distT="0" distB="0" distL="114300" distR="114300" simplePos="0" relativeHeight="251694080" behindDoc="0" locked="0" layoutInCell="1" allowOverlap="1" wp14:anchorId="0378127C" wp14:editId="28CF82CA">
                 <wp:simplePos x="0" y="0"/>
                 <wp:positionH relativeFrom="column">
-                  <wp:posOffset>4567555</wp:posOffset>
+                  <wp:posOffset>4662593</wp:posOffset>
                 </wp:positionH>
                 <wp:positionV relativeFrom="paragraph">
-                  <wp:posOffset>5422900</wp:posOffset>
+                  <wp:posOffset>7987030</wp:posOffset>
                 </wp:positionV>
                 <wp:extent cx="1828800" cy="1828800"/>
-                <wp:effectExtent l="0" t="533400" r="0" b="538480"/>
+                <wp:effectExtent l="0" t="457200" r="0" b="462280"/>
                 <wp:wrapNone/>
-                <wp:docPr id="28" name="Zone de texte 28"/>
+                <wp:docPr id="29" name="Zone de texte 29"/>
                 <wp:cNvGraphicFramePr/>
                 <a:graphic xmlns:a="http://schemas.openxmlformats.org/drawingml/2006/main">
                   <a:graphicData uri="http://schemas.microsoft.com/office/word/2010/wordprocessingShape">
@@ -388,48 +367,7 @@
                                   <w14:bevelT w14:w="25400" w14:h="38100" w14:prst="circle"/>
                                 </w14:props3d>
                               </w:rPr>
-                              <w:t>2</w:t>
-                            </w:r>
-                            <w:r>
-                              <w:rPr>
-                                <w:b/>
-                                <w:noProof/>
-                                <w:color w:val="ED7D31" w:themeColor="accent2"/>
-                                <w:sz w:val="72"/>
-                                <w:szCs w:val="72"/>
-                                <w:vertAlign w:val="superscript"/>
-                                <w14:textOutline w14:w="3175" w14:cap="flat" w14:cmpd="sng" w14:algn="ctr">
-                                  <w14:solidFill>
-                                    <w14:schemeClr w14:val="tx1"/>
-                                  </w14:solidFill>
-                                  <w14:prstDash w14:val="solid"/>
-                                  <w14:round/>
-                                </w14:textOutline>
-                                <w14:props3d w14:extrusionH="57150" w14:contourW="0" w14:prstMaterial="softEdge">
-                                  <w14:bevelT w14:w="25400" w14:h="38100" w14:prst="circle"/>
-                                </w14:props3d>
-                              </w:rPr>
-                              <w:t>ème</w:t>
-                            </w:r>
-                            <w:r>
-                              <w:rPr>
-                                <w:b/>
-                                <w:noProof/>
-                                <w:color w:val="ED7D31" w:themeColor="accent2"/>
-                                <w:sz w:val="72"/>
-                                <w:szCs w:val="72"/>
-                                <w14:textOutline w14:w="3175" w14:cap="flat" w14:cmpd="sng" w14:algn="ctr">
-                                  <w14:solidFill>
-                                    <w14:schemeClr w14:val="tx1"/>
-                                  </w14:solidFill>
-                                  <w14:prstDash w14:val="solid"/>
-                                  <w14:round/>
-                                </w14:textOutline>
-                                <w14:props3d w14:extrusionH="57150" w14:contourW="0" w14:prstMaterial="softEdge">
-                                  <w14:bevelT w14:w="25400" w14:h="38100" w14:prst="circle"/>
-                                </w14:props3d>
-                              </w:rPr>
-                              <w:t xml:space="preserve"> galerie</w:t>
+                              <w:t>Orchestre</w:t>
                             </w:r>
                           </w:p>
                         </w:txbxContent>
@@ -457,7 +395,7 @@
           </mc:Choice>
           <mc:Fallback>
             <w:pict>
-              <v:shape w14:anchorId="7FA73619" id="Zone de texte 28" o:spid="_x0000_s1027" type="#_x0000_t202" style="position:absolute;margin-left:359.65pt;margin-top:427pt;width:2in;height:2in;rotation:2160127fd;z-index:251692032;visibility:visible;mso-wrap-style:none;mso-wrap-distance-left:9pt;mso-wrap-distance-top:0;mso-wrap-distance-right:9pt;mso-wrap-distance-bottom:0;mso-position-horizontal:absolute;mso-position-horizontal-relative:text;mso-position-vertical:absolute;mso-position-vertical-relative:text;v-text-anchor:top" o:gfxdata="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" filled="f" stroked="f">
+              <v:shape w14:anchorId="0378127C" id="Zone de texte 29" o:spid="_x0000_s1027" type="#_x0000_t202" style="position:absolute;margin-left:367.15pt;margin-top:628.9pt;width:2in;height:2in;rotation:2160127fd;z-index:251694080;visibility:visible;mso-wrap-style:none;mso-wrap-distance-left:9pt;mso-wrap-distance-top:0;mso-wrap-distance-right:9pt;mso-wrap-distance-bottom:0;mso-position-horizontal:absolute;mso-position-horizontal-relative:text;mso-position-vertical:absolute;mso-position-vertical-relative:text;v-text-anchor:top" o:gfxdata="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" filled="f" stroked="f">
                 <v:textbox style="mso-fit-shape-to-text:t">
                   <w:txbxContent>
                     <w:p>
@@ -499,48 +437,7 @@
                             <w14:bevelT w14:w="25400" w14:h="38100" w14:prst="circle"/>
                           </w14:props3d>
                         </w:rPr>
-                        <w:t>2</w:t>
-                      </w:r>
-                      <w:r>
-                        <w:rPr>
-                          <w:b/>
-                          <w:noProof/>
-                          <w:color w:val="ED7D31" w:themeColor="accent2"/>
-                          <w:sz w:val="72"/>
-                          <w:szCs w:val="72"/>
-                          <w:vertAlign w:val="superscript"/>
-                          <w14:textOutline w14:w="3175" w14:cap="flat" w14:cmpd="sng" w14:algn="ctr">
-                            <w14:solidFill>
-                              <w14:schemeClr w14:val="tx1"/>
-                            </w14:solidFill>
-                            <w14:prstDash w14:val="solid"/>
-                            <w14:round/>
-                          </w14:textOutline>
-                          <w14:props3d w14:extrusionH="57150" w14:contourW="0" w14:prstMaterial="softEdge">
-                            <w14:bevelT w14:w="25400" w14:h="38100" w14:prst="circle"/>
-                          </w14:props3d>
-                        </w:rPr>
-                        <w:t>ème</w:t>
-                      </w:r>
-                      <w:r>
-                        <w:rPr>
-                          <w:b/>
-                          <w:noProof/>
-                          <w:color w:val="ED7D31" w:themeColor="accent2"/>
-                          <w:sz w:val="72"/>
-                          <w:szCs w:val="72"/>
-                          <w14:textOutline w14:w="3175" w14:cap="flat" w14:cmpd="sng" w14:algn="ctr">
-                            <w14:solidFill>
-                              <w14:schemeClr w14:val="tx1"/>
-                            </w14:solidFill>
-                            <w14:prstDash w14:val="solid"/>
-                            <w14:round/>
-                          </w14:textOutline>
-                          <w14:props3d w14:extrusionH="57150" w14:contourW="0" w14:prstMaterial="softEdge">
-                            <w14:bevelT w14:w="25400" w14:h="38100" w14:prst="circle"/>
-                          </w14:props3d>
-                        </w:rPr>
-                        <w:t xml:space="preserve"> galerie</w:t>
+                        <w:t>Orchestre</w:t>
                       </w:r>
                     </w:p>
                   </w:txbxContent>
@@ -554,21 +451,201 @@
         <w:rPr>
           <w:noProof/>
         </w:rPr>
+        <w:drawing>
+          <wp:anchor distT="0" distB="0" distL="114300" distR="114300" simplePos="0" relativeHeight="251707392" behindDoc="1" locked="0" layoutInCell="1" allowOverlap="1" wp14:anchorId="41D1A1B9" wp14:editId="33176DBC">
+            <wp:simplePos x="0" y="0"/>
+            <wp:positionH relativeFrom="margin">
+              <wp:posOffset>417195</wp:posOffset>
+            </wp:positionH>
+            <wp:positionV relativeFrom="page">
+              <wp:posOffset>8458623</wp:posOffset>
+            </wp:positionV>
+            <wp:extent cx="1784985" cy="1197610"/>
+            <wp:effectExtent l="0" t="0" r="5715" b="2540"/>
+            <wp:wrapNone/>
+            <wp:docPr id="31" name="Image 31" descr="Une image contenant véhicule, Véhicule terrestre, voiture, dessin humoristique&#10;&#10;Description générée automatiquement"/>
+            <wp:cNvGraphicFramePr>
+              <a:graphicFrameLocks xmlns:a="http://schemas.openxmlformats.org/drawingml/2006/main" noChangeAspect="1"/>
+            </wp:cNvGraphicFramePr>
+            <a:graphic xmlns:a="http://schemas.openxmlformats.org/drawingml/2006/main">
+              <a:graphicData uri="http://schemas.openxmlformats.org/drawingml/2006/picture">
+                <pic:pic xmlns:pic="http://schemas.openxmlformats.org/drawingml/2006/picture">
+                  <pic:nvPicPr>
+                    <pic:cNvPr id="30" name="Image 30" descr="Une image contenant véhicule, Véhicule terrestre, voiture, dessin humoristique&#10;&#10;Description générée automatiquement"/>
+                    <pic:cNvPicPr/>
+                  </pic:nvPicPr>
+                  <pic:blipFill>
+                    <a:blip r:embed="rId6" cstate="print">
+                      <a:extLst>
+                        <a:ext uri="{28A0092B-C50C-407E-A947-70E740481C1C}">
+                          <a14:useLocalDpi xmlns:a14="http://schemas.microsoft.com/office/drawing/2010/main" val="0"/>
+                        </a:ext>
+                      </a:extLst>
+                    </a:blip>
+                    <a:stretch>
+                      <a:fillRect/>
+                    </a:stretch>
+                  </pic:blipFill>
+                  <pic:spPr>
+                    <a:xfrm>
+                      <a:off x="0" y="0"/>
+                      <a:ext cx="1784985" cy="1197610"/>
+                    </a:xfrm>
+                    <a:prstGeom prst="rect">
+                      <a:avLst/>
+                    </a:prstGeom>
+                  </pic:spPr>
+                </pic:pic>
+              </a:graphicData>
+            </a:graphic>
+            <wp14:sizeRelH relativeFrom="page">
+              <wp14:pctWidth>0</wp14:pctWidth>
+            </wp14:sizeRelH>
+            <wp14:sizeRelV relativeFrom="page">
+              <wp14:pctHeight>0</wp14:pctHeight>
+            </wp14:sizeRelV>
+          </wp:anchor>
+        </w:drawing>
+      </w:r>
+      <w:r>
+        <w:rPr>
+          <w:noProof/>
+        </w:rPr>
+        <w:drawing>
+          <wp:anchor distT="0" distB="0" distL="114300" distR="114300" simplePos="0" relativeHeight="251705344" behindDoc="1" locked="0" layoutInCell="1" allowOverlap="1" wp14:anchorId="20154DED" wp14:editId="283509B1">
+            <wp:simplePos x="0" y="0"/>
+            <wp:positionH relativeFrom="margin">
+              <wp:posOffset>424180</wp:posOffset>
+            </wp:positionH>
+            <wp:positionV relativeFrom="page">
+              <wp:posOffset>5866402</wp:posOffset>
+            </wp:positionV>
+            <wp:extent cx="1784985" cy="1197610"/>
+            <wp:effectExtent l="0" t="0" r="5715" b="2540"/>
+            <wp:wrapNone/>
+            <wp:docPr id="30" name="Image 30" descr="Une image contenant véhicule, Véhicule terrestre, voiture, dessin humoristique&#10;&#10;Description générée automatiquement"/>
+            <wp:cNvGraphicFramePr>
+              <a:graphicFrameLocks xmlns:a="http://schemas.openxmlformats.org/drawingml/2006/main" noChangeAspect="1"/>
+            </wp:cNvGraphicFramePr>
+            <a:graphic xmlns:a="http://schemas.openxmlformats.org/drawingml/2006/main">
+              <a:graphicData uri="http://schemas.openxmlformats.org/drawingml/2006/picture">
+                <pic:pic xmlns:pic="http://schemas.openxmlformats.org/drawingml/2006/picture">
+                  <pic:nvPicPr>
+                    <pic:cNvPr id="30" name="Image 30" descr="Une image contenant véhicule, Véhicule terrestre, voiture, dessin humoristique&#10;&#10;Description générée automatiquement"/>
+                    <pic:cNvPicPr/>
+                  </pic:nvPicPr>
+                  <pic:blipFill>
+                    <a:blip r:embed="rId6" cstate="print">
+                      <a:extLst>
+                        <a:ext uri="{28A0092B-C50C-407E-A947-70E740481C1C}">
+                          <a14:useLocalDpi xmlns:a14="http://schemas.microsoft.com/office/drawing/2010/main" val="0"/>
+                        </a:ext>
+                      </a:extLst>
+                    </a:blip>
+                    <a:stretch>
+                      <a:fillRect/>
+                    </a:stretch>
+                  </pic:blipFill>
+                  <pic:spPr>
+                    <a:xfrm>
+                      <a:off x="0" y="0"/>
+                      <a:ext cx="1784985" cy="1197610"/>
+                    </a:xfrm>
+                    <a:prstGeom prst="rect">
+                      <a:avLst/>
+                    </a:prstGeom>
+                  </pic:spPr>
+                </pic:pic>
+              </a:graphicData>
+            </a:graphic>
+            <wp14:sizeRelH relativeFrom="page">
+              <wp14:pctWidth>0</wp14:pctWidth>
+            </wp14:sizeRelH>
+            <wp14:sizeRelV relativeFrom="page">
+              <wp14:pctHeight>0</wp14:pctHeight>
+            </wp14:sizeRelV>
+          </wp:anchor>
+        </w:drawing>
+      </w:r>
+      <w:r>
+        <w:rPr>
+          <w:noProof/>
+        </w:rPr>
+        <w:drawing>
+          <wp:anchor distT="0" distB="0" distL="114300" distR="114300" simplePos="0" relativeHeight="251703296" behindDoc="1" locked="0" layoutInCell="1" allowOverlap="1" wp14:anchorId="3A529F4B" wp14:editId="7F670B2A">
+            <wp:simplePos x="0" y="0"/>
+            <wp:positionH relativeFrom="margin">
+              <wp:posOffset>425450</wp:posOffset>
+            </wp:positionH>
+            <wp:positionV relativeFrom="page">
+              <wp:posOffset>3276419</wp:posOffset>
+            </wp:positionV>
+            <wp:extent cx="1784985" cy="1197610"/>
+            <wp:effectExtent l="0" t="0" r="5715" b="2540"/>
+            <wp:wrapNone/>
+            <wp:docPr id="11" name="Image 11"/>
+            <wp:cNvGraphicFramePr>
+              <a:graphicFrameLocks xmlns:a="http://schemas.openxmlformats.org/drawingml/2006/main" noChangeAspect="1"/>
+            </wp:cNvGraphicFramePr>
+            <a:graphic xmlns:a="http://schemas.openxmlformats.org/drawingml/2006/main">
+              <a:graphicData uri="http://schemas.openxmlformats.org/drawingml/2006/picture">
+                <pic:pic xmlns:pic="http://schemas.openxmlformats.org/drawingml/2006/picture">
+                  <pic:nvPicPr>
+                    <pic:cNvPr id="5" name="Image 5"/>
+                    <pic:cNvPicPr/>
+                  </pic:nvPicPr>
+                  <pic:blipFill>
+                    <a:blip r:embed="rId6" cstate="print">
+                      <a:extLst>
+                        <a:ext uri="{28A0092B-C50C-407E-A947-70E740481C1C}">
+                          <a14:useLocalDpi xmlns:a14="http://schemas.microsoft.com/office/drawing/2010/main" val="0"/>
+                        </a:ext>
+                      </a:extLst>
+                    </a:blip>
+                    <a:stretch>
+                      <a:fillRect/>
+                    </a:stretch>
+                  </pic:blipFill>
+                  <pic:spPr>
+                    <a:xfrm>
+                      <a:off x="0" y="0"/>
+                      <a:ext cx="1784985" cy="1197610"/>
+                    </a:xfrm>
+                    <a:prstGeom prst="rect">
+                      <a:avLst/>
+                    </a:prstGeom>
+                  </pic:spPr>
+                </pic:pic>
+              </a:graphicData>
+            </a:graphic>
+            <wp14:sizeRelH relativeFrom="page">
+              <wp14:pctWidth>0</wp14:pctWidth>
+            </wp14:sizeRelH>
+            <wp14:sizeRelV relativeFrom="page">
+              <wp14:pctHeight>0</wp14:pctHeight>
+            </wp14:sizeRelV>
+          </wp:anchor>
+        </w:drawing>
+      </w:r>
+      <w:r>
+        <w:rPr>
+          <w:noProof/>
+        </w:rPr>
         <mc:AlternateContent>
           <mc:Choice Requires="wps">
             <w:drawing>
-              <wp:anchor distT="0" distB="0" distL="114300" distR="114300" simplePos="0" relativeHeight="251685888" behindDoc="0" locked="0" layoutInCell="1" allowOverlap="1" wp14:anchorId="769C8E11" wp14:editId="41541E0F">
+              <wp:anchor distT="0" distB="0" distL="114300" distR="114300" simplePos="0" relativeHeight="251701248" behindDoc="0" locked="0" layoutInCell="1" allowOverlap="1" wp14:anchorId="1AF42294" wp14:editId="097D2982">
                 <wp:simplePos x="0" y="0"/>
                 <wp:positionH relativeFrom="column">
-                  <wp:posOffset>430530</wp:posOffset>
+                  <wp:posOffset>2179955</wp:posOffset>
                 </wp:positionH>
                 <wp:positionV relativeFrom="paragraph">
-                  <wp:posOffset>7972425</wp:posOffset>
+                  <wp:posOffset>7802880</wp:posOffset>
                 </wp:positionV>
                 <wp:extent cx="1828800" cy="1828800"/>
-                <wp:effectExtent l="0" t="0" r="0" b="5080"/>
+                <wp:effectExtent l="0" t="0" r="0" b="4445"/>
                 <wp:wrapNone/>
-                <wp:docPr id="25" name="Zone de texte 25"/>
+                <wp:docPr id="9" name="Zone de texte 9"/>
                 <wp:cNvGraphicFramePr/>
                 <a:graphic xmlns:a="http://schemas.openxmlformats.org/drawingml/2006/main">
                   <a:graphicData uri="http://schemas.microsoft.com/office/word/2010/wordprocessingShape">
@@ -597,8 +674,8 @@
                                 <w:b/>
                                 <w:noProof/>
                                 <w:color w:val="ED7D31" w:themeColor="accent2"/>
-                                <w:sz w:val="64"/>
-                                <w:szCs w:val="64"/>
+                                <w:sz w:val="56"/>
+                                <w:szCs w:val="56"/>
                                 <w14:textOutline w14:w="9525" w14:cap="flat" w14:cmpd="sng" w14:algn="ctr">
                                   <w14:solidFill>
                                     <w14:schemeClr w14:val="tx1"/>
@@ -617,8 +694,8 @@
                                 <w:b/>
                                 <w:noProof/>
                                 <w:color w:val="ED7D31" w:themeColor="accent2"/>
-                                <w:sz w:val="64"/>
-                                <w:szCs w:val="64"/>
+                                <w:sz w:val="56"/>
+                                <w:szCs w:val="56"/>
                                 <w14:textOutline w14:w="9525" w14:cap="flat" w14:cmpd="sng" w14:algn="ctr">
                                   <w14:solidFill>
                                     <w14:schemeClr w14:val="tx1"/>
@@ -630,16 +707,19 @@
                                   <w14:bevelT w14:w="25400" w14:h="38100" w14:prst="circle"/>
                                 </w14:props3d>
                               </w:rPr>
-                              <w:t>Théâtre</w:t>
+                              <w:t>Soirée théâtre</w:t>
                             </w:r>
-                            <w:r>
+                          </w:p>
+                          <w:p>
+                            <w:pPr>
+                              <w:jc w:val="center"/>
                               <w:rPr>
                                 <w:rFonts w:ascii="Bodoni MT" w:hAnsi="Bodoni MT"/>
                                 <w:b/>
                                 <w:noProof/>
                                 <w:color w:val="ED7D31" w:themeColor="accent2"/>
-                                <w:sz w:val="64"/>
-                                <w:szCs w:val="64"/>
+                                <w:sz w:val="56"/>
+                                <w:szCs w:val="56"/>
                                 <w14:textOutline w14:w="9525" w14:cap="flat" w14:cmpd="sng" w14:algn="ctr">
                                   <w14:solidFill>
                                     <w14:schemeClr w14:val="tx1"/>
@@ -651,7 +731,777 @@
                                   <w14:bevelT w14:w="25400" w14:h="38100" w14:prst="circle"/>
                                 </w14:props3d>
                               </w:rPr>
-                              <w:t xml:space="preserve"> l</w:t>
+                            </w:pPr>
+                            <w:r>
+                              <w:rPr>
+                                <w:rFonts w:ascii="Bodoni MT" w:hAnsi="Bodoni MT"/>
+                                <w:b/>
+                                <w:noProof/>
+                                <w:color w:val="ED7D31" w:themeColor="accent2"/>
+                                <w:sz w:val="56"/>
+                                <w:szCs w:val="56"/>
+                                <w14:textOutline w14:w="9525" w14:cap="flat" w14:cmpd="sng" w14:algn="ctr">
+                                  <w14:solidFill>
+                                    <w14:schemeClr w14:val="tx1"/>
+                                  </w14:solidFill>
+                                  <w14:prstDash w14:val="solid"/>
+                                  <w14:round/>
+                                </w14:textOutline>
+                                <w14:props3d w14:extrusionH="57150" w14:contourW="0" w14:prstMaterial="softEdge">
+                                  <w14:bevelT w14:w="25400" w14:h="38100" w14:prst="circle"/>
+                                </w14:props3d>
+                              </w:rPr>
+                              <w:t>le 24 juin 2026</w:t>
+                            </w:r>
+                          </w:p>
+                        </w:txbxContent>
+                      </wps:txbx>
+                      <wps:bodyPr rot="0" spcFirstLastPara="0" vertOverflow="overflow" horzOverflow="overflow" vert="horz" wrap="none" lIns="91440" tIns="45720" rIns="91440" bIns="45720" numCol="1" spcCol="0" rtlCol="0" fromWordArt="0" anchor="t" anchorCtr="0" forceAA="0" compatLnSpc="1">
+                        <a:prstTxWarp prst="textNoShape">
+                          <a:avLst/>
+                        </a:prstTxWarp>
+                        <a:spAutoFit/>
+                        <a:scene3d>
+                          <a:camera prst="orthographicFront"/>
+                          <a:lightRig rig="soft" dir="t">
+                            <a:rot lat="0" lon="0" rev="15600000"/>
+                          </a:lightRig>
+                        </a:scene3d>
+                        <a:sp3d extrusionH="57150" prstMaterial="softEdge">
+                          <a:bevelT w="25400" h="38100"/>
+                        </a:sp3d>
+                      </wps:bodyPr>
+                    </wps:wsp>
+                  </a:graphicData>
+                </a:graphic>
+              </wp:anchor>
+            </w:drawing>
+          </mc:Choice>
+          <mc:Fallback>
+            <w:pict>
+              <v:shape w14:anchorId="1AF42294" id="Zone de texte 9" o:spid="_x0000_s1028" type="#_x0000_t202" style="position:absolute;margin-left:171.65pt;margin-top:614.4pt;width:2in;height:2in;z-index:251701248;visibility:visible;mso-wrap-style:none;mso-wrap-distance-left:9pt;mso-wrap-distance-top:0;mso-wrap-distance-right:9pt;mso-wrap-distance-bottom:0;mso-position-horizontal:absolute;mso-position-horizontal-relative:text;mso-position-vertical:absolute;mso-position-vertical-relative:text;v-text-anchor:top" o:gfxdata="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" filled="f" stroked="f">
+                <v:textbox style="mso-fit-shape-to-text:t">
+                  <w:txbxContent>
+                    <w:p>
+                      <w:pPr>
+                        <w:jc w:val="center"/>
+                        <w:rPr>
+                          <w:rFonts w:ascii="Bodoni MT" w:hAnsi="Bodoni MT"/>
+                          <w:b/>
+                          <w:noProof/>
+                          <w:color w:val="ED7D31" w:themeColor="accent2"/>
+                          <w:sz w:val="56"/>
+                          <w:szCs w:val="56"/>
+                          <w14:textOutline w14:w="9525" w14:cap="flat" w14:cmpd="sng" w14:algn="ctr">
+                            <w14:solidFill>
+                              <w14:schemeClr w14:val="tx1"/>
+                            </w14:solidFill>
+                            <w14:prstDash w14:val="solid"/>
+                            <w14:round/>
+                          </w14:textOutline>
+                          <w14:props3d w14:extrusionH="57150" w14:contourW="0" w14:prstMaterial="softEdge">
+                            <w14:bevelT w14:w="25400" w14:h="38100" w14:prst="circle"/>
+                          </w14:props3d>
+                        </w:rPr>
+                      </w:pPr>
+                      <w:r>
+                        <w:rPr>
+                          <w:rFonts w:ascii="Bodoni MT" w:hAnsi="Bodoni MT"/>
+                          <w:b/>
+                          <w:noProof/>
+                          <w:color w:val="ED7D31" w:themeColor="accent2"/>
+                          <w:sz w:val="56"/>
+                          <w:szCs w:val="56"/>
+                          <w14:textOutline w14:w="9525" w14:cap="flat" w14:cmpd="sng" w14:algn="ctr">
+                            <w14:solidFill>
+                              <w14:schemeClr w14:val="tx1"/>
+                            </w14:solidFill>
+                            <w14:prstDash w14:val="solid"/>
+                            <w14:round/>
+                          </w14:textOutline>
+                          <w14:props3d w14:extrusionH="57150" w14:contourW="0" w14:prstMaterial="softEdge">
+                            <w14:bevelT w14:w="25400" w14:h="38100" w14:prst="circle"/>
+                          </w14:props3d>
+                        </w:rPr>
+                        <w:t>Soirée théâtre</w:t>
+                      </w:r>
+                    </w:p>
+                    <w:p>
+                      <w:pPr>
+                        <w:jc w:val="center"/>
+                        <w:rPr>
+                          <w:rFonts w:ascii="Bodoni MT" w:hAnsi="Bodoni MT"/>
+                          <w:b/>
+                          <w:noProof/>
+                          <w:color w:val="ED7D31" w:themeColor="accent2"/>
+                          <w:sz w:val="56"/>
+                          <w:szCs w:val="56"/>
+                          <w14:textOutline w14:w="9525" w14:cap="flat" w14:cmpd="sng" w14:algn="ctr">
+                            <w14:solidFill>
+                              <w14:schemeClr w14:val="tx1"/>
+                            </w14:solidFill>
+                            <w14:prstDash w14:val="solid"/>
+                            <w14:round/>
+                          </w14:textOutline>
+                          <w14:props3d w14:extrusionH="57150" w14:contourW="0" w14:prstMaterial="softEdge">
+                            <w14:bevelT w14:w="25400" w14:h="38100" w14:prst="circle"/>
+                          </w14:props3d>
+                        </w:rPr>
+                      </w:pPr>
+                      <w:r>
+                        <w:rPr>
+                          <w:rFonts w:ascii="Bodoni MT" w:hAnsi="Bodoni MT"/>
+                          <w:b/>
+                          <w:noProof/>
+                          <w:color w:val="ED7D31" w:themeColor="accent2"/>
+                          <w:sz w:val="56"/>
+                          <w:szCs w:val="56"/>
+                          <w14:textOutline w14:w="9525" w14:cap="flat" w14:cmpd="sng" w14:algn="ctr">
+                            <w14:solidFill>
+                              <w14:schemeClr w14:val="tx1"/>
+                            </w14:solidFill>
+                            <w14:prstDash w14:val="solid"/>
+                            <w14:round/>
+                          </w14:textOutline>
+                          <w14:props3d w14:extrusionH="57150" w14:contourW="0" w14:prstMaterial="softEdge">
+                            <w14:bevelT w14:w="25400" w14:h="38100" w14:prst="circle"/>
+                          </w14:props3d>
+                        </w:rPr>
+                        <w:t>le 24 juin 2026</w:t>
+                      </w:r>
+                    </w:p>
+                  </w:txbxContent>
+                </v:textbox>
+              </v:shape>
+            </w:pict>
+          </mc:Fallback>
+        </mc:AlternateContent>
+      </w:r>
+      <w:r>
+        <w:rPr>
+          <w:noProof/>
+        </w:rPr>
+        <mc:AlternateContent>
+          <mc:Choice Requires="wps">
+            <w:drawing>
+              <wp:anchor distT="0" distB="0" distL="114300" distR="114300" simplePos="0" relativeHeight="251699200" behindDoc="0" locked="0" layoutInCell="1" allowOverlap="1" wp14:anchorId="73D478AD" wp14:editId="51F3D950">
+                <wp:simplePos x="0" y="0"/>
+                <wp:positionH relativeFrom="column">
+                  <wp:posOffset>2179955</wp:posOffset>
+                </wp:positionH>
+                <wp:positionV relativeFrom="paragraph">
+                  <wp:posOffset>5201920</wp:posOffset>
+                </wp:positionV>
+                <wp:extent cx="1828800" cy="1828800"/>
+                <wp:effectExtent l="0" t="0" r="0" b="4445"/>
+                <wp:wrapNone/>
+                <wp:docPr id="8" name="Zone de texte 8"/>
+                <wp:cNvGraphicFramePr/>
+                <a:graphic xmlns:a="http://schemas.openxmlformats.org/drawingml/2006/main">
+                  <a:graphicData uri="http://schemas.microsoft.com/office/word/2010/wordprocessingShape">
+                    <wps:wsp>
+                      <wps:cNvSpPr txBox="1"/>
+                      <wps:spPr>
+                        <a:xfrm>
+                          <a:off x="0" y="0"/>
+                          <a:ext cx="1828800" cy="1828800"/>
+                        </a:xfrm>
+                        <a:prstGeom prst="rect">
+                          <a:avLst/>
+                        </a:prstGeom>
+                        <a:noFill/>
+                        <a:ln>
+                          <a:noFill/>
+                        </a:ln>
+                      </wps:spPr>
+                      <wps:txbx>
+                        <w:txbxContent>
+                          <w:p>
+                            <w:pPr>
+                              <w:jc w:val="center"/>
+                              <w:rPr>
+                                <w:rFonts w:ascii="Bodoni MT" w:hAnsi="Bodoni MT"/>
+                                <w:b/>
+                                <w:noProof/>
+                                <w:color w:val="ED7D31" w:themeColor="accent2"/>
+                                <w:sz w:val="56"/>
+                                <w:szCs w:val="56"/>
+                                <w14:textOutline w14:w="9525" w14:cap="flat" w14:cmpd="sng" w14:algn="ctr">
+                                  <w14:solidFill>
+                                    <w14:schemeClr w14:val="tx1"/>
+                                  </w14:solidFill>
+                                  <w14:prstDash w14:val="solid"/>
+                                  <w14:round/>
+                                </w14:textOutline>
+                                <w14:props3d w14:extrusionH="57150" w14:contourW="0" w14:prstMaterial="softEdge">
+                                  <w14:bevelT w14:w="25400" w14:h="38100" w14:prst="circle"/>
+                                </w14:props3d>
+                              </w:rPr>
+                            </w:pPr>
+                            <w:r>
+                              <w:rPr>
+                                <w:rFonts w:ascii="Bodoni MT" w:hAnsi="Bodoni MT"/>
+                                <w:b/>
+                                <w:noProof/>
+                                <w:color w:val="ED7D31" w:themeColor="accent2"/>
+                                <w:sz w:val="56"/>
+                                <w:szCs w:val="56"/>
+                                <w14:textOutline w14:w="9525" w14:cap="flat" w14:cmpd="sng" w14:algn="ctr">
+                                  <w14:solidFill>
+                                    <w14:schemeClr w14:val="tx1"/>
+                                  </w14:solidFill>
+                                  <w14:prstDash w14:val="solid"/>
+                                  <w14:round/>
+                                </w14:textOutline>
+                                <w14:props3d w14:extrusionH="57150" w14:contourW="0" w14:prstMaterial="softEdge">
+                                  <w14:bevelT w14:w="25400" w14:h="38100" w14:prst="circle"/>
+                                </w14:props3d>
+                              </w:rPr>
+                              <w:t>Soirée théâtre</w:t>
+                            </w:r>
+                          </w:p>
+                          <w:p>
+                            <w:pPr>
+                              <w:jc w:val="center"/>
+                              <w:rPr>
+                                <w:rFonts w:ascii="Bodoni MT" w:hAnsi="Bodoni MT"/>
+                                <w:b/>
+                                <w:noProof/>
+                                <w:color w:val="ED7D31" w:themeColor="accent2"/>
+                                <w:sz w:val="56"/>
+                                <w:szCs w:val="56"/>
+                                <w14:textOutline w14:w="9525" w14:cap="flat" w14:cmpd="sng" w14:algn="ctr">
+                                  <w14:solidFill>
+                                    <w14:schemeClr w14:val="tx1"/>
+                                  </w14:solidFill>
+                                  <w14:prstDash w14:val="solid"/>
+                                  <w14:round/>
+                                </w14:textOutline>
+                                <w14:props3d w14:extrusionH="57150" w14:contourW="0" w14:prstMaterial="softEdge">
+                                  <w14:bevelT w14:w="25400" w14:h="38100" w14:prst="circle"/>
+                                </w14:props3d>
+                              </w:rPr>
+                            </w:pPr>
+                            <w:r>
+                              <w:rPr>
+                                <w:rFonts w:ascii="Bodoni MT" w:hAnsi="Bodoni MT"/>
+                                <w:b/>
+                                <w:noProof/>
+                                <w:color w:val="ED7D31" w:themeColor="accent2"/>
+                                <w:sz w:val="56"/>
+                                <w:szCs w:val="56"/>
+                                <w14:textOutline w14:w="9525" w14:cap="flat" w14:cmpd="sng" w14:algn="ctr">
+                                  <w14:solidFill>
+                                    <w14:schemeClr w14:val="tx1"/>
+                                  </w14:solidFill>
+                                  <w14:prstDash w14:val="solid"/>
+                                  <w14:round/>
+                                </w14:textOutline>
+                                <w14:props3d w14:extrusionH="57150" w14:contourW="0" w14:prstMaterial="softEdge">
+                                  <w14:bevelT w14:w="25400" w14:h="38100" w14:prst="circle"/>
+                                </w14:props3d>
+                              </w:rPr>
+                              <w:t>le 24 juin 2026</w:t>
+                            </w:r>
+                          </w:p>
+                        </w:txbxContent>
+                      </wps:txbx>
+                      <wps:bodyPr rot="0" spcFirstLastPara="0" vertOverflow="overflow" horzOverflow="overflow" vert="horz" wrap="none" lIns="91440" tIns="45720" rIns="91440" bIns="45720" numCol="1" spcCol="0" rtlCol="0" fromWordArt="0" anchor="t" anchorCtr="0" forceAA="0" compatLnSpc="1">
+                        <a:prstTxWarp prst="textNoShape">
+                          <a:avLst/>
+                        </a:prstTxWarp>
+                        <a:spAutoFit/>
+                        <a:scene3d>
+                          <a:camera prst="orthographicFront"/>
+                          <a:lightRig rig="soft" dir="t">
+                            <a:rot lat="0" lon="0" rev="15600000"/>
+                          </a:lightRig>
+                        </a:scene3d>
+                        <a:sp3d extrusionH="57150" prstMaterial="softEdge">
+                          <a:bevelT w="25400" h="38100"/>
+                        </a:sp3d>
+                      </wps:bodyPr>
+                    </wps:wsp>
+                  </a:graphicData>
+                </a:graphic>
+              </wp:anchor>
+            </w:drawing>
+          </mc:Choice>
+          <mc:Fallback>
+            <w:pict>
+              <v:shape w14:anchorId="73D478AD" id="Zone de texte 8" o:spid="_x0000_s1029" type="#_x0000_t202" style="position:absolute;margin-left:171.65pt;margin-top:409.6pt;width:2in;height:2in;z-index:251699200;visibility:visible;mso-wrap-style:none;mso-wrap-distance-left:9pt;mso-wrap-distance-top:0;mso-wrap-distance-right:9pt;mso-wrap-distance-bottom:0;mso-position-horizontal:absolute;mso-position-horizontal-relative:text;mso-position-vertical:absolute;mso-position-vertical-relative:text;v-text-anchor:top" o:gfxdata="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" filled="f" stroked="f">
+                <v:textbox style="mso-fit-shape-to-text:t">
+                  <w:txbxContent>
+                    <w:p>
+                      <w:pPr>
+                        <w:jc w:val="center"/>
+                        <w:rPr>
+                          <w:rFonts w:ascii="Bodoni MT" w:hAnsi="Bodoni MT"/>
+                          <w:b/>
+                          <w:noProof/>
+                          <w:color w:val="ED7D31" w:themeColor="accent2"/>
+                          <w:sz w:val="56"/>
+                          <w:szCs w:val="56"/>
+                          <w14:textOutline w14:w="9525" w14:cap="flat" w14:cmpd="sng" w14:algn="ctr">
+                            <w14:solidFill>
+                              <w14:schemeClr w14:val="tx1"/>
+                            </w14:solidFill>
+                            <w14:prstDash w14:val="solid"/>
+                            <w14:round/>
+                          </w14:textOutline>
+                          <w14:props3d w14:extrusionH="57150" w14:contourW="0" w14:prstMaterial="softEdge">
+                            <w14:bevelT w14:w="25400" w14:h="38100" w14:prst="circle"/>
+                          </w14:props3d>
+                        </w:rPr>
+                      </w:pPr>
+                      <w:r>
+                        <w:rPr>
+                          <w:rFonts w:ascii="Bodoni MT" w:hAnsi="Bodoni MT"/>
+                          <w:b/>
+                          <w:noProof/>
+                          <w:color w:val="ED7D31" w:themeColor="accent2"/>
+                          <w:sz w:val="56"/>
+                          <w:szCs w:val="56"/>
+                          <w14:textOutline w14:w="9525" w14:cap="flat" w14:cmpd="sng" w14:algn="ctr">
+                            <w14:solidFill>
+                              <w14:schemeClr w14:val="tx1"/>
+                            </w14:solidFill>
+                            <w14:prstDash w14:val="solid"/>
+                            <w14:round/>
+                          </w14:textOutline>
+                          <w14:props3d w14:extrusionH="57150" w14:contourW="0" w14:prstMaterial="softEdge">
+                            <w14:bevelT w14:w="25400" w14:h="38100" w14:prst="circle"/>
+                          </w14:props3d>
+                        </w:rPr>
+                        <w:t>Soirée théâtre</w:t>
+                      </w:r>
+                    </w:p>
+                    <w:p>
+                      <w:pPr>
+                        <w:jc w:val="center"/>
+                        <w:rPr>
+                          <w:rFonts w:ascii="Bodoni MT" w:hAnsi="Bodoni MT"/>
+                          <w:b/>
+                          <w:noProof/>
+                          <w:color w:val="ED7D31" w:themeColor="accent2"/>
+                          <w:sz w:val="56"/>
+                          <w:szCs w:val="56"/>
+                          <w14:textOutline w14:w="9525" w14:cap="flat" w14:cmpd="sng" w14:algn="ctr">
+                            <w14:solidFill>
+                              <w14:schemeClr w14:val="tx1"/>
+                            </w14:solidFill>
+                            <w14:prstDash w14:val="solid"/>
+                            <w14:round/>
+                          </w14:textOutline>
+                          <w14:props3d w14:extrusionH="57150" w14:contourW="0" w14:prstMaterial="softEdge">
+                            <w14:bevelT w14:w="25400" w14:h="38100" w14:prst="circle"/>
+                          </w14:props3d>
+                        </w:rPr>
+                      </w:pPr>
+                      <w:r>
+                        <w:rPr>
+                          <w:rFonts w:ascii="Bodoni MT" w:hAnsi="Bodoni MT"/>
+                          <w:b/>
+                          <w:noProof/>
+                          <w:color w:val="ED7D31" w:themeColor="accent2"/>
+                          <w:sz w:val="56"/>
+                          <w:szCs w:val="56"/>
+                          <w14:textOutline w14:w="9525" w14:cap="flat" w14:cmpd="sng" w14:algn="ctr">
+                            <w14:solidFill>
+                              <w14:schemeClr w14:val="tx1"/>
+                            </w14:solidFill>
+                            <w14:prstDash w14:val="solid"/>
+                            <w14:round/>
+                          </w14:textOutline>
+                          <w14:props3d w14:extrusionH="57150" w14:contourW="0" w14:prstMaterial="softEdge">
+                            <w14:bevelT w14:w="25400" w14:h="38100" w14:prst="circle"/>
+                          </w14:props3d>
+                        </w:rPr>
+                        <w:t>le 24 juin 2026</w:t>
+                      </w:r>
+                    </w:p>
+                  </w:txbxContent>
+                </v:textbox>
+              </v:shape>
+            </w:pict>
+          </mc:Fallback>
+        </mc:AlternateContent>
+      </w:r>
+      <w:r>
+        <w:rPr>
+          <w:noProof/>
+        </w:rPr>
+        <mc:AlternateContent>
+          <mc:Choice Requires="wps">
+            <w:drawing>
+              <wp:anchor distT="0" distB="0" distL="114300" distR="114300" simplePos="0" relativeHeight="251697152" behindDoc="0" locked="0" layoutInCell="1" allowOverlap="1" wp14:anchorId="388BC8E6" wp14:editId="1FB7EA30">
+                <wp:simplePos x="0" y="0"/>
+                <wp:positionH relativeFrom="column">
+                  <wp:posOffset>2179955</wp:posOffset>
+                </wp:positionH>
+                <wp:positionV relativeFrom="paragraph">
+                  <wp:posOffset>2606040</wp:posOffset>
+                </wp:positionV>
+                <wp:extent cx="1828800" cy="1828800"/>
+                <wp:effectExtent l="0" t="0" r="0" b="4445"/>
+                <wp:wrapNone/>
+                <wp:docPr id="7" name="Zone de texte 7"/>
+                <wp:cNvGraphicFramePr/>
+                <a:graphic xmlns:a="http://schemas.openxmlformats.org/drawingml/2006/main">
+                  <a:graphicData uri="http://schemas.microsoft.com/office/word/2010/wordprocessingShape">
+                    <wps:wsp>
+                      <wps:cNvSpPr txBox="1"/>
+                      <wps:spPr>
+                        <a:xfrm>
+                          <a:off x="0" y="0"/>
+                          <a:ext cx="1828800" cy="1828800"/>
+                        </a:xfrm>
+                        <a:prstGeom prst="rect">
+                          <a:avLst/>
+                        </a:prstGeom>
+                        <a:noFill/>
+                        <a:ln>
+                          <a:noFill/>
+                        </a:ln>
+                      </wps:spPr>
+                      <wps:txbx>
+                        <w:txbxContent>
+                          <w:p>
+                            <w:pPr>
+                              <w:jc w:val="center"/>
+                              <w:rPr>
+                                <w:rFonts w:ascii="Bodoni MT" w:hAnsi="Bodoni MT"/>
+                                <w:b/>
+                                <w:noProof/>
+                                <w:color w:val="ED7D31" w:themeColor="accent2"/>
+                                <w:sz w:val="56"/>
+                                <w:szCs w:val="56"/>
+                                <w14:textOutline w14:w="9525" w14:cap="flat" w14:cmpd="sng" w14:algn="ctr">
+                                  <w14:solidFill>
+                                    <w14:schemeClr w14:val="tx1"/>
+                                  </w14:solidFill>
+                                  <w14:prstDash w14:val="solid"/>
+                                  <w14:round/>
+                                </w14:textOutline>
+                                <w14:props3d w14:extrusionH="57150" w14:contourW="0" w14:prstMaterial="softEdge">
+                                  <w14:bevelT w14:w="25400" w14:h="38100" w14:prst="circle"/>
+                                </w14:props3d>
+                              </w:rPr>
+                            </w:pPr>
+                            <w:r>
+                              <w:rPr>
+                                <w:rFonts w:ascii="Bodoni MT" w:hAnsi="Bodoni MT"/>
+                                <w:b/>
+                                <w:noProof/>
+                                <w:color w:val="ED7D31" w:themeColor="accent2"/>
+                                <w:sz w:val="56"/>
+                                <w:szCs w:val="56"/>
+                                <w14:textOutline w14:w="9525" w14:cap="flat" w14:cmpd="sng" w14:algn="ctr">
+                                  <w14:solidFill>
+                                    <w14:schemeClr w14:val="tx1"/>
+                                  </w14:solidFill>
+                                  <w14:prstDash w14:val="solid"/>
+                                  <w14:round/>
+                                </w14:textOutline>
+                                <w14:props3d w14:extrusionH="57150" w14:contourW="0" w14:prstMaterial="softEdge">
+                                  <w14:bevelT w14:w="25400" w14:h="38100" w14:prst="circle"/>
+                                </w14:props3d>
+                              </w:rPr>
+                              <w:t>Soirée théâtre</w:t>
+                            </w:r>
+                          </w:p>
+                          <w:p>
+                            <w:pPr>
+                              <w:jc w:val="center"/>
+                              <w:rPr>
+                                <w:rFonts w:ascii="Bodoni MT" w:hAnsi="Bodoni MT"/>
+                                <w:b/>
+                                <w:noProof/>
+                                <w:color w:val="ED7D31" w:themeColor="accent2"/>
+                                <w:sz w:val="56"/>
+                                <w:szCs w:val="56"/>
+                                <w14:textOutline w14:w="9525" w14:cap="flat" w14:cmpd="sng" w14:algn="ctr">
+                                  <w14:solidFill>
+                                    <w14:schemeClr w14:val="tx1"/>
+                                  </w14:solidFill>
+                                  <w14:prstDash w14:val="solid"/>
+                                  <w14:round/>
+                                </w14:textOutline>
+                                <w14:props3d w14:extrusionH="57150" w14:contourW="0" w14:prstMaterial="softEdge">
+                                  <w14:bevelT w14:w="25400" w14:h="38100" w14:prst="circle"/>
+                                </w14:props3d>
+                              </w:rPr>
+                            </w:pPr>
+                            <w:r>
+                              <w:rPr>
+                                <w:rFonts w:ascii="Bodoni MT" w:hAnsi="Bodoni MT"/>
+                                <w:b/>
+                                <w:noProof/>
+                                <w:color w:val="ED7D31" w:themeColor="accent2"/>
+                                <w:sz w:val="56"/>
+                                <w:szCs w:val="56"/>
+                                <w14:textOutline w14:w="9525" w14:cap="flat" w14:cmpd="sng" w14:algn="ctr">
+                                  <w14:solidFill>
+                                    <w14:schemeClr w14:val="tx1"/>
+                                  </w14:solidFill>
+                                  <w14:prstDash w14:val="solid"/>
+                                  <w14:round/>
+                                </w14:textOutline>
+                                <w14:props3d w14:extrusionH="57150" w14:contourW="0" w14:prstMaterial="softEdge">
+                                  <w14:bevelT w14:w="25400" w14:h="38100" w14:prst="circle"/>
+                                </w14:props3d>
+                              </w:rPr>
+                              <w:t>le 24 juin 2026</w:t>
+                            </w:r>
+                          </w:p>
+                        </w:txbxContent>
+                      </wps:txbx>
+                      <wps:bodyPr rot="0" spcFirstLastPara="0" vertOverflow="overflow" horzOverflow="overflow" vert="horz" wrap="none" lIns="91440" tIns="45720" rIns="91440" bIns="45720" numCol="1" spcCol="0" rtlCol="0" fromWordArt="0" anchor="t" anchorCtr="0" forceAA="0" compatLnSpc="1">
+                        <a:prstTxWarp prst="textNoShape">
+                          <a:avLst/>
+                        </a:prstTxWarp>
+                        <a:spAutoFit/>
+                        <a:scene3d>
+                          <a:camera prst="orthographicFront"/>
+                          <a:lightRig rig="soft" dir="t">
+                            <a:rot lat="0" lon="0" rev="15600000"/>
+                          </a:lightRig>
+                        </a:scene3d>
+                        <a:sp3d extrusionH="57150" prstMaterial="softEdge">
+                          <a:bevelT w="25400" h="38100"/>
+                        </a:sp3d>
+                      </wps:bodyPr>
+                    </wps:wsp>
+                  </a:graphicData>
+                </a:graphic>
+              </wp:anchor>
+            </w:drawing>
+          </mc:Choice>
+          <mc:Fallback>
+            <w:pict>
+              <v:shape w14:anchorId="388BC8E6" id="Zone de texte 7" o:spid="_x0000_s1030" type="#_x0000_t202" style="position:absolute;margin-left:171.65pt;margin-top:205.2pt;width:2in;height:2in;z-index:251697152;visibility:visible;mso-wrap-style:none;mso-wrap-distance-left:9pt;mso-wrap-distance-top:0;mso-wrap-distance-right:9pt;mso-wrap-distance-bottom:0;mso-position-horizontal:absolute;mso-position-horizontal-relative:text;mso-position-vertical:absolute;mso-position-vertical-relative:text;v-text-anchor:top" o:gfxdata="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" filled="f" stroked="f">
+                <v:textbox style="mso-fit-shape-to-text:t">
+                  <w:txbxContent>
+                    <w:p>
+                      <w:pPr>
+                        <w:jc w:val="center"/>
+                        <w:rPr>
+                          <w:rFonts w:ascii="Bodoni MT" w:hAnsi="Bodoni MT"/>
+                          <w:b/>
+                          <w:noProof/>
+                          <w:color w:val="ED7D31" w:themeColor="accent2"/>
+                          <w:sz w:val="56"/>
+                          <w:szCs w:val="56"/>
+                          <w14:textOutline w14:w="9525" w14:cap="flat" w14:cmpd="sng" w14:algn="ctr">
+                            <w14:solidFill>
+                              <w14:schemeClr w14:val="tx1"/>
+                            </w14:solidFill>
+                            <w14:prstDash w14:val="solid"/>
+                            <w14:round/>
+                          </w14:textOutline>
+                          <w14:props3d w14:extrusionH="57150" w14:contourW="0" w14:prstMaterial="softEdge">
+                            <w14:bevelT w14:w="25400" w14:h="38100" w14:prst="circle"/>
+                          </w14:props3d>
+                        </w:rPr>
+                      </w:pPr>
+                      <w:r>
+                        <w:rPr>
+                          <w:rFonts w:ascii="Bodoni MT" w:hAnsi="Bodoni MT"/>
+                          <w:b/>
+                          <w:noProof/>
+                          <w:color w:val="ED7D31" w:themeColor="accent2"/>
+                          <w:sz w:val="56"/>
+                          <w:szCs w:val="56"/>
+                          <w14:textOutline w14:w="9525" w14:cap="flat" w14:cmpd="sng" w14:algn="ctr">
+                            <w14:solidFill>
+                              <w14:schemeClr w14:val="tx1"/>
+                            </w14:solidFill>
+                            <w14:prstDash w14:val="solid"/>
+                            <w14:round/>
+                          </w14:textOutline>
+                          <w14:props3d w14:extrusionH="57150" w14:contourW="0" w14:prstMaterial="softEdge">
+                            <w14:bevelT w14:w="25400" w14:h="38100" w14:prst="circle"/>
+                          </w14:props3d>
+                        </w:rPr>
+                        <w:t>Soirée théâtre</w:t>
+                      </w:r>
+                    </w:p>
+                    <w:p>
+                      <w:pPr>
+                        <w:jc w:val="center"/>
+                        <w:rPr>
+                          <w:rFonts w:ascii="Bodoni MT" w:hAnsi="Bodoni MT"/>
+                          <w:b/>
+                          <w:noProof/>
+                          <w:color w:val="ED7D31" w:themeColor="accent2"/>
+                          <w:sz w:val="56"/>
+                          <w:szCs w:val="56"/>
+                          <w14:textOutline w14:w="9525" w14:cap="flat" w14:cmpd="sng" w14:algn="ctr">
+                            <w14:solidFill>
+                              <w14:schemeClr w14:val="tx1"/>
+                            </w14:solidFill>
+                            <w14:prstDash w14:val="solid"/>
+                            <w14:round/>
+                          </w14:textOutline>
+                          <w14:props3d w14:extrusionH="57150" w14:contourW="0" w14:prstMaterial="softEdge">
+                            <w14:bevelT w14:w="25400" w14:h="38100" w14:prst="circle"/>
+                          </w14:props3d>
+                        </w:rPr>
+                      </w:pPr>
+                      <w:r>
+                        <w:rPr>
+                          <w:rFonts w:ascii="Bodoni MT" w:hAnsi="Bodoni MT"/>
+                          <w:b/>
+                          <w:noProof/>
+                          <w:color w:val="ED7D31" w:themeColor="accent2"/>
+                          <w:sz w:val="56"/>
+                          <w:szCs w:val="56"/>
+                          <w14:textOutline w14:w="9525" w14:cap="flat" w14:cmpd="sng" w14:algn="ctr">
+                            <w14:solidFill>
+                              <w14:schemeClr w14:val="tx1"/>
+                            </w14:solidFill>
+                            <w14:prstDash w14:val="solid"/>
+                            <w14:round/>
+                          </w14:textOutline>
+                          <w14:props3d w14:extrusionH="57150" w14:contourW="0" w14:prstMaterial="softEdge">
+                            <w14:bevelT w14:w="25400" w14:h="38100" w14:prst="circle"/>
+                          </w14:props3d>
+                        </w:rPr>
+                        <w:t>le 24 juin 2026</w:t>
+                      </w:r>
+                    </w:p>
+                  </w:txbxContent>
+                </v:textbox>
+              </v:shape>
+            </w:pict>
+          </mc:Fallback>
+        </mc:AlternateContent>
+      </w:r>
+      <w:r>
+        <w:rPr>
+          <w:noProof/>
+        </w:rPr>
+        <mc:AlternateContent>
+          <mc:Choice Requires="wps">
+            <w:drawing>
+              <wp:anchor distT="0" distB="0" distL="114300" distR="114300" simplePos="0" relativeHeight="251679744" behindDoc="0" locked="0" layoutInCell="1" allowOverlap="1" wp14:anchorId="601F528C" wp14:editId="5A692F38">
+                <wp:simplePos x="0" y="0"/>
+                <wp:positionH relativeFrom="column">
+                  <wp:posOffset>2177686</wp:posOffset>
+                </wp:positionH>
+                <wp:positionV relativeFrom="paragraph">
+                  <wp:posOffset>9525</wp:posOffset>
+                </wp:positionV>
+                <wp:extent cx="1828800" cy="1828800"/>
+                <wp:effectExtent l="0" t="0" r="0" b="5080"/>
+                <wp:wrapNone/>
+                <wp:docPr id="22" name="Zone de texte 22"/>
+                <wp:cNvGraphicFramePr/>
+                <a:graphic xmlns:a="http://schemas.openxmlformats.org/drawingml/2006/main">
+                  <a:graphicData uri="http://schemas.microsoft.com/office/word/2010/wordprocessingShape">
+                    <wps:wsp>
+                      <wps:cNvSpPr txBox="1"/>
+                      <wps:spPr>
+                        <a:xfrm>
+                          <a:off x="0" y="0"/>
+                          <a:ext cx="1828800" cy="1828800"/>
+                        </a:xfrm>
+                        <a:prstGeom prst="rect">
+                          <a:avLst/>
+                        </a:prstGeom>
+                        <a:noFill/>
+                        <a:ln>
+                          <a:noFill/>
+                        </a:ln>
+                      </wps:spPr>
+                      <wps:txbx>
+                        <w:txbxContent>
+                          <w:p>
+                            <w:pPr>
+                              <w:jc w:val="center"/>
+                              <w:rPr>
+                                <w:rFonts w:ascii="Bodoni MT" w:hAnsi="Bodoni MT"/>
+                                <w:b/>
+                                <w:noProof/>
+                                <w:color w:val="ED7D31" w:themeColor="accent2"/>
+                                <w:sz w:val="56"/>
+                                <w:szCs w:val="56"/>
+                                <w14:textOutline w14:w="9525" w14:cap="flat" w14:cmpd="sng" w14:algn="ctr">
+                                  <w14:solidFill>
+                                    <w14:schemeClr w14:val="tx1"/>
+                                  </w14:solidFill>
+                                  <w14:prstDash w14:val="solid"/>
+                                  <w14:round/>
+                                </w14:textOutline>
+                                <w14:props3d w14:extrusionH="57150" w14:contourW="0" w14:prstMaterial="softEdge">
+                                  <w14:bevelT w14:w="25400" w14:h="38100" w14:prst="circle"/>
+                                </w14:props3d>
+                              </w:rPr>
+                            </w:pPr>
+                            <w:r>
+                              <w:rPr>
+                                <w:rFonts w:ascii="Bodoni MT" w:hAnsi="Bodoni MT"/>
+                                <w:b/>
+                                <w:noProof/>
+                                <w:color w:val="ED7D31" w:themeColor="accent2"/>
+                                <w:sz w:val="56"/>
+                                <w:szCs w:val="56"/>
+                                <w14:textOutline w14:w="9525" w14:cap="flat" w14:cmpd="sng" w14:algn="ctr">
+                                  <w14:solidFill>
+                                    <w14:schemeClr w14:val="tx1"/>
+                                  </w14:solidFill>
+                                  <w14:prstDash w14:val="solid"/>
+                                  <w14:round/>
+                                </w14:textOutline>
+                                <w14:props3d w14:extrusionH="57150" w14:contourW="0" w14:prstMaterial="softEdge">
+                                  <w14:bevelT w14:w="25400" w14:h="38100" w14:prst="circle"/>
+                                </w14:props3d>
+                              </w:rPr>
+                              <w:t>Soirée théâtre</w:t>
+                            </w:r>
+                          </w:p>
+                          <w:p>
+                            <w:pPr>
+                              <w:jc w:val="center"/>
+                              <w:rPr>
+                                <w:rFonts w:ascii="Bodoni MT" w:hAnsi="Bodoni MT"/>
+                                <w:b/>
+                                <w:noProof/>
+                                <w:color w:val="ED7D31" w:themeColor="accent2"/>
+                                <w:sz w:val="56"/>
+                                <w:szCs w:val="56"/>
+                                <w14:textOutline w14:w="9525" w14:cap="flat" w14:cmpd="sng" w14:algn="ctr">
+                                  <w14:solidFill>
+                                    <w14:schemeClr w14:val="tx1"/>
+                                  </w14:solidFill>
+                                  <w14:prstDash w14:val="solid"/>
+                                  <w14:round/>
+                                </w14:textOutline>
+                                <w14:props3d w14:extrusionH="57150" w14:contourW="0" w14:prstMaterial="softEdge">
+                                  <w14:bevelT w14:w="25400" w14:h="38100" w14:prst="circle"/>
+                                </w14:props3d>
+                              </w:rPr>
+                            </w:pPr>
+                            <w:r>
+                              <w:rPr>
+                                <w:rFonts w:ascii="Bodoni MT" w:hAnsi="Bodoni MT"/>
+                                <w:b/>
+                                <w:noProof/>
+                                <w:color w:val="ED7D31" w:themeColor="accent2"/>
+                                <w:sz w:val="56"/>
+                                <w:szCs w:val="56"/>
+                                <w14:textOutline w14:w="9525" w14:cap="flat" w14:cmpd="sng" w14:algn="ctr">
+                                  <w14:solidFill>
+                                    <w14:schemeClr w14:val="tx1"/>
+                                  </w14:solidFill>
+                                  <w14:prstDash w14:val="solid"/>
+                                  <w14:round/>
+                                </w14:textOutline>
+                                <w14:props3d w14:extrusionH="57150" w14:contourW="0" w14:prstMaterial="softEdge">
+                                  <w14:bevelT w14:w="25400" w14:h="38100" w14:prst="circle"/>
+                                </w14:props3d>
+                              </w:rPr>
+                              <w:t>l</w:t>
                             </w:r>
                             <w:r>
                               <w:rPr>
@@ -659,8 +1509,8 @@
                                 <w:b/>
                                 <w:noProof/>
                                 <w:color w:val="ED7D31" w:themeColor="accent2"/>
-                                <w:sz w:val="64"/>
-                                <w:szCs w:val="64"/>
+                                <w:sz w:val="56"/>
+                                <w:szCs w:val="56"/>
                                 <w14:textOutline w14:w="9525" w14:cap="flat" w14:cmpd="sng" w14:algn="ctr">
                                   <w14:solidFill>
                                     <w14:schemeClr w14:val="tx1"/>
@@ -700,7 +1550,7 @@
           </mc:Choice>
           <mc:Fallback>
             <w:pict>
-              <v:shape w14:anchorId="769C8E11" id="Zone de texte 25" o:spid="_x0000_s1028" type="#_x0000_t202" style="position:absolute;margin-left:33.9pt;margin-top:627.75pt;width:2in;height:2in;z-index:251685888;visibility:visible;mso-wrap-style:none;mso-wrap-distance-left:9pt;mso-wrap-distance-top:0;mso-wrap-distance-right:9pt;mso-wrap-distance-bottom:0;mso-position-horizontal:absolute;mso-position-horizontal-relative:text;mso-position-vertical:absolute;mso-position-vertical-relative:text;v-text-anchor:top" o:gfxdata="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" filled="f" stroked="f">
+              <v:shape w14:anchorId="601F528C" id="Zone de texte 22" o:spid="_x0000_s1031" type="#_x0000_t202" style="position:absolute;margin-left:171.45pt;margin-top:.75pt;width:2in;height:2in;z-index:251679744;visibility:visible;mso-wrap-style:none;mso-wrap-distance-left:9pt;mso-wrap-distance-top:0;mso-wrap-distance-right:9pt;mso-wrap-distance-bottom:0;mso-position-horizontal:absolute;mso-position-horizontal-relative:text;mso-position-vertical:absolute;mso-position-vertical-relative:text;v-text-anchor:top" o:gfxdata="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" filled="f" stroked="f">
                 <v:textbox style="mso-fit-shape-to-text:t">
                   <w:txbxContent>
                     <w:p>
@@ -711,8 +1561,8 @@
                           <w:b/>
                           <w:noProof/>
                           <w:color w:val="ED7D31" w:themeColor="accent2"/>
-                          <w:sz w:val="64"/>
-                          <w:szCs w:val="64"/>
+                          <w:sz w:val="56"/>
+                          <w:szCs w:val="56"/>
                           <w14:textOutline w14:w="9525" w14:cap="flat" w14:cmpd="sng" w14:algn="ctr">
                             <w14:solidFill>
                               <w14:schemeClr w14:val="tx1"/>
@@ -731,8 +1581,8 @@
                           <w:b/>
                           <w:noProof/>
                           <w:color w:val="ED7D31" w:themeColor="accent2"/>
-                          <w:sz w:val="64"/>
-                          <w:szCs w:val="64"/>
+                          <w:sz w:val="56"/>
+                          <w:szCs w:val="56"/>
                           <w14:textOutline w14:w="9525" w14:cap="flat" w14:cmpd="sng" w14:algn="ctr">
                             <w14:solidFill>
                               <w14:schemeClr w14:val="tx1"/>
@@ -744,16 +1594,19 @@
                             <w14:bevelT w14:w="25400" w14:h="38100" w14:prst="circle"/>
                           </w14:props3d>
                         </w:rPr>
-                        <w:t>Théâtre</w:t>
+                        <w:t>Soirée théâtre</w:t>
                       </w:r>
-                      <w:r>
+                    </w:p>
+                    <w:p>
+                      <w:pPr>
+                        <w:jc w:val="center"/>
                         <w:rPr>
                           <w:rFonts w:ascii="Bodoni MT" w:hAnsi="Bodoni MT"/>
                           <w:b/>
                           <w:noProof/>
                           <w:color w:val="ED7D31" w:themeColor="accent2"/>
-                          <w:sz w:val="64"/>
-                          <w:szCs w:val="64"/>
+                          <w:sz w:val="56"/>
+                          <w:szCs w:val="56"/>
                           <w14:textOutline w14:w="9525" w14:cap="flat" w14:cmpd="sng" w14:algn="ctr">
                             <w14:solidFill>
                               <w14:schemeClr w14:val="tx1"/>
@@ -765,7 +1618,27 @@
                             <w14:bevelT w14:w="25400" w14:h="38100" w14:prst="circle"/>
                           </w14:props3d>
                         </w:rPr>
-                        <w:t xml:space="preserve"> l</w:t>
+                      </w:pPr>
+                      <w:r>
+                        <w:rPr>
+                          <w:rFonts w:ascii="Bodoni MT" w:hAnsi="Bodoni MT"/>
+                          <w:b/>
+                          <w:noProof/>
+                          <w:color w:val="ED7D31" w:themeColor="accent2"/>
+                          <w:sz w:val="56"/>
+                          <w:szCs w:val="56"/>
+                          <w14:textOutline w14:w="9525" w14:cap="flat" w14:cmpd="sng" w14:algn="ctr">
+                            <w14:solidFill>
+                              <w14:schemeClr w14:val="tx1"/>
+                            </w14:solidFill>
+                            <w14:prstDash w14:val="solid"/>
+                            <w14:round/>
+                          </w14:textOutline>
+                          <w14:props3d w14:extrusionH="57150" w14:contourW="0" w14:prstMaterial="softEdge">
+                            <w14:bevelT w14:w="25400" w14:h="38100" w14:prst="circle"/>
+                          </w14:props3d>
+                        </w:rPr>
+                        <w:t>l</w:t>
                       </w:r>
                       <w:r>
                         <w:rPr>
@@ -773,8 +1646,8 @@
                           <w:b/>
                           <w:noProof/>
                           <w:color w:val="ED7D31" w:themeColor="accent2"/>
-                          <w:sz w:val="64"/>
-                          <w:szCs w:val="64"/>
+                          <w:sz w:val="56"/>
+                          <w:szCs w:val="56"/>
                           <w14:textOutline w14:w="9525" w14:cap="flat" w14:cmpd="sng" w14:algn="ctr">
                             <w14:solidFill>
                               <w14:schemeClr w14:val="tx1"/>
@@ -803,745 +1676,7 @@
         <mc:AlternateContent>
           <mc:Choice Requires="wps">
             <w:drawing>
-              <wp:anchor distT="0" distB="0" distL="114300" distR="114300" simplePos="0" relativeHeight="251683840" behindDoc="0" locked="0" layoutInCell="1" allowOverlap="1" wp14:anchorId="4E3EB99E" wp14:editId="34174D3A">
-                <wp:simplePos x="0" y="0"/>
-                <wp:positionH relativeFrom="column">
-                  <wp:posOffset>430530</wp:posOffset>
-                </wp:positionH>
-                <wp:positionV relativeFrom="paragraph">
-                  <wp:posOffset>5378450</wp:posOffset>
-                </wp:positionV>
-                <wp:extent cx="1828800" cy="1828800"/>
-                <wp:effectExtent l="0" t="0" r="0" b="5080"/>
-                <wp:wrapNone/>
-                <wp:docPr id="24" name="Zone de texte 24"/>
-                <wp:cNvGraphicFramePr/>
-                <a:graphic xmlns:a="http://schemas.openxmlformats.org/drawingml/2006/main">
-                  <a:graphicData uri="http://schemas.microsoft.com/office/word/2010/wordprocessingShape">
-                    <wps:wsp>
-                      <wps:cNvSpPr txBox="1"/>
-                      <wps:spPr>
-                        <a:xfrm>
-                          <a:off x="0" y="0"/>
-                          <a:ext cx="1828800" cy="1828800"/>
-                        </a:xfrm>
-                        <a:prstGeom prst="rect">
-                          <a:avLst/>
-                        </a:prstGeom>
-                        <a:noFill/>
-                        <a:ln>
-                          <a:noFill/>
-                        </a:ln>
-                      </wps:spPr>
-                      <wps:txbx>
-                        <w:txbxContent>
-                          <w:p>
-                            <w:pPr>
-                              <w:jc w:val="center"/>
-                              <w:rPr>
-                                <w:rFonts w:ascii="Bodoni MT" w:hAnsi="Bodoni MT"/>
-                                <w:b/>
-                                <w:noProof/>
-                                <w:color w:val="ED7D31" w:themeColor="accent2"/>
-                                <w:sz w:val="64"/>
-                                <w:szCs w:val="64"/>
-                                <w14:textOutline w14:w="9525" w14:cap="flat" w14:cmpd="sng" w14:algn="ctr">
-                                  <w14:solidFill>
-                                    <w14:schemeClr w14:val="tx1"/>
-                                  </w14:solidFill>
-                                  <w14:prstDash w14:val="solid"/>
-                                  <w14:round/>
-                                </w14:textOutline>
-                                <w14:props3d w14:extrusionH="57150" w14:contourW="0" w14:prstMaterial="softEdge">
-                                  <w14:bevelT w14:w="25400" w14:h="38100" w14:prst="circle"/>
-                                </w14:props3d>
-                              </w:rPr>
-                            </w:pPr>
-                            <w:r>
-                              <w:rPr>
-                                <w:rFonts w:ascii="Bodoni MT" w:hAnsi="Bodoni MT"/>
-                                <w:b/>
-                                <w:noProof/>
-                                <w:color w:val="ED7D31" w:themeColor="accent2"/>
-                                <w:sz w:val="64"/>
-                                <w:szCs w:val="64"/>
-                                <w14:textOutline w14:w="9525" w14:cap="flat" w14:cmpd="sng" w14:algn="ctr">
-                                  <w14:solidFill>
-                                    <w14:schemeClr w14:val="tx1"/>
-                                  </w14:solidFill>
-                                  <w14:prstDash w14:val="solid"/>
-                                  <w14:round/>
-                                </w14:textOutline>
-                                <w14:props3d w14:extrusionH="57150" w14:contourW="0" w14:prstMaterial="softEdge">
-                                  <w14:bevelT w14:w="25400" w14:h="38100" w14:prst="circle"/>
-                                </w14:props3d>
-                              </w:rPr>
-                              <w:t>Théâtre</w:t>
-                            </w:r>
-                            <w:r>
-                              <w:rPr>
-                                <w:rFonts w:ascii="Bodoni MT" w:hAnsi="Bodoni MT"/>
-                                <w:b/>
-                                <w:noProof/>
-                                <w:color w:val="ED7D31" w:themeColor="accent2"/>
-                                <w:sz w:val="64"/>
-                                <w:szCs w:val="64"/>
-                                <w14:textOutline w14:w="9525" w14:cap="flat" w14:cmpd="sng" w14:algn="ctr">
-                                  <w14:solidFill>
-                                    <w14:schemeClr w14:val="tx1"/>
-                                  </w14:solidFill>
-                                  <w14:prstDash w14:val="solid"/>
-                                  <w14:round/>
-                                </w14:textOutline>
-                                <w14:props3d w14:extrusionH="57150" w14:contourW="0" w14:prstMaterial="softEdge">
-                                  <w14:bevelT w14:w="25400" w14:h="38100" w14:prst="circle"/>
-                                </w14:props3d>
-                              </w:rPr>
-                              <w:t xml:space="preserve"> l</w:t>
-                            </w:r>
-                            <w:r>
-                              <w:rPr>
-                                <w:rFonts w:ascii="Bodoni MT" w:hAnsi="Bodoni MT"/>
-                                <w:b/>
-                                <w:noProof/>
-                                <w:color w:val="ED7D31" w:themeColor="accent2"/>
-                                <w:sz w:val="64"/>
-                                <w:szCs w:val="64"/>
-                                <w14:textOutline w14:w="9525" w14:cap="flat" w14:cmpd="sng" w14:algn="ctr">
-                                  <w14:solidFill>
-                                    <w14:schemeClr w14:val="tx1"/>
-                                  </w14:solidFill>
-                                  <w14:prstDash w14:val="solid"/>
-                                  <w14:round/>
-                                </w14:textOutline>
-                                <w14:props3d w14:extrusionH="57150" w14:contourW="0" w14:prstMaterial="softEdge">
-                                  <w14:bevelT w14:w="25400" w14:h="38100" w14:prst="circle"/>
-                                </w14:props3d>
-                              </w:rPr>
-                              <w:t>e 24 juin 2026</w:t>
-                            </w:r>
-                          </w:p>
-                        </w:txbxContent>
-                      </wps:txbx>
-                      <wps:bodyPr rot="0" spcFirstLastPara="0" vertOverflow="overflow" horzOverflow="overflow" vert="horz" wrap="none" lIns="91440" tIns="45720" rIns="91440" bIns="45720" numCol="1" spcCol="0" rtlCol="0" fromWordArt="0" anchor="t" anchorCtr="0" forceAA="0" compatLnSpc="1">
-                        <a:prstTxWarp prst="textNoShape">
-                          <a:avLst/>
-                        </a:prstTxWarp>
-                        <a:spAutoFit/>
-                        <a:scene3d>
-                          <a:camera prst="orthographicFront"/>
-                          <a:lightRig rig="soft" dir="t">
-                            <a:rot lat="0" lon="0" rev="15600000"/>
-                          </a:lightRig>
-                        </a:scene3d>
-                        <a:sp3d extrusionH="57150" prstMaterial="softEdge">
-                          <a:bevelT w="25400" h="38100"/>
-                        </a:sp3d>
-                      </wps:bodyPr>
-                    </wps:wsp>
-                  </a:graphicData>
-                </a:graphic>
-              </wp:anchor>
-            </w:drawing>
-          </mc:Choice>
-          <mc:Fallback>
-            <w:pict>
-              <v:shape w14:anchorId="4E3EB99E" id="Zone de texte 24" o:spid="_x0000_s1029" type="#_x0000_t202" style="position:absolute;margin-left:33.9pt;margin-top:423.5pt;width:2in;height:2in;z-index:251683840;visibility:visible;mso-wrap-style:none;mso-wrap-distance-left:9pt;mso-wrap-distance-top:0;mso-wrap-distance-right:9pt;mso-wrap-distance-bottom:0;mso-position-horizontal:absolute;mso-position-horizontal-relative:text;mso-position-vertical:absolute;mso-position-vertical-relative:text;v-text-anchor:top" o:gfxdata="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" filled="f" stroked="f">
-                <v:textbox style="mso-fit-shape-to-text:t">
-                  <w:txbxContent>
-                    <w:p>
-                      <w:pPr>
-                        <w:jc w:val="center"/>
-                        <w:rPr>
-                          <w:rFonts w:ascii="Bodoni MT" w:hAnsi="Bodoni MT"/>
-                          <w:b/>
-                          <w:noProof/>
-                          <w:color w:val="ED7D31" w:themeColor="accent2"/>
-                          <w:sz w:val="64"/>
-                          <w:szCs w:val="64"/>
-                          <w14:textOutline w14:w="9525" w14:cap="flat" w14:cmpd="sng" w14:algn="ctr">
-                            <w14:solidFill>
-                              <w14:schemeClr w14:val="tx1"/>
-                            </w14:solidFill>
-                            <w14:prstDash w14:val="solid"/>
-                            <w14:round/>
-                          </w14:textOutline>
-                          <w14:props3d w14:extrusionH="57150" w14:contourW="0" w14:prstMaterial="softEdge">
-                            <w14:bevelT w14:w="25400" w14:h="38100" w14:prst="circle"/>
-                          </w14:props3d>
-                        </w:rPr>
-                      </w:pPr>
-                      <w:r>
-                        <w:rPr>
-                          <w:rFonts w:ascii="Bodoni MT" w:hAnsi="Bodoni MT"/>
-                          <w:b/>
-                          <w:noProof/>
-                          <w:color w:val="ED7D31" w:themeColor="accent2"/>
-                          <w:sz w:val="64"/>
-                          <w:szCs w:val="64"/>
-                          <w14:textOutline w14:w="9525" w14:cap="flat" w14:cmpd="sng" w14:algn="ctr">
-                            <w14:solidFill>
-                              <w14:schemeClr w14:val="tx1"/>
-                            </w14:solidFill>
-                            <w14:prstDash w14:val="solid"/>
-                            <w14:round/>
-                          </w14:textOutline>
-                          <w14:props3d w14:extrusionH="57150" w14:contourW="0" w14:prstMaterial="softEdge">
-                            <w14:bevelT w14:w="25400" w14:h="38100" w14:prst="circle"/>
-                          </w14:props3d>
-                        </w:rPr>
-                        <w:t>Théâtre</w:t>
-                      </w:r>
-                      <w:r>
-                        <w:rPr>
-                          <w:rFonts w:ascii="Bodoni MT" w:hAnsi="Bodoni MT"/>
-                          <w:b/>
-                          <w:noProof/>
-                          <w:color w:val="ED7D31" w:themeColor="accent2"/>
-                          <w:sz w:val="64"/>
-                          <w:szCs w:val="64"/>
-                          <w14:textOutline w14:w="9525" w14:cap="flat" w14:cmpd="sng" w14:algn="ctr">
-                            <w14:solidFill>
-                              <w14:schemeClr w14:val="tx1"/>
-                            </w14:solidFill>
-                            <w14:prstDash w14:val="solid"/>
-                            <w14:round/>
-                          </w14:textOutline>
-                          <w14:props3d w14:extrusionH="57150" w14:contourW="0" w14:prstMaterial="softEdge">
-                            <w14:bevelT w14:w="25400" w14:h="38100" w14:prst="circle"/>
-                          </w14:props3d>
-                        </w:rPr>
-                        <w:t xml:space="preserve"> l</w:t>
-                      </w:r>
-                      <w:r>
-                        <w:rPr>
-                          <w:rFonts w:ascii="Bodoni MT" w:hAnsi="Bodoni MT"/>
-                          <w:b/>
-                          <w:noProof/>
-                          <w:color w:val="ED7D31" w:themeColor="accent2"/>
-                          <w:sz w:val="64"/>
-                          <w:szCs w:val="64"/>
-                          <w14:textOutline w14:w="9525" w14:cap="flat" w14:cmpd="sng" w14:algn="ctr">
-                            <w14:solidFill>
-                              <w14:schemeClr w14:val="tx1"/>
-                            </w14:solidFill>
-                            <w14:prstDash w14:val="solid"/>
-                            <w14:round/>
-                          </w14:textOutline>
-                          <w14:props3d w14:extrusionH="57150" w14:contourW="0" w14:prstMaterial="softEdge">
-                            <w14:bevelT w14:w="25400" w14:h="38100" w14:prst="circle"/>
-                          </w14:props3d>
-                        </w:rPr>
-                        <w:t>e 24 juin 2026</w:t>
-                      </w:r>
-                    </w:p>
-                  </w:txbxContent>
-                </v:textbox>
-              </v:shape>
-            </w:pict>
-          </mc:Fallback>
-        </mc:AlternateContent>
-      </w:r>
-      <w:r>
-        <w:rPr>
-          <w:noProof/>
-        </w:rPr>
-        <mc:AlternateContent>
-          <mc:Choice Requires="wps">
-            <w:drawing>
-              <wp:anchor distT="0" distB="0" distL="114300" distR="114300" simplePos="0" relativeHeight="251681792" behindDoc="0" locked="0" layoutInCell="1" allowOverlap="1" wp14:anchorId="755782D2" wp14:editId="55B009BD">
-                <wp:simplePos x="0" y="0"/>
-                <wp:positionH relativeFrom="column">
-                  <wp:posOffset>424180</wp:posOffset>
-                </wp:positionH>
-                <wp:positionV relativeFrom="paragraph">
-                  <wp:posOffset>2774950</wp:posOffset>
-                </wp:positionV>
-                <wp:extent cx="1828800" cy="1828800"/>
-                <wp:effectExtent l="0" t="0" r="0" b="5080"/>
-                <wp:wrapNone/>
-                <wp:docPr id="23" name="Zone de texte 23"/>
-                <wp:cNvGraphicFramePr/>
-                <a:graphic xmlns:a="http://schemas.openxmlformats.org/drawingml/2006/main">
-                  <a:graphicData uri="http://schemas.microsoft.com/office/word/2010/wordprocessingShape">
-                    <wps:wsp>
-                      <wps:cNvSpPr txBox="1"/>
-                      <wps:spPr>
-                        <a:xfrm>
-                          <a:off x="0" y="0"/>
-                          <a:ext cx="1828800" cy="1828800"/>
-                        </a:xfrm>
-                        <a:prstGeom prst="rect">
-                          <a:avLst/>
-                        </a:prstGeom>
-                        <a:noFill/>
-                        <a:ln>
-                          <a:noFill/>
-                        </a:ln>
-                      </wps:spPr>
-                      <wps:txbx>
-                        <w:txbxContent>
-                          <w:p>
-                            <w:pPr>
-                              <w:jc w:val="center"/>
-                              <w:rPr>
-                                <w:rFonts w:ascii="Bodoni MT" w:hAnsi="Bodoni MT"/>
-                                <w:b/>
-                                <w:noProof/>
-                                <w:color w:val="ED7D31" w:themeColor="accent2"/>
-                                <w:sz w:val="64"/>
-                                <w:szCs w:val="64"/>
-                                <w14:textOutline w14:w="9525" w14:cap="flat" w14:cmpd="sng" w14:algn="ctr">
-                                  <w14:solidFill>
-                                    <w14:schemeClr w14:val="tx1"/>
-                                  </w14:solidFill>
-                                  <w14:prstDash w14:val="solid"/>
-                                  <w14:round/>
-                                </w14:textOutline>
-                                <w14:props3d w14:extrusionH="57150" w14:contourW="0" w14:prstMaterial="softEdge">
-                                  <w14:bevelT w14:w="25400" w14:h="38100" w14:prst="circle"/>
-                                </w14:props3d>
-                              </w:rPr>
-                            </w:pPr>
-                            <w:r>
-                              <w:rPr>
-                                <w:rFonts w:ascii="Bodoni MT" w:hAnsi="Bodoni MT"/>
-                                <w:b/>
-                                <w:noProof/>
-                                <w:color w:val="ED7D31" w:themeColor="accent2"/>
-                                <w:sz w:val="64"/>
-                                <w:szCs w:val="64"/>
-                                <w14:textOutline w14:w="9525" w14:cap="flat" w14:cmpd="sng" w14:algn="ctr">
-                                  <w14:solidFill>
-                                    <w14:schemeClr w14:val="tx1"/>
-                                  </w14:solidFill>
-                                  <w14:prstDash w14:val="solid"/>
-                                  <w14:round/>
-                                </w14:textOutline>
-                                <w14:props3d w14:extrusionH="57150" w14:contourW="0" w14:prstMaterial="softEdge">
-                                  <w14:bevelT w14:w="25400" w14:h="38100" w14:prst="circle"/>
-                                </w14:props3d>
-                              </w:rPr>
-                              <w:t>Théâtre</w:t>
-                            </w:r>
-                            <w:r>
-                              <w:rPr>
-                                <w:rFonts w:ascii="Bodoni MT" w:hAnsi="Bodoni MT"/>
-                                <w:b/>
-                                <w:noProof/>
-                                <w:color w:val="ED7D31" w:themeColor="accent2"/>
-                                <w:sz w:val="64"/>
-                                <w:szCs w:val="64"/>
-                                <w14:textOutline w14:w="9525" w14:cap="flat" w14:cmpd="sng" w14:algn="ctr">
-                                  <w14:solidFill>
-                                    <w14:schemeClr w14:val="tx1"/>
-                                  </w14:solidFill>
-                                  <w14:prstDash w14:val="solid"/>
-                                  <w14:round/>
-                                </w14:textOutline>
-                                <w14:props3d w14:extrusionH="57150" w14:contourW="0" w14:prstMaterial="softEdge">
-                                  <w14:bevelT w14:w="25400" w14:h="38100" w14:prst="circle"/>
-                                </w14:props3d>
-                              </w:rPr>
-                              <w:t xml:space="preserve"> l</w:t>
-                            </w:r>
-                            <w:r>
-                              <w:rPr>
-                                <w:rFonts w:ascii="Bodoni MT" w:hAnsi="Bodoni MT"/>
-                                <w:b/>
-                                <w:noProof/>
-                                <w:color w:val="ED7D31" w:themeColor="accent2"/>
-                                <w:sz w:val="64"/>
-                                <w:szCs w:val="64"/>
-                                <w14:textOutline w14:w="9525" w14:cap="flat" w14:cmpd="sng" w14:algn="ctr">
-                                  <w14:solidFill>
-                                    <w14:schemeClr w14:val="tx1"/>
-                                  </w14:solidFill>
-                                  <w14:prstDash w14:val="solid"/>
-                                  <w14:round/>
-                                </w14:textOutline>
-                                <w14:props3d w14:extrusionH="57150" w14:contourW="0" w14:prstMaterial="softEdge">
-                                  <w14:bevelT w14:w="25400" w14:h="38100" w14:prst="circle"/>
-                                </w14:props3d>
-                              </w:rPr>
-                              <w:t>e 24 juin 2026</w:t>
-                            </w:r>
-                          </w:p>
-                        </w:txbxContent>
-                      </wps:txbx>
-                      <wps:bodyPr rot="0" spcFirstLastPara="0" vertOverflow="overflow" horzOverflow="overflow" vert="horz" wrap="none" lIns="91440" tIns="45720" rIns="91440" bIns="45720" numCol="1" spcCol="0" rtlCol="0" fromWordArt="0" anchor="t" anchorCtr="0" forceAA="0" compatLnSpc="1">
-                        <a:prstTxWarp prst="textNoShape">
-                          <a:avLst/>
-                        </a:prstTxWarp>
-                        <a:spAutoFit/>
-                        <a:scene3d>
-                          <a:camera prst="orthographicFront"/>
-                          <a:lightRig rig="soft" dir="t">
-                            <a:rot lat="0" lon="0" rev="15600000"/>
-                          </a:lightRig>
-                        </a:scene3d>
-                        <a:sp3d extrusionH="57150" prstMaterial="softEdge">
-                          <a:bevelT w="25400" h="38100"/>
-                        </a:sp3d>
-                      </wps:bodyPr>
-                    </wps:wsp>
-                  </a:graphicData>
-                </a:graphic>
-              </wp:anchor>
-            </w:drawing>
-          </mc:Choice>
-          <mc:Fallback>
-            <w:pict>
-              <v:shape w14:anchorId="755782D2" id="Zone de texte 23" o:spid="_x0000_s1030" type="#_x0000_t202" style="position:absolute;margin-left:33.4pt;margin-top:218.5pt;width:2in;height:2in;z-index:251681792;visibility:visible;mso-wrap-style:none;mso-wrap-distance-left:9pt;mso-wrap-distance-top:0;mso-wrap-distance-right:9pt;mso-wrap-distance-bottom:0;mso-position-horizontal:absolute;mso-position-horizontal-relative:text;mso-position-vertical:absolute;mso-position-vertical-relative:text;v-text-anchor:top" o:gfxdata="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" filled="f" stroked="f">
-                <v:textbox style="mso-fit-shape-to-text:t">
-                  <w:txbxContent>
-                    <w:p>
-                      <w:pPr>
-                        <w:jc w:val="center"/>
-                        <w:rPr>
-                          <w:rFonts w:ascii="Bodoni MT" w:hAnsi="Bodoni MT"/>
-                          <w:b/>
-                          <w:noProof/>
-                          <w:color w:val="ED7D31" w:themeColor="accent2"/>
-                          <w:sz w:val="64"/>
-                          <w:szCs w:val="64"/>
-                          <w14:textOutline w14:w="9525" w14:cap="flat" w14:cmpd="sng" w14:algn="ctr">
-                            <w14:solidFill>
-                              <w14:schemeClr w14:val="tx1"/>
-                            </w14:solidFill>
-                            <w14:prstDash w14:val="solid"/>
-                            <w14:round/>
-                          </w14:textOutline>
-                          <w14:props3d w14:extrusionH="57150" w14:contourW="0" w14:prstMaterial="softEdge">
-                            <w14:bevelT w14:w="25400" w14:h="38100" w14:prst="circle"/>
-                          </w14:props3d>
-                        </w:rPr>
-                      </w:pPr>
-                      <w:r>
-                        <w:rPr>
-                          <w:rFonts w:ascii="Bodoni MT" w:hAnsi="Bodoni MT"/>
-                          <w:b/>
-                          <w:noProof/>
-                          <w:color w:val="ED7D31" w:themeColor="accent2"/>
-                          <w:sz w:val="64"/>
-                          <w:szCs w:val="64"/>
-                          <w14:textOutline w14:w="9525" w14:cap="flat" w14:cmpd="sng" w14:algn="ctr">
-                            <w14:solidFill>
-                              <w14:schemeClr w14:val="tx1"/>
-                            </w14:solidFill>
-                            <w14:prstDash w14:val="solid"/>
-                            <w14:round/>
-                          </w14:textOutline>
-                          <w14:props3d w14:extrusionH="57150" w14:contourW="0" w14:prstMaterial="softEdge">
-                            <w14:bevelT w14:w="25400" w14:h="38100" w14:prst="circle"/>
-                          </w14:props3d>
-                        </w:rPr>
-                        <w:t>Théâtre</w:t>
-                      </w:r>
-                      <w:r>
-                        <w:rPr>
-                          <w:rFonts w:ascii="Bodoni MT" w:hAnsi="Bodoni MT"/>
-                          <w:b/>
-                          <w:noProof/>
-                          <w:color w:val="ED7D31" w:themeColor="accent2"/>
-                          <w:sz w:val="64"/>
-                          <w:szCs w:val="64"/>
-                          <w14:textOutline w14:w="9525" w14:cap="flat" w14:cmpd="sng" w14:algn="ctr">
-                            <w14:solidFill>
-                              <w14:schemeClr w14:val="tx1"/>
-                            </w14:solidFill>
-                            <w14:prstDash w14:val="solid"/>
-                            <w14:round/>
-                          </w14:textOutline>
-                          <w14:props3d w14:extrusionH="57150" w14:contourW="0" w14:prstMaterial="softEdge">
-                            <w14:bevelT w14:w="25400" w14:h="38100" w14:prst="circle"/>
-                          </w14:props3d>
-                        </w:rPr>
-                        <w:t xml:space="preserve"> l</w:t>
-                      </w:r>
-                      <w:r>
-                        <w:rPr>
-                          <w:rFonts w:ascii="Bodoni MT" w:hAnsi="Bodoni MT"/>
-                          <w:b/>
-                          <w:noProof/>
-                          <w:color w:val="ED7D31" w:themeColor="accent2"/>
-                          <w:sz w:val="64"/>
-                          <w:szCs w:val="64"/>
-                          <w14:textOutline w14:w="9525" w14:cap="flat" w14:cmpd="sng" w14:algn="ctr">
-                            <w14:solidFill>
-                              <w14:schemeClr w14:val="tx1"/>
-                            </w14:solidFill>
-                            <w14:prstDash w14:val="solid"/>
-                            <w14:round/>
-                          </w14:textOutline>
-                          <w14:props3d w14:extrusionH="57150" w14:contourW="0" w14:prstMaterial="softEdge">
-                            <w14:bevelT w14:w="25400" w14:h="38100" w14:prst="circle"/>
-                          </w14:props3d>
-                        </w:rPr>
-                        <w:t>e 24 juin 2026</w:t>
-                      </w:r>
-                    </w:p>
-                  </w:txbxContent>
-                </v:textbox>
-              </v:shape>
-            </w:pict>
-          </mc:Fallback>
-        </mc:AlternateContent>
-      </w:r>
-      <w:r>
-        <w:rPr>
-          <w:noProof/>
-        </w:rPr>
-        <mc:AlternateContent>
-          <mc:Choice Requires="wps">
-            <w:drawing>
-              <wp:anchor distT="0" distB="0" distL="114300" distR="114300" simplePos="0" relativeHeight="251679744" behindDoc="0" locked="0" layoutInCell="1" allowOverlap="1" wp14:anchorId="601F528C" wp14:editId="7135EB80">
-                <wp:simplePos x="0" y="0"/>
-                <wp:positionH relativeFrom="column">
-                  <wp:posOffset>438150</wp:posOffset>
-                </wp:positionH>
-                <wp:positionV relativeFrom="paragraph">
-                  <wp:posOffset>187325</wp:posOffset>
-                </wp:positionV>
-                <wp:extent cx="1828800" cy="1828800"/>
-                <wp:effectExtent l="0" t="0" r="0" b="5080"/>
-                <wp:wrapNone/>
-                <wp:docPr id="22" name="Zone de texte 22"/>
-                <wp:cNvGraphicFramePr/>
-                <a:graphic xmlns:a="http://schemas.openxmlformats.org/drawingml/2006/main">
-                  <a:graphicData uri="http://schemas.microsoft.com/office/word/2010/wordprocessingShape">
-                    <wps:wsp>
-                      <wps:cNvSpPr txBox="1"/>
-                      <wps:spPr>
-                        <a:xfrm>
-                          <a:off x="0" y="0"/>
-                          <a:ext cx="1828800" cy="1828800"/>
-                        </a:xfrm>
-                        <a:prstGeom prst="rect">
-                          <a:avLst/>
-                        </a:prstGeom>
-                        <a:noFill/>
-                        <a:ln>
-                          <a:noFill/>
-                        </a:ln>
-                      </wps:spPr>
-                      <wps:txbx>
-                        <w:txbxContent>
-                          <w:p>
-                            <w:pPr>
-                              <w:jc w:val="center"/>
-                              <w:rPr>
-                                <w:rFonts w:ascii="Bodoni MT" w:hAnsi="Bodoni MT"/>
-                                <w:b/>
-                                <w:noProof/>
-                                <w:color w:val="ED7D31" w:themeColor="accent2"/>
-                                <w:sz w:val="64"/>
-                                <w:szCs w:val="64"/>
-                                <w14:textOutline w14:w="9525" w14:cap="flat" w14:cmpd="sng" w14:algn="ctr">
-                                  <w14:solidFill>
-                                    <w14:schemeClr w14:val="tx1"/>
-                                  </w14:solidFill>
-                                  <w14:prstDash w14:val="solid"/>
-                                  <w14:round/>
-                                </w14:textOutline>
-                                <w14:props3d w14:extrusionH="57150" w14:contourW="0" w14:prstMaterial="softEdge">
-                                  <w14:bevelT w14:w="25400" w14:h="38100" w14:prst="circle"/>
-                                </w14:props3d>
-                              </w:rPr>
-                            </w:pPr>
-                            <w:r>
-                              <w:rPr>
-                                <w:rFonts w:ascii="Bodoni MT" w:hAnsi="Bodoni MT"/>
-                                <w:b/>
-                                <w:noProof/>
-                                <w:color w:val="ED7D31" w:themeColor="accent2"/>
-                                <w:sz w:val="64"/>
-                                <w:szCs w:val="64"/>
-                                <w14:textOutline w14:w="9525" w14:cap="flat" w14:cmpd="sng" w14:algn="ctr">
-                                  <w14:solidFill>
-                                    <w14:schemeClr w14:val="tx1"/>
-                                  </w14:solidFill>
-                                  <w14:prstDash w14:val="solid"/>
-                                  <w14:round/>
-                                </w14:textOutline>
-                                <w14:props3d w14:extrusionH="57150" w14:contourW="0" w14:prstMaterial="softEdge">
-                                  <w14:bevelT w14:w="25400" w14:h="38100" w14:prst="circle"/>
-                                </w14:props3d>
-                              </w:rPr>
-                              <w:t>Théâtre</w:t>
-                            </w:r>
-                            <w:r>
-                              <w:rPr>
-                                <w:rFonts w:ascii="Bodoni MT" w:hAnsi="Bodoni MT"/>
-                                <w:b/>
-                                <w:noProof/>
-                                <w:color w:val="ED7D31" w:themeColor="accent2"/>
-                                <w:sz w:val="64"/>
-                                <w:szCs w:val="64"/>
-                                <w14:textOutline w14:w="9525" w14:cap="flat" w14:cmpd="sng" w14:algn="ctr">
-                                  <w14:solidFill>
-                                    <w14:schemeClr w14:val="tx1"/>
-                                  </w14:solidFill>
-                                  <w14:prstDash w14:val="solid"/>
-                                  <w14:round/>
-                                </w14:textOutline>
-                                <w14:props3d w14:extrusionH="57150" w14:contourW="0" w14:prstMaterial="softEdge">
-                                  <w14:bevelT w14:w="25400" w14:h="38100" w14:prst="circle"/>
-                                </w14:props3d>
-                              </w:rPr>
-                              <w:t xml:space="preserve"> l</w:t>
-                            </w:r>
-                            <w:r>
-                              <w:rPr>
-                                <w:rFonts w:ascii="Bodoni MT" w:hAnsi="Bodoni MT"/>
-                                <w:b/>
-                                <w:noProof/>
-                                <w:color w:val="ED7D31" w:themeColor="accent2"/>
-                                <w:sz w:val="64"/>
-                                <w:szCs w:val="64"/>
-                                <w14:textOutline w14:w="9525" w14:cap="flat" w14:cmpd="sng" w14:algn="ctr">
-                                  <w14:solidFill>
-                                    <w14:schemeClr w14:val="tx1"/>
-                                  </w14:solidFill>
-                                  <w14:prstDash w14:val="solid"/>
-                                  <w14:round/>
-                                </w14:textOutline>
-                                <w14:props3d w14:extrusionH="57150" w14:contourW="0" w14:prstMaterial="softEdge">
-                                  <w14:bevelT w14:w="25400" w14:h="38100" w14:prst="circle"/>
-                                </w14:props3d>
-                              </w:rPr>
-                              <w:t>e 24 juin 2026</w:t>
-                            </w:r>
-                          </w:p>
-                        </w:txbxContent>
-                      </wps:txbx>
-                      <wps:bodyPr rot="0" spcFirstLastPara="0" vertOverflow="overflow" horzOverflow="overflow" vert="horz" wrap="none" lIns="91440" tIns="45720" rIns="91440" bIns="45720" numCol="1" spcCol="0" rtlCol="0" fromWordArt="0" anchor="t" anchorCtr="0" forceAA="0" compatLnSpc="1">
-                        <a:prstTxWarp prst="textNoShape">
-                          <a:avLst/>
-                        </a:prstTxWarp>
-                        <a:spAutoFit/>
-                        <a:scene3d>
-                          <a:camera prst="orthographicFront"/>
-                          <a:lightRig rig="soft" dir="t">
-                            <a:rot lat="0" lon="0" rev="15600000"/>
-                          </a:lightRig>
-                        </a:scene3d>
-                        <a:sp3d extrusionH="57150" prstMaterial="softEdge">
-                          <a:bevelT w="25400" h="38100"/>
-                        </a:sp3d>
-                      </wps:bodyPr>
-                    </wps:wsp>
-                  </a:graphicData>
-                </a:graphic>
-              </wp:anchor>
-            </w:drawing>
-          </mc:Choice>
-          <mc:Fallback>
-            <w:pict>
-              <v:shape w14:anchorId="601F528C" id="Zone de texte 22" o:spid="_x0000_s1031" type="#_x0000_t202" style="position:absolute;margin-left:34.5pt;margin-top:14.75pt;width:2in;height:2in;z-index:251679744;visibility:visible;mso-wrap-style:none;mso-wrap-distance-left:9pt;mso-wrap-distance-top:0;mso-wrap-distance-right:9pt;mso-wrap-distance-bottom:0;mso-position-horizontal:absolute;mso-position-horizontal-relative:text;mso-position-vertical:absolute;mso-position-vertical-relative:text;v-text-anchor:top" o:gfxdata="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" filled="f" stroked="f">
-                <v:textbox style="mso-fit-shape-to-text:t">
-                  <w:txbxContent>
-                    <w:p>
-                      <w:pPr>
-                        <w:jc w:val="center"/>
-                        <w:rPr>
-                          <w:rFonts w:ascii="Bodoni MT" w:hAnsi="Bodoni MT"/>
-                          <w:b/>
-                          <w:noProof/>
-                          <w:color w:val="ED7D31" w:themeColor="accent2"/>
-                          <w:sz w:val="64"/>
-                          <w:szCs w:val="64"/>
-                          <w14:textOutline w14:w="9525" w14:cap="flat" w14:cmpd="sng" w14:algn="ctr">
-                            <w14:solidFill>
-                              <w14:schemeClr w14:val="tx1"/>
-                            </w14:solidFill>
-                            <w14:prstDash w14:val="solid"/>
-                            <w14:round/>
-                          </w14:textOutline>
-                          <w14:props3d w14:extrusionH="57150" w14:contourW="0" w14:prstMaterial="softEdge">
-                            <w14:bevelT w14:w="25400" w14:h="38100" w14:prst="circle"/>
-                          </w14:props3d>
-                        </w:rPr>
-                      </w:pPr>
-                      <w:r>
-                        <w:rPr>
-                          <w:rFonts w:ascii="Bodoni MT" w:hAnsi="Bodoni MT"/>
-                          <w:b/>
-                          <w:noProof/>
-                          <w:color w:val="ED7D31" w:themeColor="accent2"/>
-                          <w:sz w:val="64"/>
-                          <w:szCs w:val="64"/>
-                          <w14:textOutline w14:w="9525" w14:cap="flat" w14:cmpd="sng" w14:algn="ctr">
-                            <w14:solidFill>
-                              <w14:schemeClr w14:val="tx1"/>
-                            </w14:solidFill>
-                            <w14:prstDash w14:val="solid"/>
-                            <w14:round/>
-                          </w14:textOutline>
-                          <w14:props3d w14:extrusionH="57150" w14:contourW="0" w14:prstMaterial="softEdge">
-                            <w14:bevelT w14:w="25400" w14:h="38100" w14:prst="circle"/>
-                          </w14:props3d>
-                        </w:rPr>
-                        <w:t>Théâtre</w:t>
-                      </w:r>
-                      <w:r>
-                        <w:rPr>
-                          <w:rFonts w:ascii="Bodoni MT" w:hAnsi="Bodoni MT"/>
-                          <w:b/>
-                          <w:noProof/>
-                          <w:color w:val="ED7D31" w:themeColor="accent2"/>
-                          <w:sz w:val="64"/>
-                          <w:szCs w:val="64"/>
-                          <w14:textOutline w14:w="9525" w14:cap="flat" w14:cmpd="sng" w14:algn="ctr">
-                            <w14:solidFill>
-                              <w14:schemeClr w14:val="tx1"/>
-                            </w14:solidFill>
-                            <w14:prstDash w14:val="solid"/>
-                            <w14:round/>
-                          </w14:textOutline>
-                          <w14:props3d w14:extrusionH="57150" w14:contourW="0" w14:prstMaterial="softEdge">
-                            <w14:bevelT w14:w="25400" w14:h="38100" w14:prst="circle"/>
-                          </w14:props3d>
-                        </w:rPr>
-                        <w:t xml:space="preserve"> l</w:t>
-                      </w:r>
-                      <w:r>
-                        <w:rPr>
-                          <w:rFonts w:ascii="Bodoni MT" w:hAnsi="Bodoni MT"/>
-                          <w:b/>
-                          <w:noProof/>
-                          <w:color w:val="ED7D31" w:themeColor="accent2"/>
-                          <w:sz w:val="64"/>
-                          <w:szCs w:val="64"/>
-                          <w14:textOutline w14:w="9525" w14:cap="flat" w14:cmpd="sng" w14:algn="ctr">
-                            <w14:solidFill>
-                              <w14:schemeClr w14:val="tx1"/>
-                            </w14:solidFill>
-                            <w14:prstDash w14:val="solid"/>
-                            <w14:round/>
-                          </w14:textOutline>
-                          <w14:props3d w14:extrusionH="57150" w14:contourW="0" w14:prstMaterial="softEdge">
-                            <w14:bevelT w14:w="25400" w14:h="38100" w14:prst="circle"/>
-                          </w14:props3d>
-                        </w:rPr>
-                        <w:t>e 24 juin 2026</w:t>
-                      </w:r>
-                    </w:p>
-                  </w:txbxContent>
-                </v:textbox>
-              </v:shape>
-            </w:pict>
-          </mc:Fallback>
-        </mc:AlternateContent>
-      </w:r>
-      <w:r>
-        <w:rPr>
-          <w:noProof/>
-        </w:rPr>
-        <mc:AlternateContent>
-          <mc:Choice Requires="wps">
-            <w:drawing>
-              <wp:anchor distT="0" distB="0" distL="114300" distR="114300" simplePos="0" relativeHeight="251689984" behindDoc="0" locked="0" layoutInCell="1" allowOverlap="1" wp14:anchorId="5D3CD477" wp14:editId="72F32912">
+              <wp:anchor distT="0" distB="0" distL="114300" distR="114300" simplePos="0" relativeHeight="251689984" behindDoc="0" locked="0" layoutInCell="1" allowOverlap="1" wp14:anchorId="5D3CD477" wp14:editId="40CE7534">
                 <wp:simplePos x="0" y="0"/>
                 <wp:positionH relativeFrom="column">
                   <wp:posOffset>4669155</wp:posOffset>
@@ -1612,48 +1747,7 @@
                                   <w14:bevelT w14:w="25400" w14:h="38100" w14:prst="circle"/>
                                 </w14:props3d>
                               </w:rPr>
-                              <w:t>1</w:t>
-                            </w:r>
-                            <w:r>
-                              <w:rPr>
-                                <w:b/>
-                                <w:noProof/>
-                                <w:color w:val="ED7D31" w:themeColor="accent2"/>
-                                <w:sz w:val="72"/>
-                                <w:szCs w:val="72"/>
-                                <w:vertAlign w:val="superscript"/>
-                                <w14:textOutline w14:w="3175" w14:cap="flat" w14:cmpd="sng" w14:algn="ctr">
-                                  <w14:solidFill>
-                                    <w14:schemeClr w14:val="tx1"/>
-                                  </w14:solidFill>
-                                  <w14:prstDash w14:val="solid"/>
-                                  <w14:round/>
-                                </w14:textOutline>
-                                <w14:props3d w14:extrusionH="57150" w14:contourW="0" w14:prstMaterial="softEdge">
-                                  <w14:bevelT w14:w="25400" w14:h="38100" w14:prst="circle"/>
-                                </w14:props3d>
-                              </w:rPr>
-                              <w:t>ère</w:t>
-                            </w:r>
-                            <w:r>
-                              <w:rPr>
-                                <w:b/>
-                                <w:noProof/>
-                                <w:color w:val="ED7D31" w:themeColor="accent2"/>
-                                <w:sz w:val="72"/>
-                                <w:szCs w:val="72"/>
-                                <w14:textOutline w14:w="3175" w14:cap="flat" w14:cmpd="sng" w14:algn="ctr">
-                                  <w14:solidFill>
-                                    <w14:schemeClr w14:val="tx1"/>
-                                  </w14:solidFill>
-                                  <w14:prstDash w14:val="solid"/>
-                                  <w14:round/>
-                                </w14:textOutline>
-                                <w14:props3d w14:extrusionH="57150" w14:contourW="0" w14:prstMaterial="softEdge">
-                                  <w14:bevelT w14:w="25400" w14:h="38100" w14:prst="circle"/>
-                                </w14:props3d>
-                              </w:rPr>
-                              <w:t xml:space="preserve"> galerie</w:t>
+                              <w:t>Orchestre</w:t>
                             </w:r>
                           </w:p>
                         </w:txbxContent>
@@ -1723,48 +1817,7 @@
                             <w14:bevelT w14:w="25400" w14:h="38100" w14:prst="circle"/>
                           </w14:props3d>
                         </w:rPr>
-                        <w:t>1</w:t>
-                      </w:r>
-                      <w:r>
-                        <w:rPr>
-                          <w:b/>
-                          <w:noProof/>
-                          <w:color w:val="ED7D31" w:themeColor="accent2"/>
-                          <w:sz w:val="72"/>
-                          <w:szCs w:val="72"/>
-                          <w:vertAlign w:val="superscript"/>
-                          <w14:textOutline w14:w="3175" w14:cap="flat" w14:cmpd="sng" w14:algn="ctr">
-                            <w14:solidFill>
-                              <w14:schemeClr w14:val="tx1"/>
-                            </w14:solidFill>
-                            <w14:prstDash w14:val="solid"/>
-                            <w14:round/>
-                          </w14:textOutline>
-                          <w14:props3d w14:extrusionH="57150" w14:contourW="0" w14:prstMaterial="softEdge">
-                            <w14:bevelT w14:w="25400" w14:h="38100" w14:prst="circle"/>
-                          </w14:props3d>
-                        </w:rPr>
-                        <w:t>ère</w:t>
-                      </w:r>
-                      <w:r>
-                        <w:rPr>
-                          <w:b/>
-                          <w:noProof/>
-                          <w:color w:val="ED7D31" w:themeColor="accent2"/>
-                          <w:sz w:val="72"/>
-                          <w:szCs w:val="72"/>
-                          <w14:textOutline w14:w="3175" w14:cap="flat" w14:cmpd="sng" w14:algn="ctr">
-                            <w14:solidFill>
-                              <w14:schemeClr w14:val="tx1"/>
-                            </w14:solidFill>
-                            <w14:prstDash w14:val="solid"/>
-                            <w14:round/>
-                          </w14:textOutline>
-                          <w14:props3d w14:extrusionH="57150" w14:contourW="0" w14:prstMaterial="softEdge">
-                            <w14:bevelT w14:w="25400" w14:h="38100" w14:prst="circle"/>
-                          </w14:props3d>
-                        </w:rPr>
-                        <w:t xml:space="preserve"> galerie</w:t>
+                        <w:t>Orchestre</w:t>
                       </w:r>
                     </w:p>
                   </w:txbxContent>
@@ -3475,7 +3528,7 @@
                     <pic:cNvPicPr/>
                   </pic:nvPicPr>
                   <pic:blipFill>
-                    <a:blip r:embed="rId6" cstate="print">
+                    <a:blip r:embed="rId7" cstate="print">
                       <a:extLst>
                         <a:ext uri="{28A0092B-C50C-407E-A947-70E740481C1C}">
                           <a14:useLocalDpi xmlns:a14="http://schemas.microsoft.com/office/drawing/2010/main" val="0"/>
@@ -3535,7 +3588,7 @@
                     <pic:cNvPicPr/>
                   </pic:nvPicPr>
                   <pic:blipFill>
-                    <a:blip r:embed="rId6" cstate="print">
+                    <a:blip r:embed="rId7" cstate="print">
                       <a:extLst>
                         <a:ext uri="{28A0092B-C50C-407E-A947-70E740481C1C}">
                           <a14:useLocalDpi xmlns:a14="http://schemas.microsoft.com/office/drawing/2010/main" val="0"/>

</xml_diff>